<commit_message>
modify of problem definition
</commit_message>
<xml_diff>
--- a/sumi heo (2026324). strategic thinking ca1.docx
+++ b/sumi heo (2026324). strategic thinking ca1.docx
@@ -878,7 +878,27 @@
           <w:sz w:val="28"/>
           <w:szCs w:val="28"/>
         </w:rPr>
-        <w:t>getting additional idea for my project.</w:t>
+        <w:t xml:space="preserve">getting additional </w:t>
+      </w:r>
+      <w:proofErr w:type="gramStart"/>
+      <w:r>
+        <w:rPr>
+          <w:rFonts w:hint="eastAsia"/>
+          <w:b/>
+          <w:sz w:val="28"/>
+          <w:szCs w:val="28"/>
+        </w:rPr>
+        <w:t>idea</w:t>
+      </w:r>
+      <w:proofErr w:type="gramEnd"/>
+      <w:r>
+        <w:rPr>
+          <w:rFonts w:hint="eastAsia"/>
+          <w:b/>
+          <w:sz w:val="28"/>
+          <w:szCs w:val="28"/>
+        </w:rPr>
+        <w:t xml:space="preserve"> for my project.</w:t>
       </w:r>
     </w:p>
     <w:p>
@@ -953,7 +973,23 @@
                                 <w:color w:val="000000"/>
                                 <w:sz w:val="28"/>
                               </w:rPr>
-                              <w:t xml:space="preserve">By submitting this assessment, I confirm that I have read the CCT policy on academic misconduct and understand the implications of submitting work that is not my own or does not appropriately reference material taken from a third party or other source. </w:t>
+                              <w:t xml:space="preserve">By submitting this assessment, I confirm that I have read the CCT policy on academic misconduct and understand the implications of submitting work that is not my own or does not appropriately reference material </w:t>
+                            </w:r>
+                            <w:proofErr w:type="gramStart"/>
+                            <w:r>
+                              <w:rPr>
+                                <w:color w:val="000000"/>
+                                <w:sz w:val="28"/>
+                              </w:rPr>
+                              <w:t>taken</w:t>
+                            </w:r>
+                            <w:proofErr w:type="gramEnd"/>
+                            <w:r>
+                              <w:rPr>
+                                <w:color w:val="000000"/>
+                                <w:sz w:val="28"/>
+                              </w:rPr>
+                              <w:t xml:space="preserve"> from a third party or other source. </w:t>
                             </w:r>
                           </w:p>
                           <w:p>
@@ -979,7 +1015,23 @@
                                 <w:color w:val="000000"/>
                                 <w:sz w:val="28"/>
                               </w:rPr>
-                              <w:t xml:space="preserve"> I further confirm that this work has not previously been submitted for assessment by myself or someone else in CCT College Dublin or any other higher education institution.</w:t>
+                              <w:t xml:space="preserve"> I further confirm that this work has not previously been submitted for assessment by myself or someone else </w:t>
+                            </w:r>
+                            <w:proofErr w:type="gramStart"/>
+                            <w:r>
+                              <w:rPr>
+                                <w:color w:val="000000"/>
+                                <w:sz w:val="28"/>
+                              </w:rPr>
+                              <w:t>in</w:t>
+                            </w:r>
+                            <w:proofErr w:type="gramEnd"/>
+                            <w:r>
+                              <w:rPr>
+                                <w:color w:val="000000"/>
+                                <w:sz w:val="28"/>
+                              </w:rPr>
+                              <w:t xml:space="preserve"> CCT College Dublin or any other higher education institution.</w:t>
                             </w:r>
                           </w:p>
                         </w:txbxContent>
@@ -1023,7 +1075,23 @@
                           <w:color w:val="000000"/>
                           <w:sz w:val="28"/>
                         </w:rPr>
-                        <w:t xml:space="preserve">By submitting this assessment, I confirm that I have read the CCT policy on academic misconduct and understand the implications of submitting work that is not my own or does not appropriately reference material taken from a third party or other source. </w:t>
+                        <w:t xml:space="preserve">By submitting this assessment, I confirm that I have read the CCT policy on academic misconduct and understand the implications of submitting work that is not my own or does not appropriately reference material </w:t>
+                      </w:r>
+                      <w:proofErr w:type="gramStart"/>
+                      <w:r>
+                        <w:rPr>
+                          <w:color w:val="000000"/>
+                          <w:sz w:val="28"/>
+                        </w:rPr>
+                        <w:t>taken</w:t>
+                      </w:r>
+                      <w:proofErr w:type="gramEnd"/>
+                      <w:r>
+                        <w:rPr>
+                          <w:color w:val="000000"/>
+                          <w:sz w:val="28"/>
+                        </w:rPr>
+                        <w:t xml:space="preserve"> from a third party or other source. </w:t>
                       </w:r>
                     </w:p>
                     <w:p>
@@ -1049,7 +1117,23 @@
                           <w:color w:val="000000"/>
                           <w:sz w:val="28"/>
                         </w:rPr>
-                        <w:t xml:space="preserve"> I further confirm that this work has not previously been submitted for assessment by myself or someone else in CCT College Dublin or any other higher education institution.</w:t>
+                        <w:t xml:space="preserve"> I further confirm that this work has not previously been submitted for assessment by myself or someone else </w:t>
+                      </w:r>
+                      <w:proofErr w:type="gramStart"/>
+                      <w:r>
+                        <w:rPr>
+                          <w:color w:val="000000"/>
+                          <w:sz w:val="28"/>
+                        </w:rPr>
+                        <w:t>in</w:t>
+                      </w:r>
+                      <w:proofErr w:type="gramEnd"/>
+                      <w:r>
+                        <w:rPr>
+                          <w:color w:val="000000"/>
+                          <w:sz w:val="28"/>
+                        </w:rPr>
+                        <w:t xml:space="preserve"> CCT College Dublin or any other higher education institution.</w:t>
                       </w:r>
                     </w:p>
                   </w:txbxContent>
@@ -1119,6 +1203,53 @@
       <w:sdtContent>
         <w:p>
           <w:pPr>
+            <w:pStyle w:val="a6"/>
+            <w:numPr>
+              <w:ilvl w:val="0"/>
+              <w:numId w:val="7"/>
+            </w:numPr>
+            <w:pBdr>
+              <w:top w:val="nil"/>
+              <w:left w:val="nil"/>
+              <w:bottom w:val="nil"/>
+              <w:right w:val="nil"/>
+              <w:between w:val="nil"/>
+            </w:pBdr>
+            <w:tabs>
+              <w:tab w:val="right" w:leader="dot" w:pos="9016"/>
+            </w:tabs>
+            <w:spacing w:after="100"/>
+            <w:rPr>
+              <w:rFonts w:ascii="Aptos" w:hAnsi="Aptos" w:cs="Aptos" w:hint="eastAsia"/>
+              <w:color w:val="000000"/>
+              <w:sz w:val="24"/>
+              <w:szCs w:val="24"/>
+            </w:rPr>
+          </w:pPr>
+          <w:hyperlink w:anchor="_heading=h.gjdgxs">
+            <w:r>
+              <w:rPr>
+                <w:rFonts w:hint="eastAsia"/>
+                <w:color w:val="000000"/>
+              </w:rPr>
+              <w:t>Project Title</w:t>
+            </w:r>
+            <w:r>
+              <w:rPr>
+                <w:color w:val="000000"/>
+              </w:rPr>
+              <w:tab/>
+              <w:t>1</w:t>
+            </w:r>
+          </w:hyperlink>
+        </w:p>
+        <w:p>
+          <w:pPr>
+            <w:pStyle w:val="a6"/>
+            <w:numPr>
+              <w:ilvl w:val="0"/>
+              <w:numId w:val="7"/>
+            </w:numPr>
             <w:pBdr>
               <w:top w:val="nil"/>
               <w:left w:val="nil"/>
@@ -1175,8 +1306,45 @@
               <w:tab w:val="right" w:leader="dot" w:pos="9016"/>
             </w:tabs>
             <w:spacing w:after="100"/>
+          </w:pPr>
+          <w:r>
             <w:rPr>
-              <w:rFonts w:ascii="Aptos" w:eastAsia="Aptos" w:hAnsi="Aptos" w:cs="Aptos"/>
+              <w:rFonts w:hint="eastAsia"/>
+            </w:rPr>
+            <w:t xml:space="preserve">3. </w:t>
+          </w:r>
+          <w:r>
+            <w:rPr>
+              <w:rFonts w:hint="eastAsia"/>
+            </w:rPr>
+            <w:t>Problem Definition</w:t>
+          </w:r>
+          <w:hyperlink w:anchor="_heading=h.30j0zll">
+            <w:r>
+              <w:rPr>
+                <w:color w:val="000000"/>
+              </w:rPr>
+              <w:tab/>
+              <w:t>1</w:t>
+            </w:r>
+          </w:hyperlink>
+        </w:p>
+        <w:p>
+          <w:pPr>
+            <w:pBdr>
+              <w:top w:val="nil"/>
+              <w:left w:val="nil"/>
+              <w:bottom w:val="nil"/>
+              <w:right w:val="nil"/>
+              <w:between w:val="nil"/>
+            </w:pBdr>
+            <w:tabs>
+              <w:tab w:val="right" w:leader="dot" w:pos="9016"/>
+            </w:tabs>
+            <w:spacing w:after="100"/>
+            <w:ind w:left="220"/>
+            <w:rPr>
+              <w:rFonts w:ascii="Aptos" w:hAnsi="Aptos" w:cs="Aptos" w:hint="eastAsia"/>
               <w:color w:val="000000"/>
               <w:sz w:val="24"/>
               <w:szCs w:val="24"/>
@@ -1186,7 +1354,7 @@
             <w:rPr>
               <w:rFonts w:hint="eastAsia"/>
             </w:rPr>
-            <w:t>Problem Definition</w:t>
+            <w:t>3-1. Problem Definition</w:t>
           </w:r>
           <w:hyperlink w:anchor="_heading=h.30j0zll">
             <w:r>
@@ -1219,13 +1387,22 @@
               <w:szCs w:val="24"/>
             </w:rPr>
           </w:pPr>
+          <w:r>
+            <w:rPr>
+              <w:rFonts w:hint="eastAsia"/>
+            </w:rPr>
+            <w:t>3-2.</w:t>
+          </w:r>
           <w:hyperlink w:anchor="_heading=h.1fob9te">
             <w:r>
               <w:rPr>
+                <w:rFonts w:hint="eastAsia"/>
                 <w:color w:val="000000"/>
               </w:rPr>
-              <w:t>Chapter 1.1</w:t>
+              <w:t>Excerpt</w:t>
             </w:r>
+          </w:hyperlink>
+          <w:hyperlink w:anchor="_heading=h.30j0zll">
             <w:r>
               <w:rPr>
                 <w:color w:val="000000"/>
@@ -1293,6 +1470,15 @@
               <w:sz w:val="24"/>
               <w:szCs w:val="24"/>
             </w:rPr>
+            <w:t xml:space="preserve">4. </w:t>
+          </w:r>
+          <w:r>
+            <w:rPr>
+              <w:rFonts w:ascii="Aptos" w:hAnsi="Aptos" w:cs="Aptos" w:hint="eastAsia"/>
+              <w:color w:val="000000"/>
+              <w:sz w:val="24"/>
+              <w:szCs w:val="24"/>
+            </w:rPr>
             <w:t>Aim and Objectives</w:t>
           </w:r>
           <w:hyperlink w:anchor="_heading=h.30j0zll">
@@ -1332,6 +1518,15 @@
               <w:sz w:val="24"/>
               <w:szCs w:val="24"/>
             </w:rPr>
+            <w:t xml:space="preserve">5. </w:t>
+          </w:r>
+          <w:r>
+            <w:rPr>
+              <w:rFonts w:ascii="Aptos" w:hAnsi="Aptos" w:cs="Aptos" w:hint="eastAsia"/>
+              <w:color w:val="000000"/>
+              <w:sz w:val="24"/>
+              <w:szCs w:val="24"/>
+            </w:rPr>
             <w:t>Scopes</w:t>
           </w:r>
           <w:hyperlink w:anchor="_heading=h.30j0zll">
@@ -1371,6 +1566,15 @@
               <w:sz w:val="24"/>
               <w:szCs w:val="24"/>
             </w:rPr>
+            <w:t xml:space="preserve">6. </w:t>
+          </w:r>
+          <w:r>
+            <w:rPr>
+              <w:rFonts w:ascii="Aptos" w:hAnsi="Aptos" w:cs="Aptos" w:hint="eastAsia"/>
+              <w:color w:val="000000"/>
+              <w:sz w:val="24"/>
+              <w:szCs w:val="24"/>
+            </w:rPr>
             <w:t>Methodology</w:t>
           </w:r>
           <w:hyperlink w:anchor="_heading=h.30j0zll">
@@ -1410,7 +1614,131 @@
               <w:sz w:val="24"/>
               <w:szCs w:val="24"/>
             </w:rPr>
+            <w:t xml:space="preserve">7. </w:t>
+          </w:r>
+          <w:r>
+            <w:rPr>
+              <w:rFonts w:ascii="Aptos" w:hAnsi="Aptos" w:cs="Aptos" w:hint="eastAsia"/>
+              <w:color w:val="000000"/>
+              <w:sz w:val="24"/>
+              <w:szCs w:val="24"/>
+            </w:rPr>
             <w:t>Data Sources</w:t>
+          </w:r>
+          <w:hyperlink w:anchor="_heading=h.30j0zll">
+            <w:r>
+              <w:rPr>
+                <w:color w:val="000000"/>
+              </w:rPr>
+              <w:tab/>
+              <w:t>1</w:t>
+            </w:r>
+          </w:hyperlink>
+        </w:p>
+        <w:p>
+          <w:pPr>
+            <w:pBdr>
+              <w:top w:val="nil"/>
+              <w:left w:val="nil"/>
+              <w:bottom w:val="nil"/>
+              <w:right w:val="nil"/>
+              <w:between w:val="nil"/>
+            </w:pBdr>
+            <w:tabs>
+              <w:tab w:val="right" w:leader="dot" w:pos="9016"/>
+            </w:tabs>
+            <w:spacing w:after="100"/>
+          </w:pPr>
+          <w:r>
+            <w:rPr>
+              <w:rFonts w:ascii="Aptos" w:hAnsi="Aptos" w:cs="Aptos" w:hint="eastAsia"/>
+              <w:color w:val="000000"/>
+              <w:sz w:val="24"/>
+              <w:szCs w:val="24"/>
+            </w:rPr>
+            <w:t xml:space="preserve">8. </w:t>
+          </w:r>
+          <w:r>
+            <w:rPr>
+              <w:rFonts w:ascii="Aptos" w:hAnsi="Aptos" w:cs="Aptos" w:hint="eastAsia"/>
+              <w:color w:val="000000"/>
+              <w:sz w:val="24"/>
+              <w:szCs w:val="24"/>
+            </w:rPr>
+            <w:t>Expected Deliverables</w:t>
+          </w:r>
+          <w:hyperlink w:anchor="_heading=h.30j0zll">
+            <w:r>
+              <w:rPr>
+                <w:color w:val="000000"/>
+              </w:rPr>
+              <w:tab/>
+              <w:t>1</w:t>
+            </w:r>
+          </w:hyperlink>
+          <w:r>
+            <w:rPr>
+              <w:rFonts w:ascii="Aptos" w:hAnsi="Aptos" w:cs="Aptos"/>
+              <w:color w:val="000000"/>
+              <w:sz w:val="24"/>
+              <w:szCs w:val="24"/>
+            </w:rPr>
+            <w:br/>
+          </w:r>
+          <w:r>
+            <w:rPr>
+              <w:rFonts w:ascii="Aptos" w:hAnsi="Aptos" w:cs="Aptos" w:hint="eastAsia"/>
+              <w:color w:val="000000"/>
+              <w:sz w:val="24"/>
+              <w:szCs w:val="24"/>
+            </w:rPr>
+            <w:t xml:space="preserve">9. </w:t>
+          </w:r>
+          <w:r>
+            <w:rPr>
+              <w:rFonts w:ascii="Aptos" w:hAnsi="Aptos" w:cs="Aptos" w:hint="eastAsia"/>
+              <w:color w:val="000000"/>
+              <w:sz w:val="24"/>
+              <w:szCs w:val="24"/>
+            </w:rPr>
+            <w:t>Project Timeline</w:t>
+          </w:r>
+          <w:hyperlink w:anchor="_heading=h.30j0zll">
+            <w:r>
+              <w:rPr>
+                <w:color w:val="000000"/>
+              </w:rPr>
+              <w:tab/>
+              <w:t>1</w:t>
+            </w:r>
+          </w:hyperlink>
+        </w:p>
+        <w:p>
+          <w:pPr>
+            <w:pBdr>
+              <w:top w:val="nil"/>
+              <w:left w:val="nil"/>
+              <w:bottom w:val="nil"/>
+              <w:right w:val="nil"/>
+              <w:between w:val="nil"/>
+            </w:pBdr>
+            <w:tabs>
+              <w:tab w:val="right" w:leader="dot" w:pos="9016"/>
+            </w:tabs>
+            <w:spacing w:after="100"/>
+            <w:ind w:left="220"/>
+            <w:rPr>
+              <w:rFonts w:ascii="Aptos" w:hAnsi="Aptos" w:cs="Aptos" w:hint="eastAsia"/>
+              <w:color w:val="000000"/>
+              <w:sz w:val="24"/>
+              <w:szCs w:val="24"/>
+            </w:rPr>
+          </w:pPr>
+          <w:r>
+            <w:rPr>
+              <w:rFonts w:hint="eastAsia"/>
+            </w:rPr>
+            <w:t>Chart</w:t>
           </w:r>
           <w:hyperlink w:anchor="_heading=h.30j0zll">
             <w:r>
@@ -1449,72 +1777,6 @@
               <w:sz w:val="24"/>
               <w:szCs w:val="24"/>
             </w:rPr>
-            <w:t>Expected Deliverables</w:t>
-          </w:r>
-          <w:hyperlink w:anchor="_heading=h.30j0zll">
-            <w:r>
-              <w:rPr>
-                <w:color w:val="000000"/>
-              </w:rPr>
-              <w:tab/>
-              <w:t>1</w:t>
-            </w:r>
-          </w:hyperlink>
-          <w:r>
-            <w:rPr>
-              <w:rFonts w:ascii="Aptos" w:hAnsi="Aptos" w:cs="Aptos"/>
-              <w:color w:val="000000"/>
-              <w:sz w:val="24"/>
-              <w:szCs w:val="24"/>
-            </w:rPr>
-            <w:br/>
-          </w:r>
-          <w:r>
-            <w:rPr>
-              <w:rFonts w:ascii="Aptos" w:hAnsi="Aptos" w:cs="Aptos" w:hint="eastAsia"/>
-              <w:color w:val="000000"/>
-              <w:sz w:val="24"/>
-              <w:szCs w:val="24"/>
-            </w:rPr>
-            <w:t>Project Timeline</w:t>
-          </w:r>
-          <w:hyperlink w:anchor="_heading=h.30j0zll">
-            <w:r>
-              <w:rPr>
-                <w:color w:val="000000"/>
-              </w:rPr>
-              <w:tab/>
-              <w:t>1</w:t>
-            </w:r>
-          </w:hyperlink>
-        </w:p>
-        <w:p>
-          <w:pPr>
-            <w:pBdr>
-              <w:top w:val="nil"/>
-              <w:left w:val="nil"/>
-              <w:bottom w:val="nil"/>
-              <w:right w:val="nil"/>
-              <w:between w:val="nil"/>
-            </w:pBdr>
-            <w:tabs>
-              <w:tab w:val="right" w:leader="dot" w:pos="9016"/>
-            </w:tabs>
-            <w:spacing w:after="100"/>
-            <w:rPr>
-              <w:rFonts w:ascii="Aptos" w:hAnsi="Aptos" w:cs="Aptos" w:hint="eastAsia"/>
-              <w:color w:val="000000"/>
-              <w:sz w:val="24"/>
-              <w:szCs w:val="24"/>
-            </w:rPr>
-          </w:pPr>
-          <w:r>
-            <w:rPr>
-              <w:rFonts w:ascii="Aptos" w:hAnsi="Aptos" w:cs="Aptos" w:hint="eastAsia"/>
-              <w:color w:val="000000"/>
-              <w:sz w:val="24"/>
-              <w:szCs w:val="24"/>
-            </w:rPr>
             <w:t>Ethical and Legal Considerations</w:t>
           </w:r>
           <w:hyperlink w:anchor="_heading=h.30j0zll">
@@ -1586,198 +1848,550 @@
       <w:pPr>
         <w:pStyle w:val="1"/>
         <w:spacing w:after="0"/>
+        <w:rPr>
+          <w:rFonts w:hint="eastAsia"/>
+        </w:rPr>
       </w:pPr>
       <w:bookmarkStart w:id="0" w:name="_heading=h.gjdgxs" w:colFirst="0" w:colLast="0"/>
       <w:bookmarkEnd w:id="0"/>
       <w:r>
+        <w:rPr>
+          <w:rFonts w:hint="eastAsia"/>
+        </w:rPr>
         <w:lastRenderedPageBreak/>
-        <w:t>Introduction</w:t>
+        <w:t>Project Title</w:t>
       </w:r>
     </w:p>
     <w:p>
       <w:pPr>
-        <w:pStyle w:val="1"/>
-        <w:spacing w:before="0"/>
+        <w:pStyle w:val="2"/>
+        <w:rPr>
+          <w:rStyle w:val="af0"/>
+        </w:rPr>
       </w:pPr>
       <w:bookmarkStart w:id="1" w:name="_heading=h.30j0zll" w:colFirst="0" w:colLast="0"/>
       <w:bookmarkEnd w:id="1"/>
       <w:r>
-        <w:t>Chapter 1</w:t>
+        <w:rPr>
+          <w:rStyle w:val="af0"/>
+          <w:rFonts w:hint="eastAsia"/>
+        </w:rPr>
+        <w:t>Which house can get an economical benefit</w:t>
+      </w:r>
+      <w:r>
+        <w:rPr>
+          <w:rStyle w:val="af0"/>
+        </w:rPr>
+        <w:t xml:space="preserve"> by</w:t>
+      </w:r>
+      <w:r>
+        <w:rPr>
+          <w:rStyle w:val="af0"/>
+          <w:rFonts w:hint="eastAsia"/>
+        </w:rPr>
+        <w:t xml:space="preserve"> installing solar PV in Ireland?</w:t>
       </w:r>
     </w:p>
     <w:p>
       <w:pPr>
-        <w:pStyle w:val="2"/>
-      </w:pPr>
-      <w:bookmarkStart w:id="2" w:name="_heading=h.1fob9te" w:colFirst="0" w:colLast="0"/>
-      <w:bookmarkEnd w:id="2"/>
-      <w:r>
-        <w:t>Chapter 1.1</w:t>
-      </w:r>
-    </w:p>
-    <w:p>
-      <w:pPr>
-        <w:pStyle w:val="3"/>
-      </w:pPr>
-      <w:bookmarkStart w:id="3" w:name="_heading=h.3znysh7" w:colFirst="0" w:colLast="0"/>
-      <w:bookmarkEnd w:id="3"/>
-      <w:r>
-        <w:t>Chapter 1.1.1.</w:t>
-      </w:r>
+        <w:rPr>
+          <w:rFonts w:hint="eastAsia"/>
+        </w:rPr>
+      </w:pPr>
     </w:p>
     <w:p/>
     <w:p>
-      <w:r>
-        <w:rPr>
-          <w:noProof/>
-        </w:rPr>
-        <w:drawing>
-          <wp:inline distT="0" distB="0" distL="0" distR="0" wp14:anchorId="366A2D47" wp14:editId="2257C0AE">
-            <wp:extent cx="3571875" cy="819150"/>
-            <wp:effectExtent l="0" t="0" r="0" b="0"/>
-            <wp:docPr id="1728545884" name="image2.png" descr="A screenshot of a computer&#10;&#10;Description automatically generated"/>
-            <wp:cNvGraphicFramePr/>
-            <a:graphic xmlns:a="http://schemas.openxmlformats.org/drawingml/2006/main">
-              <a:graphicData uri="http://schemas.openxmlformats.org/drawingml/2006/picture">
-                <pic:pic xmlns:pic="http://schemas.openxmlformats.org/drawingml/2006/picture">
-                  <pic:nvPicPr>
-                    <pic:cNvPr id="0" name="image2.png" descr="A screenshot of a computer&#10;&#10;Description automatically generated"/>
-                    <pic:cNvPicPr preferRelativeResize="0"/>
-                  </pic:nvPicPr>
-                  <pic:blipFill>
-                    <a:blip r:embed="rId10"/>
-                    <a:srcRect/>
-                    <a:stretch>
-                      <a:fillRect/>
-                    </a:stretch>
-                  </pic:blipFill>
-                  <pic:spPr>
-                    <a:xfrm>
-                      <a:off x="0" y="0"/>
-                      <a:ext cx="3571875" cy="819150"/>
-                    </a:xfrm>
-                    <a:prstGeom prst="rect">
-                      <a:avLst/>
-                    </a:prstGeom>
-                    <a:ln/>
-                  </pic:spPr>
-                </pic:pic>
-              </a:graphicData>
-            </a:graphic>
-          </wp:inline>
-        </w:drawing>
+      <w:pPr>
+        <w:pStyle w:val="1"/>
+        <w:spacing w:after="0"/>
+      </w:pPr>
+      <w:r>
+        <w:t>Introduction</w:t>
       </w:r>
     </w:p>
     <w:p>
       <w:pPr>
         <w:rPr>
-          <w:color w:val="FF0000"/>
-        </w:rPr>
-      </w:pPr>
+          <w:rFonts w:hint="eastAsia"/>
+        </w:rPr>
+      </w:pPr>
+      <w:r>
+        <w:t xml:space="preserve">This project focuses on creating a data-driven decision-support tool to help determine whether installing solar </w:t>
+      </w:r>
+      <w:r>
+        <w:t>panels</w:t>
+      </w:r>
+      <w:r>
+        <w:t xml:space="preserve"> (</w:t>
+      </w:r>
+      <w:r>
+        <w:rPr>
+          <w:rFonts w:hint="eastAsia"/>
+        </w:rPr>
+        <w:t>PV)</w:t>
+      </w:r>
+      <w:r>
+        <w:t xml:space="preserve"> is economically </w:t>
+      </w:r>
+      <w:r>
+        <w:rPr>
+          <w:rFonts w:hint="eastAsia"/>
+        </w:rPr>
+        <w:t>valuable</w:t>
+      </w:r>
+      <w:r>
+        <w:t xml:space="preserve"> for </w:t>
+      </w:r>
+      <w:r>
+        <w:rPr>
+          <w:rFonts w:hint="eastAsia"/>
+        </w:rPr>
+        <w:t>houses in Ireland</w:t>
+      </w:r>
+      <w:r>
+        <w:t>. As energy costs</w:t>
+      </w:r>
+      <w:r>
+        <w:rPr>
+          <w:rFonts w:hint="eastAsia"/>
+        </w:rPr>
+        <w:t xml:space="preserve">, such as electricity </w:t>
+      </w:r>
+      <w:r>
+        <w:t>bills</w:t>
+      </w:r>
+      <w:r>
+        <w:rPr>
+          <w:rFonts w:hint="eastAsia"/>
+        </w:rPr>
+        <w:t>, increase</w:t>
+      </w:r>
+      <w:r>
+        <w:t>, interest in renewable energy is growing</w:t>
+      </w:r>
+      <w:r>
+        <w:rPr>
+          <w:rFonts w:hint="eastAsia"/>
+        </w:rPr>
+        <w:t>. It is</w:t>
+      </w:r>
+      <w:r>
+        <w:t xml:space="preserve"> leading to increased demand for solar panel installations. </w:t>
+      </w:r>
+      <w:r>
+        <w:rPr>
+          <w:rFonts w:hint="eastAsia"/>
+        </w:rPr>
+        <w:t xml:space="preserve">From that perspective, this project will provide personalized recommendations that are </w:t>
+      </w:r>
+      <w:r>
+        <w:t>easy</w:t>
+      </w:r>
+      <w:r>
+        <w:rPr>
+          <w:rFonts w:hint="eastAsia"/>
+        </w:rPr>
+        <w:t xml:space="preserve"> to understand for people considering solar panel installation, moving </w:t>
+      </w:r>
+      <w:r>
+        <w:t>beyond</w:t>
+      </w:r>
+      <w:r>
+        <w:rPr>
+          <w:rFonts w:hint="eastAsia"/>
+        </w:rPr>
+        <w:t xml:space="preserve"> the binary logic of installation costs or cost savings.</w:t>
+      </w:r>
+    </w:p>
+    <w:p/>
+    <w:p/>
+    <w:p>
+      <w:pPr>
+        <w:pStyle w:val="1"/>
+        <w:spacing w:after="0"/>
+      </w:pPr>
+      <w:r>
+        <w:rPr>
+          <w:rFonts w:hint="eastAsia"/>
+        </w:rPr>
+        <w:t>Problem Definition</w:t>
+      </w:r>
     </w:p>
     <w:p>
       <w:pPr>
-        <w:rPr>
-          <w:color w:val="FF0000"/>
-        </w:rPr>
-      </w:pPr>
-      <w:r>
-        <w:rPr>
-          <w:color w:val="FF0000"/>
-        </w:rPr>
-        <w:t>[NOTE: For the table of contents to function properly, you must use the correct headings for all your chapters and subchapters.</w:t>
+        <w:pStyle w:val="2"/>
+        <w:rPr>
+          <w:rFonts w:hint="eastAsia"/>
+        </w:rPr>
+      </w:pPr>
+      <w:r>
+        <w:rPr>
+          <w:rFonts w:hint="eastAsia"/>
+        </w:rPr>
+        <w:t>Problem Definition</w:t>
       </w:r>
     </w:p>
     <w:p>
       <w:pPr>
         <w:rPr>
-          <w:color w:val="FF0000"/>
-        </w:rPr>
-      </w:pPr>
-      <w:r>
-        <w:rPr>
-          <w:b/>
-          <w:color w:val="FF0000"/>
-        </w:rPr>
-        <w:t>Heading 1:</w:t>
-      </w:r>
-      <w:r>
-        <w:rPr>
-          <w:color w:val="FF0000"/>
-        </w:rPr>
-        <w:t xml:space="preserve"> This is the main heading and should be employed for the primary title or chapter. For example: CHAPTER 1.</w:t>
+          <w:rFonts w:hint="eastAsia"/>
+        </w:rPr>
+      </w:pPr>
+      <w:r>
+        <w:t xml:space="preserve">In other words, </w:t>
+      </w:r>
+      <w:r>
+        <w:rPr>
+          <w:rFonts w:hint="eastAsia"/>
+        </w:rPr>
+        <w:t xml:space="preserve">this project </w:t>
+      </w:r>
+      <w:r>
+        <w:rPr>
+          <w:rFonts w:hint="eastAsia"/>
+        </w:rPr>
+        <w:t>begins</w:t>
+      </w:r>
+      <w:r>
+        <w:rPr>
+          <w:rFonts w:hint="eastAsia"/>
+        </w:rPr>
+        <w:t xml:space="preserve"> </w:t>
+      </w:r>
+      <w:r>
+        <w:t>with</w:t>
+      </w:r>
+      <w:r>
+        <w:t xml:space="preserve"> concerns which households can gain a reasonable economic benefit from installing solar thermal systems.</w:t>
+      </w:r>
+      <w:r>
+        <w:rPr>
+          <w:rFonts w:hint="eastAsia"/>
+        </w:rPr>
+        <w:t xml:space="preserve"> </w:t>
+      </w:r>
+      <w:r>
+        <w:t>Ireland</w:t>
+      </w:r>
+      <w:r>
+        <w:rPr>
+          <w:rFonts w:hint="eastAsia"/>
+        </w:rPr>
+        <w:t xml:space="preserve"> </w:t>
+      </w:r>
+      <w:r>
+        <w:t>does not receive a large amount of sunlight annually</w:t>
+      </w:r>
+      <w:r>
+        <w:rPr>
+          <w:rFonts w:hint="eastAsia"/>
+        </w:rPr>
+        <w:t xml:space="preserve"> as UK</w:t>
+      </w:r>
+      <w:r>
+        <w:rPr>
+          <w:rFonts w:hint="eastAsia"/>
+        </w:rPr>
+        <w:t>.</w:t>
+      </w:r>
+      <w:r>
+        <w:rPr>
+          <w:rFonts w:hint="eastAsia"/>
+        </w:rPr>
+        <w:t xml:space="preserve"> N</w:t>
+      </w:r>
+      <w:r>
+        <w:t>evertheless, the proportion of solar installations is increasing every year</w:t>
+      </w:r>
+      <w:r>
+        <w:rPr>
+          <w:rFonts w:hint="eastAsia"/>
+        </w:rPr>
+        <w:t>.</w:t>
+      </w:r>
+      <w:r>
+        <w:rPr>
+          <w:rFonts w:hint="eastAsia"/>
+        </w:rPr>
+        <w:t xml:space="preserve"> To </w:t>
+      </w:r>
+      <w:proofErr w:type="gramStart"/>
+      <w:r>
+        <w:rPr>
+          <w:rFonts w:hint="eastAsia"/>
+        </w:rPr>
+        <w:t>classify ?</w:t>
+      </w:r>
+      <w:proofErr w:type="gramEnd"/>
+      <w:r>
+        <w:rPr>
+          <w:rFonts w:hint="eastAsia"/>
+        </w:rPr>
+        <w:t xml:space="preserve"> determine? </w:t>
+      </w:r>
+      <w:r>
+        <w:t>E</w:t>
+      </w:r>
+      <w:r>
+        <w:rPr>
+          <w:rFonts w:hint="eastAsia"/>
+        </w:rPr>
+        <w:t xml:space="preserve">ven in this </w:t>
+      </w:r>
+      <w:proofErr w:type="gramStart"/>
+      <w:r>
+        <w:rPr>
+          <w:rFonts w:hint="eastAsia"/>
+        </w:rPr>
+        <w:t xml:space="preserve">condition, </w:t>
+      </w:r>
+      <w:r>
+        <w:rPr>
+          <w:rFonts w:hint="eastAsia"/>
+        </w:rPr>
+        <w:t xml:space="preserve"> </w:t>
+      </w:r>
+      <w:r>
+        <w:rPr>
+          <w:rFonts w:hint="eastAsia"/>
+        </w:rPr>
+        <w:t>I</w:t>
+      </w:r>
+      <w:proofErr w:type="gramEnd"/>
+      <w:r>
+        <w:rPr>
+          <w:rFonts w:hint="eastAsia"/>
+        </w:rPr>
+        <w:t xml:space="preserve"> </w:t>
+      </w:r>
+      <w:proofErr w:type="gramStart"/>
+      <w:r>
+        <w:rPr>
+          <w:rFonts w:hint="eastAsia"/>
+        </w:rPr>
+        <w:t>wondered</w:t>
+      </w:r>
+      <w:r>
+        <w:t xml:space="preserve"> to determine</w:t>
+      </w:r>
+      <w:proofErr w:type="gramEnd"/>
+      <w:r>
+        <w:t xml:space="preserve"> whether this is economically effective and under which </w:t>
+      </w:r>
+      <w:r>
+        <w:rPr>
+          <w:rFonts w:hint="eastAsia"/>
+        </w:rPr>
+        <w:t>house</w:t>
+      </w:r>
+      <w:r>
+        <w:t xml:space="preserve"> it should be implemented, we plan to conduct an analysis by county. The reason it is difficult to compare installation costs with future electricity savings is that the results vary </w:t>
+      </w:r>
+      <w:r>
+        <w:lastRenderedPageBreak/>
+        <w:t>depending on location, system size, roof condition, electricity consumption, export payments, and subsidies. Recommendations based solely on the BER rating or location are not sufficient. Data analysis allows identification of patterns among similar homes, and PVGIS can estimate power generation under given assumptions. Economic models allow you to estimate savings, payback periods, and net present value (NPV), providing a clearer understanding of the return on investment.</w:t>
+      </w:r>
+    </w:p>
+    <w:p/>
+    <w:p>
+      <w:pPr>
+        <w:pStyle w:val="2"/>
+        <w:rPr>
+          <w:rFonts w:hint="eastAsia"/>
+        </w:rPr>
+      </w:pPr>
+      <w:r>
+        <w:rPr>
+          <w:rFonts w:hint="eastAsia"/>
+        </w:rPr>
+        <w:t>Excerpt</w:t>
       </w:r>
     </w:p>
     <w:p>
       <w:pPr>
         <w:rPr>
-          <w:color w:val="FF0000"/>
-        </w:rPr>
-      </w:pPr>
-      <w:r>
-        <w:rPr>
-          <w:b/>
-          <w:color w:val="FF0000"/>
-        </w:rPr>
-        <w:t>Heading 2:</w:t>
-      </w:r>
-      <w:r>
-        <w:rPr>
-          <w:color w:val="FF0000"/>
-        </w:rPr>
-        <w:t xml:space="preserve"> Use Heading 2 as a subheading. For instance: Chapter 1.1.</w:t>
+          <w:rFonts w:eastAsia="맑은 고딕" w:cstheme="minorHAnsi"/>
+        </w:rPr>
+      </w:pPr>
+      <w:hyperlink r:id="rId10" w:history="1">
+        <w:r>
+          <w:rPr>
+            <w:rStyle w:val="aa"/>
+            <w:rFonts w:eastAsia="맑은 고딕" w:cstheme="minorHAnsi"/>
+          </w:rPr>
+          <w:t>https://energyefficiency.ie/wp-content/uploads/2026/04/Residential-Solar-Panel-Report-2026.pdf?utm_source=chatgpt.com</w:t>
+        </w:r>
+      </w:hyperlink>
+      <w:r>
+        <w:rPr>
+          <w:rFonts w:eastAsia="맑은 고딕" w:cstheme="minorHAnsi" w:hint="eastAsia"/>
+        </w:rPr>
+        <w:t xml:space="preserve"> (</w:t>
+      </w:r>
+      <w:r>
+        <w:rPr>
+          <w:rFonts w:eastAsia="맑은 고딕" w:cstheme="minorHAnsi"/>
+        </w:rPr>
+        <w:t>monthly</w:t>
+      </w:r>
+      <w:r>
+        <w:rPr>
+          <w:rFonts w:eastAsia="맑은 고딕" w:cstheme="minorHAnsi" w:hint="eastAsia"/>
+        </w:rPr>
+        <w:t xml:space="preserve"> installation from 2020 to 2025)</w:t>
       </w:r>
     </w:p>
     <w:p>
       <w:pPr>
         <w:rPr>
-          <w:color w:val="FF0000"/>
-        </w:rPr>
-      </w:pPr>
-      <w:r>
-        <w:rPr>
-          <w:b/>
-          <w:color w:val="FF0000"/>
-        </w:rPr>
-        <w:t>Heading 3:</w:t>
-      </w:r>
-      <w:r>
-        <w:rPr>
-          <w:color w:val="FF0000"/>
-        </w:rPr>
-        <w:t xml:space="preserve"> Heading 3 provides a more detailed breakdown, such as Chapter 1.1.1.</w:t>
+          <w:rFonts w:eastAsia="맑은 고딕" w:cstheme="minorHAnsi"/>
+        </w:rPr>
+      </w:pPr>
+      <w:hyperlink r:id="rId11" w:history="1">
+        <w:r>
+          <w:rPr>
+            <w:rStyle w:val="aa"/>
+            <w:rFonts w:eastAsia="맑은 고딕" w:cstheme="minorHAnsi"/>
+          </w:rPr>
+          <w:t>https://www.seai.ie/data-and-insights/seai-statistics/key-publications/energy-in-ireland?trk=article-ssr-frontend-pulse_little-text-block&amp;utm_source=chatgpt.com</w:t>
+        </w:r>
+      </w:hyperlink>
+      <w:r>
+        <w:rPr>
+          <w:rFonts w:eastAsia="맑은 고딕" w:cstheme="minorHAnsi" w:hint="eastAsia"/>
+        </w:rPr>
+        <w:t xml:space="preserve"> (</w:t>
+      </w:r>
+      <w:r>
+        <w:rPr>
+          <w:rFonts w:eastAsia="맑은 고딕" w:cstheme="minorHAnsi"/>
+        </w:rPr>
+        <w:t>Solar PV generation was up 69% and ambient heat capture from heat-pumps was up 19% in 2024.</w:t>
+      </w:r>
+      <w:r>
+        <w:rPr>
+          <w:rFonts w:eastAsia="맑은 고딕" w:cstheme="minorHAnsi" w:hint="eastAsia"/>
+        </w:rPr>
+        <w:t>)</w:t>
       </w:r>
     </w:p>
     <w:p>
       <w:pPr>
         <w:rPr>
-          <w:color w:val="FF0000"/>
-        </w:rPr>
-      </w:pPr>
-      <w:r>
-        <w:rPr>
-          <w:color w:val="FF0000"/>
-        </w:rPr>
-        <w:t>By adhering to this hierarchical structure, you ensure an organized and effective document outline, enhancing readability and navigation. However, you are not forced to use all 3 headings, usually heading 1 and 2 are sufficient.</w:t>
+          <w:rFonts w:eastAsia="맑은 고딕" w:cstheme="minorHAnsi"/>
+        </w:rPr>
+      </w:pPr>
+      <w:hyperlink r:id="rId12" w:history="1">
+        <w:r>
+          <w:rPr>
+            <w:rStyle w:val="aa"/>
+            <w:rFonts w:eastAsia="맑은 고딕" w:cstheme="minorHAnsi"/>
+          </w:rPr>
+          <w:t>https://www.met.ie/cms/assets/uploads/2023/07/Irelands-Climate-Averages-1991_2020.pdf?utm_source=chatgpt.com</w:t>
+        </w:r>
+      </w:hyperlink>
+      <w:r>
+        <w:rPr>
+          <w:rFonts w:eastAsia="맑은 고딕" w:cstheme="minorHAnsi" w:hint="eastAsia"/>
+        </w:rPr>
+        <w:t xml:space="preserve"> (sunshine </w:t>
+      </w:r>
+      <w:r>
+        <w:rPr>
+          <w:rFonts w:eastAsia="맑은 고딕" w:cstheme="minorHAnsi"/>
+        </w:rPr>
+        <w:t>comparison</w:t>
+      </w:r>
+      <w:r>
+        <w:rPr>
+          <w:rFonts w:eastAsia="맑은 고딕" w:cstheme="minorHAnsi" w:hint="eastAsia"/>
+        </w:rPr>
+        <w:t xml:space="preserve"> from 1990 to 2020)</w:t>
       </w:r>
     </w:p>
     <w:p>
       <w:pPr>
         <w:rPr>
-          <w:color w:val="FF0000"/>
-        </w:rPr>
-      </w:pPr>
-      <w:r>
-        <w:rPr>
-          <w:color w:val="FF0000"/>
-        </w:rPr>
-        <w:t>The remainder of your text should be written using a normal font.]</w:t>
+          <w:rFonts w:eastAsia="맑은 고딕" w:cstheme="minorHAnsi"/>
+        </w:rPr>
+      </w:pPr>
+      <w:hyperlink r:id="rId13" w:history="1">
+        <w:r>
+          <w:rPr>
+            <w:rStyle w:val="aa"/>
+            <w:rFonts w:eastAsia="맑은 고딕" w:cstheme="minorHAnsi"/>
+          </w:rPr>
+          <w:t>https://www.cso.ie/en/statistics/climate/sunshinebymeteorologicalweatherstation/?utm_source=chatgpt.com</w:t>
+        </w:r>
+      </w:hyperlink>
+      <w:r>
+        <w:rPr>
+          <w:rFonts w:eastAsia="맑은 고딕" w:cstheme="minorHAnsi" w:hint="eastAsia"/>
+        </w:rPr>
+        <w:t xml:space="preserve"> (</w:t>
+      </w:r>
+      <w:r>
+        <w:rPr>
+          <w:rFonts w:eastAsia="맑은 고딕" w:cstheme="minorHAnsi"/>
+        </w:rPr>
+        <w:t>Total Sunshine per Month (Hours)</w:t>
+      </w:r>
+      <w:r>
+        <w:rPr>
+          <w:rFonts w:eastAsia="맑은 고딕" w:cstheme="minorHAnsi" w:hint="eastAsia"/>
+        </w:rPr>
+        <w:t>)</w:t>
       </w:r>
     </w:p>
     <w:p>
       <w:pPr>
-        <w:pStyle w:val="1"/>
-        <w:spacing w:after="0"/>
+        <w:rPr>
+          <w:rFonts w:eastAsia="맑은 고딕" w:cstheme="minorHAnsi"/>
+        </w:rPr>
+      </w:pPr>
+      <w:hyperlink r:id="rId14" w:history="1">
+        <w:r>
+          <w:rPr>
+            <w:rStyle w:val="aa"/>
+            <w:rFonts w:eastAsia="맑은 고딕" w:cstheme="minorHAnsi"/>
+          </w:rPr>
+          <w:t>https://www.met.ie/annual-climate-statement-for-2025?utm_source=chatgpt.com</w:t>
+        </w:r>
+      </w:hyperlink>
+      <w:r>
+        <w:rPr>
+          <w:rFonts w:eastAsia="맑은 고딕" w:cstheme="minorHAnsi" w:hint="eastAsia"/>
+        </w:rPr>
+        <w:t xml:space="preserve"> (2025 annual climate report)</w:t>
+      </w:r>
+    </w:p>
+    <w:p>
+      <w:pPr>
+        <w:rPr>
+          <w:rFonts w:eastAsia="맑은 고딕" w:cstheme="minorHAnsi"/>
+        </w:rPr>
+      </w:pPr>
+      <w:hyperlink r:id="rId15" w:history="1">
+        <w:r>
+          <w:rPr>
+            <w:rStyle w:val="aa"/>
+            <w:rFonts w:eastAsia="맑은 고딕" w:cstheme="minorHAnsi"/>
+          </w:rPr>
+          <w:t>https://www.met.ie/annual-climate-statement-for-2024?utm_source=chatgpt.com</w:t>
+        </w:r>
+      </w:hyperlink>
+      <w:r>
+        <w:rPr>
+          <w:rFonts w:eastAsia="맑은 고딕" w:cstheme="minorHAnsi" w:hint="eastAsia"/>
+        </w:rPr>
+        <w:t xml:space="preserve"> (2024 annual climate report)</w:t>
+      </w:r>
+    </w:p>
+    <w:p>
+      <w:pPr>
+        <w:rPr>
+          <w:lang w:val="en-IE"/>
+        </w:rPr>
       </w:pPr>
     </w:p>
     <w:p/>
@@ -1786,72 +2400,31 @@
     <w:p>
       <w:pPr>
         <w:pStyle w:val="1"/>
-        <w:spacing w:after="0"/>
-      </w:pPr>
+      </w:pPr>
+      <w:bookmarkStart w:id="2" w:name="_heading=h.2et92p0" w:colFirst="0" w:colLast="0"/>
+      <w:bookmarkEnd w:id="2"/>
       <w:r>
         <w:lastRenderedPageBreak/>
-        <w:t>Introduction</w:t>
+        <w:t>References</w:t>
       </w:r>
     </w:p>
     <w:p/>
     <w:p>
-      <w:r>
-        <w:t>This project focuses on creating a data-driven decision-support tool to help determine whether installing solar panels is economically viable for Irish households. In other words, it concerns which households can gain a reasonable economic benefit from installing solar thermal systems. As household energy costs rise, interest in renewable energy is growing, leading to increased demand for solar panel installations. Nevertheless, the project began from the perspective that a binary logic of simply focusing on installation costs or cost savings would not allow for accurate prediction. Therefore, it will provide personalized recommendations that are easy to understand for ordinary households considering the installation of solar panels.</w:t>
-      </w:r>
-    </w:p>
-    <w:p/>
-    <w:p/>
-    <w:p/>
-    <w:p>
-      <w:pPr>
-        <w:pStyle w:val="1"/>
-        <w:spacing w:after="0"/>
-        <w:rPr>
-          <w:rFonts w:hint="eastAsia"/>
-        </w:rPr>
-      </w:pPr>
-      <w:r>
-        <w:rPr>
-          <w:rFonts w:hint="eastAsia"/>
-        </w:rPr>
-        <w:t>Problem Definition</w:t>
-      </w:r>
-    </w:p>
-    <w:p/>
-    <w:p/>
-    <w:p/>
-    <w:p/>
-    <w:p/>
-    <w:p/>
-    <w:p/>
-    <w:p>
-      <w:pPr>
-        <w:pStyle w:val="1"/>
-      </w:pPr>
-      <w:bookmarkStart w:id="4" w:name="_heading=h.2et92p0" w:colFirst="0" w:colLast="0"/>
-      <w:bookmarkEnd w:id="4"/>
-      <w:r>
-        <w:t>References</w:t>
+      <w:pPr>
+        <w:rPr>
+          <w:color w:val="FF0000"/>
+        </w:rPr>
+      </w:pPr>
+      <w:r>
+        <w:rPr>
+          <w:color w:val="FF0000"/>
+        </w:rPr>
+        <w:t>Please list all the references you have used in your assignment alphabetically and in the Harvard style. You can find information on how to correctly reference in Harvard at this link: https://library.cct.ie/referencing/harvard</w:t>
       </w:r>
     </w:p>
     <w:p/>
     <w:p>
-      <w:pPr>
-        <w:rPr>
-          <w:color w:val="FF0000"/>
-        </w:rPr>
-      </w:pPr>
-      <w:r>
-        <w:rPr>
-          <w:color w:val="FF0000"/>
-        </w:rPr>
-        <w:lastRenderedPageBreak/>
-        <w:t>Please list all the references you have used in your assignment alphabetically and in the Harvard style. You can find information on how to correctly reference in Harvard at this link: https://library.cct.ie/referencing/harvard</w:t>
-      </w:r>
-    </w:p>
-    <w:p/>
-    <w:p>
-      <w:hyperlink r:id="rId11" w:history="1">
+      <w:hyperlink r:id="rId16" w:history="1">
         <w:r>
           <w:rPr>
             <w:rStyle w:val="aa"/>
@@ -1862,7 +2435,7 @@
     </w:p>
     <w:p/>
     <w:p>
-      <w:hyperlink r:id="rId12" w:history="1">
+      <w:hyperlink r:id="rId17" w:history="1">
         <w:r>
           <w:rPr>
             <w:rStyle w:val="aa"/>
@@ -1916,8 +2489,8 @@
       <w:pPr>
         <w:pStyle w:val="1"/>
       </w:pPr>
-      <w:bookmarkStart w:id="5" w:name="_heading=h.kfkjs3rwl2c1" w:colFirst="0" w:colLast="0"/>
-      <w:bookmarkEnd w:id="5"/>
+      <w:bookmarkStart w:id="3" w:name="_heading=h.kfkjs3rwl2c1" w:colFirst="0" w:colLast="0"/>
+      <w:bookmarkEnd w:id="3"/>
       <w:r>
         <w:t>Appendix</w:t>
       </w:r>
@@ -2612,6 +3185,97 @@
     </w:lvl>
   </w:abstractNum>
   <w:abstractNum w:abstractNumId="4" w15:restartNumberingAfterBreak="0">
+    <w:nsid w:val="2CB303A3"/>
+    <w:multiLevelType w:val="hybridMultilevel"/>
+    <w:tmpl w:val="1A14C0F6"/>
+    <w:lvl w:ilvl="0" w:tplc="5CD0F6F8">
+      <w:start w:val="1"/>
+      <w:numFmt w:val="decimal"/>
+      <w:lvlText w:val="%1."/>
+      <w:lvlJc w:val="left"/>
+      <w:pPr>
+        <w:ind w:left="720" w:hanging="360"/>
+      </w:pPr>
+      <w:rPr>
+        <w:rFonts w:asciiTheme="minorHAnsi" w:hAnsiTheme="minorHAnsi" w:cstheme="minorBidi" w:hint="default"/>
+        <w:color w:val="auto"/>
+        <w:sz w:val="22"/>
+      </w:rPr>
+    </w:lvl>
+    <w:lvl w:ilvl="1" w:tplc="04090019" w:tentative="1">
+      <w:start w:val="1"/>
+      <w:numFmt w:val="lowerLetter"/>
+      <w:lvlText w:val="%2."/>
+      <w:lvlJc w:val="left"/>
+      <w:pPr>
+        <w:ind w:left="1440" w:hanging="360"/>
+      </w:pPr>
+    </w:lvl>
+    <w:lvl w:ilvl="2" w:tplc="0409001B" w:tentative="1">
+      <w:start w:val="1"/>
+      <w:numFmt w:val="lowerRoman"/>
+      <w:lvlText w:val="%3."/>
+      <w:lvlJc w:val="right"/>
+      <w:pPr>
+        <w:ind w:left="2160" w:hanging="180"/>
+      </w:pPr>
+    </w:lvl>
+    <w:lvl w:ilvl="3" w:tplc="0409000F" w:tentative="1">
+      <w:start w:val="1"/>
+      <w:numFmt w:val="decimal"/>
+      <w:lvlText w:val="%4."/>
+      <w:lvlJc w:val="left"/>
+      <w:pPr>
+        <w:ind w:left="2880" w:hanging="360"/>
+      </w:pPr>
+    </w:lvl>
+    <w:lvl w:ilvl="4" w:tplc="04090019" w:tentative="1">
+      <w:start w:val="1"/>
+      <w:numFmt w:val="lowerLetter"/>
+      <w:lvlText w:val="%5."/>
+      <w:lvlJc w:val="left"/>
+      <w:pPr>
+        <w:ind w:left="3600" w:hanging="360"/>
+      </w:pPr>
+    </w:lvl>
+    <w:lvl w:ilvl="5" w:tplc="0409001B" w:tentative="1">
+      <w:start w:val="1"/>
+      <w:numFmt w:val="lowerRoman"/>
+      <w:lvlText w:val="%6."/>
+      <w:lvlJc w:val="right"/>
+      <w:pPr>
+        <w:ind w:left="4320" w:hanging="180"/>
+      </w:pPr>
+    </w:lvl>
+    <w:lvl w:ilvl="6" w:tplc="0409000F" w:tentative="1">
+      <w:start w:val="1"/>
+      <w:numFmt w:val="decimal"/>
+      <w:lvlText w:val="%7."/>
+      <w:lvlJc w:val="left"/>
+      <w:pPr>
+        <w:ind w:left="5040" w:hanging="360"/>
+      </w:pPr>
+    </w:lvl>
+    <w:lvl w:ilvl="7" w:tplc="04090019" w:tentative="1">
+      <w:start w:val="1"/>
+      <w:numFmt w:val="lowerLetter"/>
+      <w:lvlText w:val="%8."/>
+      <w:lvlJc w:val="left"/>
+      <w:pPr>
+        <w:ind w:left="5760" w:hanging="360"/>
+      </w:pPr>
+    </w:lvl>
+    <w:lvl w:ilvl="8" w:tplc="0409001B" w:tentative="1">
+      <w:start w:val="1"/>
+      <w:numFmt w:val="lowerRoman"/>
+      <w:lvlText w:val="%9."/>
+      <w:lvlJc w:val="right"/>
+      <w:pPr>
+        <w:ind w:left="6480" w:hanging="180"/>
+      </w:pPr>
+    </w:lvl>
+  </w:abstractNum>
+  <w:abstractNum w:abstractNumId="5" w15:restartNumberingAfterBreak="0">
     <w:nsid w:val="675573C9"/>
     <w:multiLevelType w:val="multilevel"/>
     <w:tmpl w:val="57D27894"/>
@@ -2760,7 +3424,7 @@
       </w:rPr>
     </w:lvl>
   </w:abstractNum>
-  <w:abstractNum w:abstractNumId="5" w15:restartNumberingAfterBreak="0">
+  <w:abstractNum w:abstractNumId="6" w15:restartNumberingAfterBreak="0">
     <w:nsid w:val="7A490A53"/>
     <w:multiLevelType w:val="multilevel"/>
     <w:tmpl w:val="9EA23756"/>
@@ -2916,16 +3580,19 @@
     <w:abstractNumId w:val="1"/>
   </w:num>
   <w:num w:numId="3" w16cid:durableId="728696014">
-    <w:abstractNumId w:val="4"/>
+    <w:abstractNumId w:val="5"/>
   </w:num>
   <w:num w:numId="4" w16cid:durableId="1057824889">
     <w:abstractNumId w:val="0"/>
   </w:num>
   <w:num w:numId="5" w16cid:durableId="716047706">
-    <w:abstractNumId w:val="5"/>
+    <w:abstractNumId w:val="6"/>
   </w:num>
   <w:num w:numId="6" w16cid:durableId="720325003">
     <w:abstractNumId w:val="3"/>
+  </w:num>
+  <w:num w:numId="7" w16cid:durableId="2126926824">
+    <w:abstractNumId w:val="4"/>
   </w:num>
 </w:numbering>
 </file>
@@ -3536,7 +4203,6 @@
   <w:style w:type="character" w:default="1" w:styleId="a0">
     <w:name w:val="Default Paragraph Font"/>
     <w:uiPriority w:val="1"/>
-    <w:semiHidden/>
     <w:unhideWhenUsed/>
   </w:style>
   <w:style w:type="table" w:default="1" w:styleId="a1">
@@ -3915,6 +4581,52 @@
     <w:uiPriority w:val="99"/>
     <w:rsid w:val="00DB141F"/>
   </w:style>
+  <w:style w:type="paragraph" w:styleId="ae">
+    <w:name w:val="Normal (Web)"/>
+    <w:basedOn w:val="a"/>
+    <w:uiPriority w:val="99"/>
+    <w:unhideWhenUsed/>
+    <w:rsid w:val="00EB3B8D"/>
+    <w:pPr>
+      <w:widowControl/>
+      <w:wordWrap/>
+      <w:autoSpaceDE/>
+      <w:autoSpaceDN/>
+      <w:spacing w:before="100" w:beforeAutospacing="1" w:after="100" w:afterAutospacing="1" w:line="240" w:lineRule="auto"/>
+    </w:pPr>
+    <w:rPr>
+      <w:rFonts w:ascii="Times New Roman" w:eastAsia="Times New Roman" w:hAnsi="Times New Roman" w:cs="Times New Roman"/>
+      <w:sz w:val="24"/>
+      <w:szCs w:val="24"/>
+      <w:lang w:val="en-IE" w:eastAsia="en-GB"/>
+      <w14:ligatures w14:val="none"/>
+    </w:rPr>
+  </w:style>
+  <w:style w:type="character" w:styleId="af">
+    <w:name w:val="Book Title"/>
+    <w:basedOn w:val="a0"/>
+    <w:uiPriority w:val="33"/>
+    <w:qFormat/>
+    <w:rsid w:val="00446544"/>
+    <w:rPr>
+      <w:b/>
+      <w:bCs/>
+      <w:i/>
+      <w:iCs/>
+      <w:spacing w:val="5"/>
+    </w:rPr>
+  </w:style>
+  <w:style w:type="character" w:styleId="af0">
+    <w:name w:val="Strong"/>
+    <w:basedOn w:val="a0"/>
+    <w:uiPriority w:val="22"/>
+    <w:qFormat/>
+    <w:rsid w:val="00446544"/>
+    <w:rPr>
+      <w:b/>
+      <w:bCs/>
+    </w:rPr>
+  </w:style>
 </w:styles>
 </file>
 

</xml_diff>

<commit_message>
done with problem definition
</commit_message>
<xml_diff>
--- a/sumi heo (2026324). strategic thinking ca1.docx
+++ b/sumi heo (2026324). strategic thinking ca1.docx
@@ -1203,11 +1203,6 @@
       <w:sdtContent>
         <w:p>
           <w:pPr>
-            <w:pStyle w:val="a6"/>
-            <w:numPr>
-              <w:ilvl w:val="0"/>
-              <w:numId w:val="7"/>
-            </w:numPr>
             <w:pBdr>
               <w:top w:val="nil"/>
               <w:left w:val="nil"/>
@@ -1245,11 +1240,6 @@
         </w:p>
         <w:p>
           <w:pPr>
-            <w:pStyle w:val="a6"/>
-            <w:numPr>
-              <w:ilvl w:val="0"/>
-              <w:numId w:val="7"/>
-            </w:numPr>
             <w:pBdr>
               <w:top w:val="nil"/>
               <w:left w:val="nil"/>
@@ -1311,7 +1301,7 @@
             <w:rPr>
               <w:rFonts w:hint="eastAsia"/>
             </w:rPr>
-            <w:t xml:space="preserve">3. </w:t>
+            <w:t xml:space="preserve"> </w:t>
           </w:r>
           <w:r>
             <w:rPr>
@@ -1354,7 +1344,7 @@
             <w:rPr>
               <w:rFonts w:hint="eastAsia"/>
             </w:rPr>
-            <w:t>3-1. Problem Definition</w:t>
+            <w:t>Problem Definition</w:t>
           </w:r>
           <w:hyperlink w:anchor="_heading=h.30j0zll">
             <w:r>
@@ -1387,12 +1377,6 @@
               <w:szCs w:val="24"/>
             </w:rPr>
           </w:pPr>
-          <w:r>
-            <w:rPr>
-              <w:rFonts w:hint="eastAsia"/>
-            </w:rPr>
-            <w:t>3-2.</w:t>
-          </w:r>
           <w:hyperlink w:anchor="_heading=h.1fob9te">
             <w:r>
               <w:rPr>
@@ -1470,7 +1454,7 @@
               <w:sz w:val="24"/>
               <w:szCs w:val="24"/>
             </w:rPr>
-            <w:t xml:space="preserve">4. </w:t>
+            <w:t xml:space="preserve"> </w:t>
           </w:r>
           <w:r>
             <w:rPr>
@@ -1518,15 +1502,6 @@
               <w:sz w:val="24"/>
               <w:szCs w:val="24"/>
             </w:rPr>
-            <w:t xml:space="preserve">5. </w:t>
-          </w:r>
-          <w:r>
-            <w:rPr>
-              <w:rFonts w:ascii="Aptos" w:hAnsi="Aptos" w:cs="Aptos" w:hint="eastAsia"/>
-              <w:color w:val="000000"/>
-              <w:sz w:val="24"/>
-              <w:szCs w:val="24"/>
-            </w:rPr>
             <w:t>Scopes</w:t>
           </w:r>
           <w:hyperlink w:anchor="_heading=h.30j0zll">
@@ -1566,15 +1541,6 @@
               <w:sz w:val="24"/>
               <w:szCs w:val="24"/>
             </w:rPr>
-            <w:t xml:space="preserve">6. </w:t>
-          </w:r>
-          <w:r>
-            <w:rPr>
-              <w:rFonts w:ascii="Aptos" w:hAnsi="Aptos" w:cs="Aptos" w:hint="eastAsia"/>
-              <w:color w:val="000000"/>
-              <w:sz w:val="24"/>
-              <w:szCs w:val="24"/>
-            </w:rPr>
             <w:t>Methodology</w:t>
           </w:r>
           <w:hyperlink w:anchor="_heading=h.30j0zll">
@@ -1614,15 +1580,6 @@
               <w:sz w:val="24"/>
               <w:szCs w:val="24"/>
             </w:rPr>
-            <w:t xml:space="preserve">7. </w:t>
-          </w:r>
-          <w:r>
-            <w:rPr>
-              <w:rFonts w:ascii="Aptos" w:hAnsi="Aptos" w:cs="Aptos" w:hint="eastAsia"/>
-              <w:color w:val="000000"/>
-              <w:sz w:val="24"/>
-              <w:szCs w:val="24"/>
-            </w:rPr>
             <w:t>Data Sources</w:t>
           </w:r>
           <w:hyperlink w:anchor="_heading=h.30j0zll">
@@ -1656,7 +1613,7 @@
               <w:sz w:val="24"/>
               <w:szCs w:val="24"/>
             </w:rPr>
-            <w:t xml:space="preserve">8. </w:t>
+            <w:t xml:space="preserve"> </w:t>
           </w:r>
           <w:r>
             <w:rPr>
@@ -1684,15 +1641,6 @@
               <w:szCs w:val="24"/>
             </w:rPr>
             <w:br/>
-          </w:r>
-          <w:r>
-            <w:rPr>
-              <w:rFonts w:ascii="Aptos" w:hAnsi="Aptos" w:cs="Aptos" w:hint="eastAsia"/>
-              <w:color w:val="000000"/>
-              <w:sz w:val="24"/>
-              <w:szCs w:val="24"/>
-            </w:rPr>
-            <w:t xml:space="preserve">9. </w:t>
           </w:r>
           <w:r>
             <w:rPr>
@@ -1852,8 +1800,6 @@
           <w:rFonts w:hint="eastAsia"/>
         </w:rPr>
       </w:pPr>
-      <w:bookmarkStart w:id="0" w:name="_heading=h.gjdgxs" w:colFirst="0" w:colLast="0"/>
-      <w:bookmarkEnd w:id="0"/>
       <w:r>
         <w:rPr>
           <w:rFonts w:hint="eastAsia"/>
@@ -1869,8 +1815,8 @@
           <w:rStyle w:val="af0"/>
         </w:rPr>
       </w:pPr>
-      <w:bookmarkStart w:id="1" w:name="_heading=h.30j0zll" w:colFirst="0" w:colLast="0"/>
-      <w:bookmarkEnd w:id="1"/>
+      <w:bookmarkStart w:id="0" w:name="_heading=h.30j0zll" w:colFirst="0" w:colLast="0"/>
+      <w:bookmarkEnd w:id="0"/>
       <w:r>
         <w:rPr>
           <w:rStyle w:val="af0"/>
@@ -2113,42 +2059,45 @@
         <w:rPr>
           <w:rFonts w:hint="eastAsia"/>
         </w:rPr>
-        <w:t xml:space="preserve"> To </w:t>
-      </w:r>
-      <w:proofErr w:type="gramStart"/>
-      <w:r>
-        <w:rPr>
-          <w:rFonts w:hint="eastAsia"/>
-        </w:rPr>
-        <w:t>classify ?</w:t>
-      </w:r>
-      <w:proofErr w:type="gramEnd"/>
-      <w:r>
-        <w:rPr>
-          <w:rFonts w:hint="eastAsia"/>
-        </w:rPr>
-        <w:t xml:space="preserve"> determine? </w:t>
-      </w:r>
-      <w:r>
-        <w:t>E</w:t>
-      </w:r>
-      <w:r>
-        <w:rPr>
-          <w:rFonts w:hint="eastAsia"/>
-        </w:rPr>
-        <w:t xml:space="preserve">ven in this </w:t>
-      </w:r>
-      <w:proofErr w:type="gramStart"/>
-      <w:r>
-        <w:rPr>
-          <w:rFonts w:hint="eastAsia"/>
-        </w:rPr>
-        <w:t xml:space="preserve">condition, </w:t>
-      </w:r>
-      <w:r>
-        <w:rPr>
-          <w:rFonts w:hint="eastAsia"/>
-        </w:rPr>
+        <w:t xml:space="preserve"> To cla</w:t>
+      </w:r>
+      <w:r>
+        <w:rPr>
+          <w:rFonts w:hint="eastAsia"/>
+        </w:rPr>
+        <w:t>r</w:t>
+      </w:r>
+      <w:r>
+        <w:rPr>
+          <w:rFonts w:hint="eastAsia"/>
+        </w:rPr>
+        <w:t xml:space="preserve">ify </w:t>
+      </w:r>
+      <w:r>
+        <w:t>whether</w:t>
+      </w:r>
+      <w:r>
+        <w:rPr>
+          <w:rFonts w:hint="eastAsia"/>
+        </w:rPr>
+        <w:t xml:space="preserve"> this is </w:t>
+      </w:r>
+      <w:r>
+        <w:t>financially</w:t>
+      </w:r>
+      <w:r>
+        <w:rPr>
+          <w:rFonts w:hint="eastAsia"/>
+        </w:rPr>
+        <w:t xml:space="preserve"> valuable e</w:t>
+      </w:r>
+      <w:r>
+        <w:rPr>
+          <w:rFonts w:hint="eastAsia"/>
+        </w:rPr>
+        <w:t>ven in this condition</w:t>
+      </w:r>
+      <w:r>
         <w:t xml:space="preserve"> </w:t>
       </w:r>
       <w:r>
@@ -2157,39 +2106,102 @@
         </w:rPr>
         <w:t>I</w:t>
       </w:r>
-      <w:proofErr w:type="gramEnd"/>
+      <w:r>
+        <w:t xml:space="preserve"> plan to conduct an analysis by county</w:t>
+      </w:r>
+      <w:r>
+        <w:rPr>
+          <w:rFonts w:hint="eastAsia"/>
+        </w:rPr>
+        <w:t xml:space="preserve"> of Ireland</w:t>
+      </w:r>
+      <w:r>
+        <w:t xml:space="preserve">. </w:t>
+      </w:r>
+      <w:r>
+        <w:rPr>
+          <w:rFonts w:hint="eastAsia"/>
+        </w:rPr>
+        <w:t xml:space="preserve">In addition, </w:t>
+      </w:r>
+      <w:r>
+        <w:t>the</w:t>
+      </w:r>
+      <w:r>
+        <w:t xml:space="preserve"> reason it is difficult to compare installation costs with future electricity savings is that the results vary depending on location, system size, roof condition, electricity consumption, export </w:t>
+      </w:r>
+      <w:r>
+        <w:lastRenderedPageBreak/>
+        <w:t>payments,</w:t>
+      </w:r>
+      <w:r>
+        <w:rPr>
+          <w:rFonts w:hint="eastAsia"/>
+        </w:rPr>
+        <w:t xml:space="preserve"> etc.</w:t>
+      </w:r>
+      <w:r>
+        <w:t xml:space="preserve"> Recommendations based on the BER rating</w:t>
+      </w:r>
+      <w:r>
+        <w:rPr>
+          <w:rFonts w:hint="eastAsia"/>
+        </w:rPr>
+        <w:t>,</w:t>
+      </w:r>
+      <w:r>
+        <w:t xml:space="preserve"> location</w:t>
+      </w:r>
+      <w:r>
+        <w:rPr>
+          <w:rFonts w:hint="eastAsia"/>
+        </w:rPr>
+        <w:t xml:space="preserve">, PVGIS allow people to get </w:t>
+      </w:r>
+      <w:r>
+        <w:t>information about</w:t>
+      </w:r>
       <w:r>
         <w:rPr>
           <w:rFonts w:hint="eastAsia"/>
         </w:rPr>
         <w:t xml:space="preserve"> </w:t>
       </w:r>
-      <w:proofErr w:type="gramStart"/>
-      <w:r>
-        <w:rPr>
-          <w:rFonts w:hint="eastAsia"/>
-        </w:rPr>
-        <w:t>wondered</w:t>
-      </w:r>
-      <w:r>
-        <w:t xml:space="preserve"> to determine</w:t>
-      </w:r>
-      <w:proofErr w:type="gramEnd"/>
-      <w:r>
-        <w:t xml:space="preserve"> whether this is economically effective and under which </w:t>
-      </w:r>
-      <w:r>
-        <w:rPr>
-          <w:rFonts w:hint="eastAsia"/>
-        </w:rPr>
-        <w:t>house</w:t>
-      </w:r>
-      <w:r>
-        <w:t xml:space="preserve"> it should be implemented, we plan to conduct an analysis by county. The reason it is difficult to compare installation costs with future electricity savings is that the results vary </w:t>
-      </w:r>
-      <w:r>
-        <w:lastRenderedPageBreak/>
-        <w:t>depending on location, system size, roof condition, electricity consumption, export payments, and subsidies. Recommendations based solely on the BER rating or location are not sufficient. Data analysis allows identification of patterns among similar homes, and PVGIS can estimate power generation under given assumptions. Economic models allow you to estimate savings, payback periods, and net present value (NPV), providing a clearer understanding of the return on investment.</w:t>
+      <w:r>
+        <w:t>estimate</w:t>
+      </w:r>
+      <w:r>
+        <w:rPr>
+          <w:rFonts w:hint="eastAsia"/>
+        </w:rPr>
+        <w:t>d annual</w:t>
+      </w:r>
+      <w:r>
+        <w:t xml:space="preserve"> savings, </w:t>
+      </w:r>
+      <w:r>
+        <w:rPr>
+          <w:rFonts w:hint="eastAsia"/>
+        </w:rPr>
+        <w:t xml:space="preserve">investment </w:t>
+      </w:r>
+      <w:r>
+        <w:t>payback periods,</w:t>
+      </w:r>
+      <w:r>
+        <w:rPr>
+          <w:rFonts w:hint="eastAsia"/>
+        </w:rPr>
+        <w:t xml:space="preserve"> estimated annual power generation</w:t>
+      </w:r>
+      <w:r>
+        <w:t xml:space="preserve"> and net present value (NPV)</w:t>
+      </w:r>
+      <w:r>
+        <w:rPr>
+          <w:rFonts w:hint="eastAsia"/>
+        </w:rPr>
+        <w:t>.</w:t>
       </w:r>
     </w:p>
     <w:p/>
@@ -2266,7 +2278,19 @@
         <w:rPr>
           <w:rFonts w:eastAsia="맑은 고딕" w:cstheme="minorHAnsi"/>
         </w:rPr>
+        <w:t>‘</w:t>
+      </w:r>
+      <w:r>
+        <w:rPr>
+          <w:rFonts w:eastAsia="맑은 고딕" w:cstheme="minorHAnsi"/>
+        </w:rPr>
         <w:t>Solar PV generation was up 69% and ambient heat capture from heat-pumps was up 19% in 2024.</w:t>
+      </w:r>
+      <w:r>
+        <w:rPr>
+          <w:rFonts w:eastAsia="맑은 고딕" w:cstheme="minorHAnsi"/>
+        </w:rPr>
+        <w:t>’</w:t>
       </w:r>
       <w:r>
         <w:rPr>
@@ -2362,7 +2386,7 @@
         <w:rPr>
           <w:rFonts w:eastAsia="맑은 고딕" w:cstheme="minorHAnsi" w:hint="eastAsia"/>
         </w:rPr>
-        <w:t xml:space="preserve"> (2025 annual climate report)</w:t>
+        <w:t xml:space="preserve"> </w:t>
       </w:r>
     </w:p>
     <w:p>
@@ -2384,6 +2408,324 @@
         <w:rPr>
           <w:rFonts w:eastAsia="맑은 고딕" w:cstheme="minorHAnsi" w:hint="eastAsia"/>
         </w:rPr>
+        <w:t xml:space="preserve"> (</w:t>
+      </w:r>
+      <w:r>
+        <w:rPr>
+          <w:rFonts w:eastAsia="맑은 고딕" w:cstheme="minorHAnsi" w:hint="eastAsia"/>
+        </w:rPr>
+        <w:t xml:space="preserve">2025, </w:t>
+      </w:r>
+      <w:r>
+        <w:rPr>
+          <w:rFonts w:eastAsia="맑은 고딕" w:cstheme="minorHAnsi" w:hint="eastAsia"/>
+        </w:rPr>
+        <w:t>2024 annual climate report)</w:t>
+      </w:r>
+    </w:p>
+    <w:p>
+      <w:pPr>
+        <w:rPr>
+          <w:rFonts w:eastAsia="맑은 고딕" w:cstheme="minorHAnsi"/>
+        </w:rPr>
+      </w:pPr>
+    </w:p>
+    <w:p>
+      <w:pPr>
+        <w:rPr>
+          <w:rFonts w:eastAsia="맑은 고딕" w:cstheme="minorHAnsi"/>
+        </w:rPr>
+      </w:pPr>
+    </w:p>
+    <w:p>
+      <w:pPr>
+        <w:pStyle w:val="1"/>
+      </w:pPr>
+      <w:r>
+        <w:rPr>
+          <w:rFonts w:hint="eastAsia"/>
+        </w:rPr>
+        <w:t>Aim and Objectives</w:t>
+      </w:r>
+    </w:p>
+    <w:p>
+      <w:pPr>
+        <w:rPr>
+          <w:rFonts w:hint="eastAsia"/>
+        </w:rPr>
+      </w:pPr>
+    </w:p>
+    <w:p>
+      <w:pPr>
+        <w:pStyle w:val="1"/>
+      </w:pPr>
+      <w:r>
+        <w:rPr>
+          <w:rFonts w:hint="eastAsia"/>
+        </w:rPr>
+        <w:lastRenderedPageBreak/>
+        <w:t>Scope</w:t>
+      </w:r>
+    </w:p>
+    <w:p>
+      <w:pPr>
+        <w:pStyle w:val="1"/>
+      </w:pPr>
+      <w:r>
+        <w:rPr>
+          <w:rFonts w:hint="eastAsia"/>
+        </w:rPr>
+        <w:t>Methodology</w:t>
+      </w:r>
+    </w:p>
+    <w:p>
+      <w:pPr>
+        <w:pStyle w:val="1"/>
+      </w:pPr>
+      <w:r>
+        <w:rPr>
+          <w:rFonts w:hint="eastAsia"/>
+        </w:rPr>
+        <w:t>Data Sources</w:t>
+      </w:r>
+    </w:p>
+    <w:p>
+      <w:pPr>
+        <w:pStyle w:val="1"/>
+      </w:pPr>
+      <w:r>
+        <w:rPr>
+          <w:rFonts w:hint="eastAsia"/>
+        </w:rPr>
+        <w:t>Expected Deliverables</w:t>
+      </w:r>
+    </w:p>
+    <w:p>
+      <w:pPr>
+        <w:pStyle w:val="1"/>
+      </w:pPr>
+      <w:r>
+        <w:rPr>
+          <w:rFonts w:hint="eastAsia"/>
+        </w:rPr>
+        <w:t>Project Timeline</w:t>
+      </w:r>
+    </w:p>
+    <w:p>
+      <w:pPr>
+        <w:pStyle w:val="1"/>
+        <w:rPr>
+          <w:rFonts w:hint="eastAsia"/>
+        </w:rPr>
+      </w:pPr>
+      <w:r>
+        <w:rPr>
+          <w:rFonts w:hint="eastAsia"/>
+        </w:rPr>
+        <w:t>Ethical and Legal Consideration</w:t>
+      </w:r>
+    </w:p>
+    <w:p/>
+    <w:p>
+      <w:pPr>
+        <w:pStyle w:val="1"/>
+      </w:pPr>
+      <w:bookmarkStart w:id="1" w:name="_heading=h.2et92p0" w:colFirst="0" w:colLast="0"/>
+      <w:bookmarkEnd w:id="1"/>
+      <w:r>
+        <w:t>References</w:t>
+      </w:r>
+    </w:p>
+    <w:p>
+      <w:pPr>
+        <w:rPr>
+          <w:rFonts w:eastAsia="맑은 고딕" w:cstheme="minorHAnsi"/>
+        </w:rPr>
+      </w:pPr>
+      <w:r>
+        <w:rPr>
+          <w:rFonts w:hint="eastAsia"/>
+        </w:rPr>
+        <w:t xml:space="preserve"> </w:t>
+      </w:r>
+      <w:hyperlink r:id="rId16" w:history="1">
+        <w:r>
+          <w:rPr>
+            <w:rStyle w:val="aa"/>
+            <w:rFonts w:eastAsia="맑은 고딕" w:cstheme="minorHAnsi"/>
+          </w:rPr>
+          <w:t>https://energyefficiency.ie/wp-content/uploads/2026/04/Residential-Solar-Panel-Report-2026.pdf?utm_source=chatgpt.com</w:t>
+        </w:r>
+      </w:hyperlink>
+      <w:r>
+        <w:rPr>
+          <w:rFonts w:eastAsia="맑은 고딕" w:cstheme="minorHAnsi" w:hint="eastAsia"/>
+        </w:rPr>
+        <w:t xml:space="preserve"> (</w:t>
+      </w:r>
+      <w:r>
+        <w:rPr>
+          <w:rFonts w:eastAsia="맑은 고딕" w:cstheme="minorHAnsi"/>
+        </w:rPr>
+        <w:t>monthly</w:t>
+      </w:r>
+      <w:r>
+        <w:rPr>
+          <w:rFonts w:eastAsia="맑은 고딕" w:cstheme="minorHAnsi" w:hint="eastAsia"/>
+        </w:rPr>
+        <w:t xml:space="preserve"> installation from 2020 to 2025)</w:t>
+      </w:r>
+    </w:p>
+    <w:p>
+      <w:pPr>
+        <w:rPr>
+          <w:rFonts w:eastAsia="맑은 고딕" w:cstheme="minorHAnsi"/>
+        </w:rPr>
+      </w:pPr>
+      <w:hyperlink r:id="rId17" w:history="1">
+        <w:r>
+          <w:rPr>
+            <w:rStyle w:val="aa"/>
+            <w:rFonts w:eastAsia="맑은 고딕" w:cstheme="minorHAnsi"/>
+          </w:rPr>
+          <w:t>https://www.seai.ie/data-and-insights/seai-statistics/key-publications/energy-in-ireland?trk=article-ssr-frontend-pulse_little-text-block&amp;utm_source=chatgpt.com</w:t>
+        </w:r>
+      </w:hyperlink>
+      <w:r>
+        <w:rPr>
+          <w:rFonts w:eastAsia="맑은 고딕" w:cstheme="minorHAnsi" w:hint="eastAsia"/>
+        </w:rPr>
+        <w:t xml:space="preserve"> (</w:t>
+      </w:r>
+      <w:r>
+        <w:rPr>
+          <w:rFonts w:eastAsia="맑은 고딕" w:cstheme="minorHAnsi"/>
+        </w:rPr>
+        <w:t>Solar PV generation was up 69% and ambient heat capture from heat-pumps was up 19% in 2024.</w:t>
+      </w:r>
+      <w:r>
+        <w:rPr>
+          <w:rFonts w:eastAsia="맑은 고딕" w:cstheme="minorHAnsi" w:hint="eastAsia"/>
+        </w:rPr>
+        <w:t>)</w:t>
+      </w:r>
+    </w:p>
+    <w:p>
+      <w:pPr>
+        <w:rPr>
+          <w:rFonts w:eastAsia="맑은 고딕" w:cstheme="minorHAnsi"/>
+        </w:rPr>
+      </w:pPr>
+      <w:hyperlink r:id="rId18" w:history="1">
+        <w:r>
+          <w:rPr>
+            <w:rStyle w:val="aa"/>
+            <w:rFonts w:eastAsia="맑은 고딕" w:cstheme="minorHAnsi"/>
+          </w:rPr>
+          <w:t>https://www.met.ie/cms/assets/uploads/2023/07/Irelands-Climate-Averages-1991_2020.pdf?utm_source=chatgpt.com</w:t>
+        </w:r>
+      </w:hyperlink>
+      <w:r>
+        <w:rPr>
+          <w:rFonts w:eastAsia="맑은 고딕" w:cstheme="minorHAnsi" w:hint="eastAsia"/>
+        </w:rPr>
+        <w:t xml:space="preserve"> (sunshine </w:t>
+      </w:r>
+      <w:r>
+        <w:rPr>
+          <w:rFonts w:eastAsia="맑은 고딕" w:cstheme="minorHAnsi"/>
+        </w:rPr>
+        <w:t>comparison</w:t>
+      </w:r>
+      <w:r>
+        <w:rPr>
+          <w:rFonts w:eastAsia="맑은 고딕" w:cstheme="minorHAnsi" w:hint="eastAsia"/>
+        </w:rPr>
+        <w:t xml:space="preserve"> from 1990 to 2020)</w:t>
+      </w:r>
+    </w:p>
+    <w:p>
+      <w:pPr>
+        <w:rPr>
+          <w:rFonts w:eastAsia="맑은 고딕" w:cstheme="minorHAnsi"/>
+        </w:rPr>
+      </w:pPr>
+      <w:hyperlink r:id="rId19" w:history="1">
+        <w:r>
+          <w:rPr>
+            <w:rStyle w:val="aa"/>
+            <w:rFonts w:eastAsia="맑은 고딕" w:cstheme="minorHAnsi"/>
+          </w:rPr>
+          <w:t>https://www.cso.ie/en/statistics/climate/sunshinebymeteorologicalweatherstation/?utm_source=chatgpt.com</w:t>
+        </w:r>
+      </w:hyperlink>
+      <w:r>
+        <w:rPr>
+          <w:rFonts w:eastAsia="맑은 고딕" w:cstheme="minorHAnsi" w:hint="eastAsia"/>
+        </w:rPr>
+        <w:t xml:space="preserve"> (</w:t>
+      </w:r>
+      <w:r>
+        <w:rPr>
+          <w:rFonts w:eastAsia="맑은 고딕" w:cstheme="minorHAnsi"/>
+        </w:rPr>
+        <w:t>Total Sunshine per Month (Hours)</w:t>
+      </w:r>
+      <w:r>
+        <w:rPr>
+          <w:rFonts w:eastAsia="맑은 고딕" w:cstheme="minorHAnsi" w:hint="eastAsia"/>
+        </w:rPr>
+        <w:t>)</w:t>
+      </w:r>
+    </w:p>
+    <w:p>
+      <w:pPr>
+        <w:rPr>
+          <w:rFonts w:eastAsia="맑은 고딕" w:cstheme="minorHAnsi"/>
+        </w:rPr>
+      </w:pPr>
+      <w:hyperlink r:id="rId20" w:history="1">
+        <w:r>
+          <w:rPr>
+            <w:rStyle w:val="aa"/>
+            <w:rFonts w:eastAsia="맑은 고딕" w:cstheme="minorHAnsi"/>
+          </w:rPr>
+          <w:t>https://www.met.ie/annual-climate-statement-for-2025?utm_source=chatgpt.com</w:t>
+        </w:r>
+      </w:hyperlink>
+      <w:r>
+        <w:rPr>
+          <w:rFonts w:eastAsia="맑은 고딕" w:cstheme="minorHAnsi" w:hint="eastAsia"/>
+        </w:rPr>
+        <w:t xml:space="preserve"> (2025 </w:t>
+      </w:r>
+      <w:r>
+        <w:rPr>
+          <w:rFonts w:eastAsia="맑은 고딕" w:cstheme="minorHAnsi" w:hint="eastAsia"/>
+        </w:rPr>
+        <w:lastRenderedPageBreak/>
+        <w:t>annual climate report)</w:t>
+      </w:r>
+    </w:p>
+    <w:p>
+      <w:pPr>
+        <w:rPr>
+          <w:rFonts w:eastAsia="맑은 고딕" w:cstheme="minorHAnsi"/>
+        </w:rPr>
+      </w:pPr>
+      <w:hyperlink r:id="rId21" w:history="1">
+        <w:r>
+          <w:rPr>
+            <w:rStyle w:val="aa"/>
+            <w:rFonts w:eastAsia="맑은 고딕" w:cstheme="minorHAnsi"/>
+          </w:rPr>
+          <w:t>https://www.met.ie/annual-climate-statement-for-2024?utm_source=chatgpt.com</w:t>
+        </w:r>
+      </w:hyperlink>
+      <w:r>
+        <w:rPr>
+          <w:rFonts w:eastAsia="맑은 고딕" w:cstheme="minorHAnsi" w:hint="eastAsia"/>
+        </w:rPr>
         <w:t xml:space="preserve"> (2024 annual climate report)</w:t>
       </w:r>
     </w:p>
@@ -2394,37 +2736,22 @@
         </w:rPr>
       </w:pPr>
     </w:p>
-    <w:p/>
-    <w:p/>
-    <w:p/>
-    <w:p>
-      <w:pPr>
-        <w:pStyle w:val="1"/>
-      </w:pPr>
-      <w:bookmarkStart w:id="2" w:name="_heading=h.2et92p0" w:colFirst="0" w:colLast="0"/>
-      <w:bookmarkEnd w:id="2"/>
-      <w:r>
-        <w:lastRenderedPageBreak/>
-        <w:t>References</w:t>
-      </w:r>
-    </w:p>
-    <w:p/>
-    <w:p>
-      <w:pPr>
-        <w:rPr>
-          <w:color w:val="FF0000"/>
-        </w:rPr>
-      </w:pPr>
-      <w:r>
-        <w:rPr>
-          <w:color w:val="FF0000"/>
-        </w:rPr>
-        <w:t>Please list all the references you have used in your assignment alphabetically and in the Harvard style. You can find information on how to correctly reference in Harvard at this link: https://library.cct.ie/referencing/harvard</w:t>
-      </w:r>
-    </w:p>
-    <w:p/>
-    <w:p>
-      <w:hyperlink r:id="rId16" w:history="1">
+    <w:p>
+      <w:pPr>
+        <w:rPr>
+          <w:lang w:val="en-IE"/>
+        </w:rPr>
+      </w:pPr>
+    </w:p>
+    <w:p>
+      <w:pPr>
+        <w:rPr>
+          <w:rFonts w:hint="eastAsia"/>
+        </w:rPr>
+      </w:pPr>
+    </w:p>
+    <w:p>
+      <w:hyperlink r:id="rId22" w:history="1">
         <w:r>
           <w:rPr>
             <w:rStyle w:val="aa"/>
@@ -2435,7 +2762,7 @@
     </w:p>
     <w:p/>
     <w:p>
-      <w:hyperlink r:id="rId17" w:history="1">
+      <w:hyperlink r:id="rId23" w:history="1">
         <w:r>
           <w:rPr>
             <w:rStyle w:val="aa"/>
@@ -2489,8 +2816,8 @@
       <w:pPr>
         <w:pStyle w:val="1"/>
       </w:pPr>
-      <w:bookmarkStart w:id="3" w:name="_heading=h.kfkjs3rwl2c1" w:colFirst="0" w:colLast="0"/>
-      <w:bookmarkEnd w:id="3"/>
+      <w:bookmarkStart w:id="2" w:name="_heading=h.kfkjs3rwl2c1" w:colFirst="0" w:colLast="0"/>
+      <w:bookmarkEnd w:id="2"/>
       <w:r>
         <w:t>Appendix</w:t>
       </w:r>

</xml_diff>

<commit_message>
change the content of data sources
</commit_message>
<xml_diff>
--- a/sumi heo (2026324). strategic thinking ca1.docx
+++ b/sumi heo (2026324). strategic thinking ca1.docx
@@ -1677,6 +1677,12 @@
             <w:rPr>
               <w:rFonts w:hint="eastAsia"/>
             </w:rPr>
+            <w:t xml:space="preserve">Gantt </w:t>
+          </w:r>
+          <w:r>
+            <w:rPr>
+              <w:rFonts w:hint="eastAsia"/>
+            </w:rPr>
             <w:t>Chart</w:t>
           </w:r>
           <w:hyperlink w:anchor="_heading=h.30j0zll">
@@ -2482,12 +2488,159 @@
     </w:p>
     <w:p>
       <w:pPr>
+        <w:rPr>
+          <w:rFonts w:hint="eastAsia"/>
+        </w:rPr>
+      </w:pPr>
+      <w:r>
+        <w:t>SEAI National BER Research Tool:</w:t>
+      </w:r>
+      <w:r>
+        <w:rPr>
+          <w:rFonts w:hint="eastAsia"/>
+        </w:rPr>
+        <w:t xml:space="preserve"> </w:t>
+      </w:r>
+      <w:r>
+        <w:rPr>
+          <w:rFonts w:hint="eastAsia"/>
+        </w:rPr>
+        <w:t xml:space="preserve">Main dataset which includes important data such as BER rating, County name, Date of assessment, year of construction, etc. </w:t>
+      </w:r>
+      <w:r>
+        <w:t>However,</w:t>
+      </w:r>
+      <w:r>
+        <w:rPr>
+          <w:rFonts w:hint="eastAsia"/>
+        </w:rPr>
+        <w:t xml:space="preserve"> it contains more than 1 million rows and over 100 columns. It would </w:t>
+      </w:r>
+      <w:r>
+        <w:t>make it</w:t>
+      </w:r>
+      <w:r>
+        <w:rPr>
+          <w:rFonts w:hint="eastAsia"/>
+        </w:rPr>
+        <w:t xml:space="preserve"> hard </w:t>
+      </w:r>
+      <w:proofErr w:type="gramStart"/>
+      <w:r>
+        <w:t>analyze</w:t>
+      </w:r>
+      <w:proofErr w:type="gramEnd"/>
+      <w:r>
+        <w:rPr>
+          <w:rFonts w:hint="eastAsia"/>
+        </w:rPr>
+        <w:t>, so I extracted most recent data from 2022- 2024 which is over 270,000 data.</w:t>
+      </w:r>
+    </w:p>
+    <w:p>
+      <w:pPr>
+        <w:rPr>
+          <w:rFonts w:hint="eastAsia"/>
+        </w:rPr>
+      </w:pPr>
+      <w:r>
+        <w:t>European Commission Joint Research Centre PVGIS</w:t>
+      </w:r>
+      <w:r>
+        <w:rPr>
+          <w:rFonts w:hint="eastAsia"/>
+        </w:rPr>
+        <w:t xml:space="preserve"> (In case)</w:t>
+      </w:r>
+      <w:r>
+        <w:t>:</w:t>
+      </w:r>
+      <w:r>
+        <w:rPr>
+          <w:rFonts w:hint="eastAsia"/>
+        </w:rPr>
+        <w:t xml:space="preserve"> </w:t>
+      </w:r>
+      <w:r>
+        <w:t>API-based solar PV generation estimates using location and system parameters</w:t>
+      </w:r>
+      <w:r>
+        <w:rPr>
+          <w:rFonts w:hint="eastAsia"/>
+        </w:rPr>
+        <w:t xml:space="preserve"> (</w:t>
+      </w:r>
+      <w:hyperlink r:id="rId16" w:history="1">
+        <w:r>
+          <w:rPr>
+            <w:rStyle w:val="aa"/>
+          </w:rPr>
+          <w:t>https://photovoltaic-geographic-information-system.ec.europa.eu/en</w:t>
+        </w:r>
+      </w:hyperlink>
+      <w:r>
+        <w:rPr>
+          <w:rFonts w:hint="eastAsia"/>
+        </w:rPr>
+        <w:t xml:space="preserve">). </w:t>
+      </w:r>
+      <w:r>
+        <w:t xml:space="preserve">The "Annual Solar Radiation" </w:t>
+      </w:r>
+      <w:r>
+        <w:rPr>
+          <w:rFonts w:hint="eastAsia"/>
+        </w:rPr>
+        <w:t>column data</w:t>
+      </w:r>
+      <w:r>
+        <w:t xml:space="preserve">, which I considered using in the main dataset, </w:t>
+      </w:r>
+      <w:r>
+        <w:rPr>
+          <w:rFonts w:hint="eastAsia"/>
+        </w:rPr>
+        <w:t>has too many missing values,</w:t>
+      </w:r>
+      <w:r>
+        <w:t xml:space="preserve"> so I plan to use </w:t>
+      </w:r>
+      <w:r>
+        <w:rPr>
+          <w:rFonts w:hint="eastAsia"/>
+        </w:rPr>
+        <w:t>this data</w:t>
+      </w:r>
+      <w:r>
+        <w:t xml:space="preserve"> if I feel that the data is needed during analysis. </w:t>
+      </w:r>
+      <w:r>
+        <w:rPr>
+          <w:rFonts w:hint="eastAsia"/>
+        </w:rPr>
+        <w:t>I w</w:t>
+      </w:r>
+      <w:r>
+        <w:t>ill verify the availability of the data before use</w:t>
+      </w:r>
+    </w:p>
+    <w:p>
+      <w:pPr>
+        <w:rPr>
+          <w:rFonts w:hint="eastAsia"/>
+        </w:rPr>
+      </w:pPr>
+    </w:p>
+    <w:p/>
+    <w:p>
+      <w:pPr>
         <w:pStyle w:val="1"/>
       </w:pPr>
       <w:r>
         <w:rPr>
           <w:rFonts w:hint="eastAsia"/>
         </w:rPr>
+        <w:lastRenderedPageBreak/>
         <w:t>Expected Deliverables</w:t>
       </w:r>
     </w:p>
@@ -2500,6 +2653,20 @@
           <w:rFonts w:hint="eastAsia"/>
         </w:rPr>
         <w:t>Project Timeline</w:t>
+      </w:r>
+    </w:p>
+    <w:p>
+      <w:pPr>
+        <w:pStyle w:val="2"/>
+        <w:rPr>
+          <w:rFonts w:hint="eastAsia"/>
+        </w:rPr>
+      </w:pPr>
+      <w:r>
+        <w:rPr>
+          <w:rFonts w:hint="eastAsia"/>
+        </w:rPr>
+        <w:t>Gantt Chart</w:t>
       </w:r>
     </w:p>
     <w:p>
@@ -2525,7 +2692,7 @@
                     </pic:cNvPicPr>
                   </pic:nvPicPr>
                   <pic:blipFill>
-                    <a:blip r:embed="rId16">
+                    <a:blip r:embed="rId17">
                       <a:extLst>
                         <a:ext uri="{28A0092B-C50C-407E-A947-70E740481C1C}">
                           <a14:useLocalDpi xmlns:a14="http://schemas.microsoft.com/office/drawing/2010/main" val="0"/>
@@ -2594,7 +2761,7 @@
         </w:rPr>
         <w:t xml:space="preserve"> </w:t>
       </w:r>
-      <w:hyperlink r:id="rId17" w:history="1">
+      <w:hyperlink r:id="rId18" w:history="1">
         <w:r>
           <w:rPr>
             <w:rStyle w:val="aa"/>
@@ -2628,7 +2795,7 @@
           <w:rFonts w:eastAsia="맑은 고딕" w:cstheme="minorHAnsi"/>
         </w:rPr>
       </w:pPr>
-      <w:hyperlink r:id="rId18" w:history="1">
+      <w:hyperlink r:id="rId19" w:history="1">
         <w:r>
           <w:rPr>
             <w:rStyle w:val="aa"/>
@@ -2647,29 +2814,22 @@
         <w:rPr>
           <w:rFonts w:eastAsia="맑은 고딕" w:cstheme="minorHAnsi"/>
         </w:rPr>
-        <w:t xml:space="preserve">Solar PV generation was up 69% and ambient heat capture from heat-pumps was up 19% in </w:t>
-      </w:r>
-      <w:r>
+        <w:t>Solar PV generation was up 69% and ambient heat capture from heat-pumps was up 19% in 2024.</w:t>
+      </w:r>
+      <w:r>
+        <w:rPr>
+          <w:rFonts w:eastAsia="맑은 고딕" w:cstheme="minorHAnsi" w:hint="eastAsia"/>
+        </w:rPr>
+        <w:t>)</w:t>
+      </w:r>
+    </w:p>
+    <w:p>
+      <w:pPr>
         <w:rPr>
           <w:rFonts w:eastAsia="맑은 고딕" w:cstheme="minorHAnsi"/>
         </w:rPr>
-        <w:lastRenderedPageBreak/>
-        <w:t>2024.</w:t>
-      </w:r>
-      <w:r>
-        <w:rPr>
-          <w:rFonts w:eastAsia="맑은 고딕" w:cstheme="minorHAnsi" w:hint="eastAsia"/>
-        </w:rPr>
-        <w:t>)</w:t>
-      </w:r>
-    </w:p>
-    <w:p>
-      <w:pPr>
-        <w:rPr>
-          <w:rFonts w:eastAsia="맑은 고딕" w:cstheme="minorHAnsi"/>
-        </w:rPr>
-      </w:pPr>
-      <w:hyperlink r:id="rId19" w:history="1">
+      </w:pPr>
+      <w:hyperlink r:id="rId20" w:history="1">
         <w:r>
           <w:rPr>
             <w:rStyle w:val="aa"/>
@@ -2703,7 +2863,7 @@
           <w:rFonts w:eastAsia="맑은 고딕" w:cstheme="minorHAnsi"/>
         </w:rPr>
       </w:pPr>
-      <w:hyperlink r:id="rId20" w:history="1">
+      <w:hyperlink r:id="rId21" w:history="1">
         <w:r>
           <w:rPr>
             <w:rStyle w:val="aa"/>
@@ -2737,7 +2897,7 @@
           <w:rFonts w:eastAsia="맑은 고딕" w:cstheme="minorHAnsi"/>
         </w:rPr>
       </w:pPr>
-      <w:hyperlink r:id="rId21" w:history="1">
+      <w:hyperlink r:id="rId22" w:history="1">
         <w:r>
           <w:rPr>
             <w:rStyle w:val="aa"/>
@@ -2756,10 +2916,10 @@
     <w:p>
       <w:pPr>
         <w:rPr>
-          <w:rFonts w:eastAsia="맑은 고딕" w:cstheme="minorHAnsi"/>
-        </w:rPr>
-      </w:pPr>
-      <w:hyperlink r:id="rId22" w:history="1">
+          <w:rFonts w:eastAsia="맑은 고딕" w:cstheme="minorHAnsi" w:hint="eastAsia"/>
+        </w:rPr>
+      </w:pPr>
+      <w:hyperlink r:id="rId23" w:history="1">
         <w:r>
           <w:rPr>
             <w:rStyle w:val="aa"/>
@@ -2776,44 +2936,66 @@
       </w:r>
     </w:p>
     <w:p>
-      <w:pPr>
-        <w:rPr>
-          <w:lang w:val="en-IE"/>
-        </w:rPr>
-      </w:pPr>
-    </w:p>
-    <w:p>
-      <w:pPr>
-        <w:rPr>
-          <w:lang w:val="en-IE"/>
-        </w:rPr>
-      </w:pPr>
-    </w:p>
-    <w:p>
-      <w:pPr>
-        <w:rPr>
-          <w:rFonts w:hint="eastAsia"/>
-        </w:rPr>
-      </w:pPr>
-    </w:p>
-    <w:p>
-      <w:hyperlink r:id="rId23" w:history="1">
-        <w:r>
-          <w:rPr>
-            <w:rStyle w:val="aa"/>
-          </w:rPr>
-          <w:t>https://shop.solar-kit.eu/en/blog/post/solar-pv-meaning-capacity-and-net-present-value-explained-clearly</w:t>
-        </w:r>
-      </w:hyperlink>
-    </w:p>
-    <w:p/>
-    <w:p>
       <w:hyperlink r:id="rId24" w:history="1">
         <w:r>
           <w:rPr>
             <w:rStyle w:val="aa"/>
           </w:rPr>
-          <w:t>https://qbitsenergy.com/glossary/npv/</w:t>
+          <w:t>https://sh</w:t>
+        </w:r>
+        <w:r>
+          <w:rPr>
+            <w:rStyle w:val="aa"/>
+          </w:rPr>
+          <w:t>o</w:t>
+        </w:r>
+        <w:r>
+          <w:rPr>
+            <w:rStyle w:val="aa"/>
+          </w:rPr>
+          <w:t>p.solar-kit.eu/en/blog/post/solar-pv-meaning-capacity-and-net-present-value-explained-clearly</w:t>
+        </w:r>
+      </w:hyperlink>
+    </w:p>
+    <w:p>
+      <w:hyperlink r:id="rId25" w:history="1">
+        <w:r>
+          <w:rPr>
+            <w:rStyle w:val="aa"/>
+          </w:rPr>
+          <w:t>https://qbits</w:t>
+        </w:r>
+        <w:r>
+          <w:rPr>
+            <w:rStyle w:val="aa"/>
+          </w:rPr>
+          <w:t>e</w:t>
+        </w:r>
+        <w:r>
+          <w:rPr>
+            <w:rStyle w:val="aa"/>
+          </w:rPr>
+          <w:t>nergy.com/glossary/npv/</w:t>
+        </w:r>
+      </w:hyperlink>
+    </w:p>
+    <w:p>
+      <w:hyperlink r:id="rId26" w:history="1">
+        <w:r>
+          <w:rPr>
+            <w:rStyle w:val="aa"/>
+          </w:rPr>
+          <w:t>https://ndber.seai.ie/BERResearchTool/ber/search.aspx?utm_source</w:t>
+        </w:r>
+      </w:hyperlink>
+    </w:p>
+    <w:p>
+      <w:hyperlink r:id="rId27" w:history="1">
+        <w:r>
+          <w:rPr>
+            <w:rStyle w:val="aa"/>
+          </w:rPr>
+          <w:t>https://photovoltaic-geographic-information-system.ec.europa.eu/en</w:t>
         </w:r>
       </w:hyperlink>
     </w:p>
@@ -2833,6 +3015,8 @@
     <w:p/>
     <w:p/>
     <w:p/>
+    <w:p/>
+    <w:p/>
     <w:p>
       <w:pPr>
         <w:pBdr>
@@ -2899,20 +3083,20 @@
         <w:rPr>
           <w:color w:val="FF0000"/>
         </w:rPr>
+        <w:t>The appendix serves as a repository for additional or supplementary information that is deemed too extensive or detailed for integration into the main body of the text. This supplementary content can encompass data tables, charts, graphs, questionnaires, or any other supporting materials that contribute to a comprehensive understanding of the research.</w:t>
+      </w:r>
+    </w:p>
+    <w:p>
+      <w:pPr>
+        <w:rPr>
+          <w:color w:val="FF0000"/>
+        </w:rPr>
+      </w:pPr>
+      <w:r>
+        <w:rPr>
+          <w:color w:val="FF0000"/>
+        </w:rPr>
         <w:lastRenderedPageBreak/>
-        <w:t>The appendix serves as a repository for additional or supplementary information that is deemed too extensive or detailed for integration into the main body of the text. This supplementary content can encompass data tables, charts, graphs, questionnaires, or any other supporting materials that contribute to a comprehensive understanding of the research.</w:t>
-      </w:r>
-    </w:p>
-    <w:p>
-      <w:pPr>
-        <w:rPr>
-          <w:color w:val="FF0000"/>
-        </w:rPr>
-      </w:pPr>
-      <w:r>
-        <w:rPr>
-          <w:color w:val="FF0000"/>
-        </w:rPr>
         <w:t>If you haven't used AI tools and there's no need for supplementary data, you can remove the appendix section entirely.</w:t>
       </w:r>
     </w:p>
@@ -5001,6 +5185,18 @@
       <w:bCs/>
     </w:rPr>
   </w:style>
+  <w:style w:type="character" w:styleId="af1">
+    <w:name w:val="FollowedHyperlink"/>
+    <w:basedOn w:val="a0"/>
+    <w:uiPriority w:val="99"/>
+    <w:semiHidden/>
+    <w:unhideWhenUsed/>
+    <w:rsid w:val="00BF5D95"/>
+    <w:rPr>
+      <w:color w:val="96607D" w:themeColor="followedHyperlink"/>
+      <w:u w:val="single"/>
+    </w:rPr>
+  </w:style>
 </w:styles>
 </file>
 

</xml_diff>

<commit_message>
Ethical and Legal Consideration
</commit_message>
<xml_diff>
--- a/sumi heo (2026324). strategic thinking ca1.docx
+++ b/sumi heo (2026324). strategic thinking ca1.docx
@@ -878,27 +878,7 @@
           <w:sz w:val="28"/>
           <w:szCs w:val="28"/>
         </w:rPr>
-        <w:t xml:space="preserve">getting additional </w:t>
-      </w:r>
-      <w:proofErr w:type="gramStart"/>
-      <w:r>
-        <w:rPr>
-          <w:rFonts w:hint="eastAsia"/>
-          <w:b/>
-          <w:sz w:val="28"/>
-          <w:szCs w:val="28"/>
-        </w:rPr>
-        <w:t>idea</w:t>
-      </w:r>
-      <w:proofErr w:type="gramEnd"/>
-      <w:r>
-        <w:rPr>
-          <w:rFonts w:hint="eastAsia"/>
-          <w:b/>
-          <w:sz w:val="28"/>
-          <w:szCs w:val="28"/>
-        </w:rPr>
-        <w:t xml:space="preserve"> for my project.</w:t>
+        <w:t>getting additional idea for my project.</w:t>
       </w:r>
     </w:p>
     <w:p>
@@ -982,23 +962,7 @@
                                 <w:color w:val="000000"/>
                                 <w:sz w:val="28"/>
                               </w:rPr>
-                              <w:t xml:space="preserve">By submitting this assessment, I confirm that I have read the CCT policy on academic misconduct and understand the implications of submitting work that is not my own or does not appropriately reference material </w:t>
-                            </w:r>
-                            <w:proofErr w:type="gramStart"/>
-                            <w:r>
-                              <w:rPr>
-                                <w:color w:val="000000"/>
-                                <w:sz w:val="28"/>
-                              </w:rPr>
-                              <w:t>taken</w:t>
-                            </w:r>
-                            <w:proofErr w:type="gramEnd"/>
-                            <w:r>
-                              <w:rPr>
-                                <w:color w:val="000000"/>
-                                <w:sz w:val="28"/>
-                              </w:rPr>
-                              <w:t xml:space="preserve"> from a third party or other source. </w:t>
+                              <w:t xml:space="preserve">By submitting this assessment, I confirm that I have read the CCT policy on academic misconduct and understand the implications of submitting work that is not my own or does not appropriately reference material taken from a third party or other source. </w:t>
                             </w:r>
                           </w:p>
                           <w:p>
@@ -1024,23 +988,7 @@
                                 <w:color w:val="000000"/>
                                 <w:sz w:val="28"/>
                               </w:rPr>
-                              <w:t xml:space="preserve"> I further confirm that this work has not previously been submitted for assessment by myself or someone else </w:t>
-                            </w:r>
-                            <w:proofErr w:type="gramStart"/>
-                            <w:r>
-                              <w:rPr>
-                                <w:color w:val="000000"/>
-                                <w:sz w:val="28"/>
-                              </w:rPr>
-                              <w:t>in</w:t>
-                            </w:r>
-                            <w:proofErr w:type="gramEnd"/>
-                            <w:r>
-                              <w:rPr>
-                                <w:color w:val="000000"/>
-                                <w:sz w:val="28"/>
-                              </w:rPr>
-                              <w:t xml:space="preserve"> CCT College Dublin or any other higher education institution.</w:t>
+                              <w:t xml:space="preserve"> I further confirm that this work has not previously been submitted for assessment by myself or someone else in CCT College Dublin or any other higher education institution.</w:t>
                             </w:r>
                           </w:p>
                         </w:txbxContent>
@@ -1084,23 +1032,7 @@
                           <w:color w:val="000000"/>
                           <w:sz w:val="28"/>
                         </w:rPr>
-                        <w:t xml:space="preserve">By submitting this assessment, I confirm that I have read the CCT policy on academic misconduct and understand the implications of submitting work that is not my own or does not appropriately reference material </w:t>
-                      </w:r>
-                      <w:proofErr w:type="gramStart"/>
-                      <w:r>
-                        <w:rPr>
-                          <w:color w:val="000000"/>
-                          <w:sz w:val="28"/>
-                        </w:rPr>
-                        <w:t>taken</w:t>
-                      </w:r>
-                      <w:proofErr w:type="gramEnd"/>
-                      <w:r>
-                        <w:rPr>
-                          <w:color w:val="000000"/>
-                          <w:sz w:val="28"/>
-                        </w:rPr>
-                        <w:t xml:space="preserve"> from a third party or other source. </w:t>
+                        <w:t xml:space="preserve">By submitting this assessment, I confirm that I have read the CCT policy on academic misconduct and understand the implications of submitting work that is not my own or does not appropriately reference material taken from a third party or other source. </w:t>
                       </w:r>
                     </w:p>
                     <w:p>
@@ -1126,23 +1058,7 @@
                           <w:color w:val="000000"/>
                           <w:sz w:val="28"/>
                         </w:rPr>
-                        <w:t xml:space="preserve"> I further confirm that this work has not previously been submitted for assessment by myself or someone else </w:t>
-                      </w:r>
-                      <w:proofErr w:type="gramStart"/>
-                      <w:r>
-                        <w:rPr>
-                          <w:color w:val="000000"/>
-                          <w:sz w:val="28"/>
-                        </w:rPr>
-                        <w:t>in</w:t>
-                      </w:r>
-                      <w:proofErr w:type="gramEnd"/>
-                      <w:r>
-                        <w:rPr>
-                          <w:color w:val="000000"/>
-                          <w:sz w:val="28"/>
-                        </w:rPr>
-                        <w:t xml:space="preserve"> CCT College Dublin or any other higher education institution.</w:t>
+                        <w:t xml:space="preserve"> I further confirm that this work has not previously been submitted for assessment by myself or someone else in CCT College Dublin or any other higher education institution.</w:t>
                       </w:r>
                     </w:p>
                   </w:txbxContent>
@@ -1345,7 +1261,7 @@
             <w:spacing w:after="100"/>
             <w:ind w:left="220"/>
             <w:rPr>
-              <w:rFonts w:ascii="Aptos" w:hAnsi="Aptos" w:cs="Aptos" w:hint="eastAsia"/>
+              <w:rFonts w:ascii="Aptos" w:hAnsi="Aptos" w:cs="Aptos"/>
               <w:color w:val="000000"/>
               <w:sz w:val="24"/>
               <w:szCs w:val="24"/>
@@ -1707,7 +1623,7 @@
             <w:spacing w:after="100"/>
             <w:ind w:left="220"/>
             <w:rPr>
-              <w:rFonts w:ascii="Aptos" w:hAnsi="Aptos" w:cs="Aptos" w:hint="eastAsia"/>
+              <w:rFonts w:ascii="Aptos" w:hAnsi="Aptos" w:cs="Aptos"/>
               <w:color w:val="000000"/>
               <w:sz w:val="24"/>
               <w:szCs w:val="24"/>
@@ -1851,39 +1767,12 @@
               <w:tab w:val="right" w:leader="dot" w:pos="9016"/>
             </w:tabs>
             <w:spacing w:after="100"/>
-            <w:rPr>
-              <w:rFonts w:hint="eastAsia"/>
-            </w:rPr>
           </w:pPr>
           <w:r>
             <w:rPr>
               <w:rFonts w:hint="eastAsia"/>
             </w:rPr>
-            <w:t xml:space="preserve">   </w:t>
-          </w:r>
-          <w:r>
-            <w:rPr>
-              <w:rFonts w:hint="eastAsia"/>
-            </w:rPr>
-            <w:t>11-</w:t>
-          </w:r>
-          <w:r>
-            <w:rPr>
-              <w:rFonts w:hint="eastAsia"/>
-            </w:rPr>
-            <w:t>2</w:t>
-          </w:r>
-          <w:r>
-            <w:rPr>
-              <w:rFonts w:hint="eastAsia"/>
-            </w:rPr>
-            <w:t xml:space="preserve">. </w:t>
-          </w:r>
-          <w:r>
-            <w:rPr>
-              <w:rFonts w:hint="eastAsia"/>
-            </w:rPr>
-            <w:t>AI</w:t>
+            <w:t xml:space="preserve">   11-2. AI</w:t>
           </w:r>
           <w:r>
             <w:tab/>
@@ -1960,9 +1849,6 @@
       <w:pPr>
         <w:pStyle w:val="1"/>
         <w:spacing w:after="0"/>
-        <w:rPr>
-          <w:rFonts w:hint="eastAsia"/>
-        </w:rPr>
       </w:pPr>
       <w:r>
         <w:rPr>
@@ -2000,117 +1886,6 @@
           <w:rFonts w:hint="eastAsia"/>
         </w:rPr>
         <w:t xml:space="preserve"> installing solar PV in Ireland?</w:t>
-      </w:r>
-    </w:p>
-    <w:p>
-      <w:pPr>
-        <w:rPr>
-          <w:rFonts w:hint="eastAsia"/>
-        </w:rPr>
-      </w:pPr>
-    </w:p>
-    <w:p/>
-    <w:p>
-      <w:pPr>
-        <w:pStyle w:val="1"/>
-        <w:spacing w:after="0"/>
-      </w:pPr>
-      <w:r>
-        <w:t>Introduction</w:t>
-      </w:r>
-    </w:p>
-    <w:p>
-      <w:pPr>
-        <w:rPr>
-          <w:rFonts w:hint="eastAsia"/>
-        </w:rPr>
-      </w:pPr>
-      <w:r>
-        <w:t xml:space="preserve">This project focuses on creating a data-driven decision-support tool to help determine whether installing solar </w:t>
-      </w:r>
-      <w:r>
-        <w:t>panels</w:t>
-      </w:r>
-      <w:r>
-        <w:t xml:space="preserve"> (</w:t>
-      </w:r>
-      <w:r>
-        <w:rPr>
-          <w:rFonts w:hint="eastAsia"/>
-        </w:rPr>
-        <w:t>PV)</w:t>
-      </w:r>
-      <w:r>
-        <w:t xml:space="preserve"> is economically </w:t>
-      </w:r>
-      <w:r>
-        <w:rPr>
-          <w:rFonts w:hint="eastAsia"/>
-        </w:rPr>
-        <w:t>valuable</w:t>
-      </w:r>
-      <w:r>
-        <w:t xml:space="preserve"> for </w:t>
-      </w:r>
-      <w:r>
-        <w:rPr>
-          <w:rFonts w:hint="eastAsia"/>
-        </w:rPr>
-        <w:t>houses in Ireland</w:t>
-      </w:r>
-      <w:r>
-        <w:t>. As energy costs</w:t>
-      </w:r>
-      <w:r>
-        <w:rPr>
-          <w:rFonts w:hint="eastAsia"/>
-        </w:rPr>
-        <w:t xml:space="preserve">, such as electricity </w:t>
-      </w:r>
-      <w:r>
-        <w:t>bills</w:t>
-      </w:r>
-      <w:r>
-        <w:rPr>
-          <w:rFonts w:hint="eastAsia"/>
-        </w:rPr>
-        <w:t>, increase</w:t>
-      </w:r>
-      <w:r>
-        <w:t>, interest in renewable energy is growing</w:t>
-      </w:r>
-      <w:r>
-        <w:rPr>
-          <w:rFonts w:hint="eastAsia"/>
-        </w:rPr>
-        <w:t>. It is</w:t>
-      </w:r>
-      <w:r>
-        <w:t xml:space="preserve"> leading to increased demand for solar panel installations. </w:t>
-      </w:r>
-      <w:r>
-        <w:rPr>
-          <w:rFonts w:hint="eastAsia"/>
-        </w:rPr>
-        <w:t xml:space="preserve">From that perspective, this project will provide personalized recommendations that are </w:t>
-      </w:r>
-      <w:r>
-        <w:t>easy</w:t>
-      </w:r>
-      <w:r>
-        <w:rPr>
-          <w:rFonts w:hint="eastAsia"/>
-        </w:rPr>
-        <w:t xml:space="preserve"> to understand for people considering solar panel installation, moving </w:t>
-      </w:r>
-      <w:r>
-        <w:t>beyond</w:t>
-      </w:r>
-      <w:r>
-        <w:rPr>
-          <w:rFonts w:hint="eastAsia"/>
-        </w:rPr>
-        <w:t xml:space="preserve"> the binary logic of installation costs or cost savings.</w:t>
       </w:r>
     </w:p>
     <w:p/>
@@ -2121,18 +1896,104 @@
         <w:spacing w:after="0"/>
       </w:pPr>
       <w:r>
-        <w:rPr>
-          <w:rFonts w:hint="eastAsia"/>
-        </w:rPr>
-        <w:t>Problem Definition</w:t>
+        <w:t>Introduction</w:t>
       </w:r>
     </w:p>
     <w:p>
-      <w:pPr>
-        <w:pStyle w:val="2"/>
-        <w:rPr>
-          <w:rFonts w:hint="eastAsia"/>
-        </w:rPr>
+      <w:r>
+        <w:t xml:space="preserve">This project focuses on creating a data-driven decision-support tool to help determine whether installing solar </w:t>
+      </w:r>
+      <w:r>
+        <w:t>panels</w:t>
+      </w:r>
+      <w:r>
+        <w:t xml:space="preserve"> (</w:t>
+      </w:r>
+      <w:r>
+        <w:rPr>
+          <w:rFonts w:hint="eastAsia"/>
+        </w:rPr>
+        <w:t>PV)</w:t>
+      </w:r>
+      <w:r>
+        <w:t xml:space="preserve"> is economically </w:t>
+      </w:r>
+      <w:r>
+        <w:rPr>
+          <w:rFonts w:hint="eastAsia"/>
+        </w:rPr>
+        <w:t>valuable</w:t>
+      </w:r>
+      <w:r>
+        <w:t xml:space="preserve"> for </w:t>
+      </w:r>
+      <w:r>
+        <w:rPr>
+          <w:rFonts w:hint="eastAsia"/>
+        </w:rPr>
+        <w:t>houses in Ireland</w:t>
+      </w:r>
+      <w:r>
+        <w:t>. As energy costs</w:t>
+      </w:r>
+      <w:r>
+        <w:rPr>
+          <w:rFonts w:hint="eastAsia"/>
+        </w:rPr>
+        <w:t xml:space="preserve">, such as electricity </w:t>
+      </w:r>
+      <w:r>
+        <w:t>bills</w:t>
+      </w:r>
+      <w:r>
+        <w:rPr>
+          <w:rFonts w:hint="eastAsia"/>
+        </w:rPr>
+        <w:t>, increase</w:t>
+      </w:r>
+      <w:r>
+        <w:t>, interest in renewable energy is growing</w:t>
+      </w:r>
+      <w:r>
+        <w:rPr>
+          <w:rFonts w:hint="eastAsia"/>
+        </w:rPr>
+        <w:t>. It is</w:t>
+      </w:r>
+      <w:r>
+        <w:t xml:space="preserve"> leading to increased demand for solar panel installations. </w:t>
+      </w:r>
+      <w:r>
+        <w:rPr>
+          <w:rFonts w:hint="eastAsia"/>
+        </w:rPr>
+        <w:t xml:space="preserve">From that perspective, this project will provide personalized recommendations that are </w:t>
+      </w:r>
+      <w:r>
+        <w:t>easy</w:t>
+      </w:r>
+      <w:r>
+        <w:rPr>
+          <w:rFonts w:hint="eastAsia"/>
+        </w:rPr>
+        <w:t xml:space="preserve"> to understand for people considering solar panel installation, moving </w:t>
+      </w:r>
+      <w:r>
+        <w:t>beyond</w:t>
+      </w:r>
+      <w:r>
+        <w:rPr>
+          <w:rFonts w:hint="eastAsia"/>
+        </w:rPr>
+        <w:t xml:space="preserve"> the binary logic of installation costs or cost savings.</w:t>
+      </w:r>
+    </w:p>
+    <w:p/>
+    <w:p/>
+    <w:p>
+      <w:pPr>
+        <w:pStyle w:val="1"/>
+        <w:spacing w:after="0"/>
       </w:pPr>
       <w:r>
         <w:rPr>
@@ -2143,10 +2004,16 @@
     </w:p>
     <w:p>
       <w:pPr>
-        <w:rPr>
-          <w:rFonts w:hint="eastAsia"/>
-        </w:rPr>
-      </w:pPr>
+        <w:pStyle w:val="2"/>
+      </w:pPr>
+      <w:r>
+        <w:rPr>
+          <w:rFonts w:hint="eastAsia"/>
+        </w:rPr>
+        <w:t>Problem Definition</w:t>
+      </w:r>
+    </w:p>
+    <w:p>
       <w:r>
         <w:t xml:space="preserve">In other words, </w:t>
       </w:r>
@@ -2405,9 +2272,6 @@
     <w:p>
       <w:pPr>
         <w:pStyle w:val="2"/>
-        <w:rPr>
-          <w:rFonts w:hint="eastAsia"/>
-        </w:rPr>
       </w:pPr>
       <w:r>
         <w:rPr>
@@ -2419,7 +2283,7 @@
     <w:p>
       <w:pPr>
         <w:rPr>
-          <w:rFonts w:eastAsia="맑은 고딕" w:cstheme="minorHAnsi" w:hint="eastAsia"/>
+          <w:rFonts w:eastAsia="맑은 고딕" w:cstheme="minorHAnsi"/>
         </w:rPr>
       </w:pPr>
       <w:hyperlink r:id="rId11" w:history="1">
@@ -2456,21 +2320,7 @@
             <w:rStyle w:val="aa"/>
             <w:rFonts w:eastAsia="맑은 고딕" w:cstheme="minorHAnsi"/>
           </w:rPr>
-          <w:t>https://www.seai.ie/data-and-insight</w:t>
-        </w:r>
-        <w:r>
-          <w:rPr>
-            <w:rStyle w:val="aa"/>
-            <w:rFonts w:eastAsia="맑은 고딕" w:cstheme="minorHAnsi"/>
-          </w:rPr>
-          <w:t>s</w:t>
-        </w:r>
-        <w:r>
-          <w:rPr>
-            <w:rStyle w:val="aa"/>
-            <w:rFonts w:eastAsia="맑은 고딕" w:cstheme="minorHAnsi"/>
-          </w:rPr>
-          <w:t>/seai-statistics/key-publications/energy-in-ireland?trk=article-ssr-frontend-pulse_little-text-block&amp;utm_source</w:t>
+          <w:t>https://www.seai.ie/data-and-insights/seai-statistics/key-publications/energy-in-ireland?trk=article-ssr-frontend-pulse_little-text-block&amp;utm_source</w:t>
         </w:r>
       </w:hyperlink>
       <w:r>
@@ -2516,21 +2366,7 @@
             <w:rStyle w:val="aa"/>
             <w:rFonts w:eastAsia="맑은 고딕" w:cstheme="minorHAnsi"/>
           </w:rPr>
-          <w:t>https://www.met.ie/cms/</w:t>
-        </w:r>
-        <w:r>
-          <w:rPr>
-            <w:rStyle w:val="aa"/>
-            <w:rFonts w:eastAsia="맑은 고딕" w:cstheme="minorHAnsi"/>
-          </w:rPr>
-          <w:t>a</w:t>
-        </w:r>
-        <w:r>
-          <w:rPr>
-            <w:rStyle w:val="aa"/>
-            <w:rFonts w:eastAsia="맑은 고딕" w:cstheme="minorHAnsi"/>
-          </w:rPr>
-          <w:t>ssets/uploads/2023/07/Irelands-Climate-Averages-1991_2020.pdf?utm_source</w:t>
+          <w:t>https://www.met.ie/cms/assets/uploads/2023/07/Irelands-Climate-Averages-1991_2020.pdf?utm_source</w:t>
         </w:r>
       </w:hyperlink>
       <w:r>
@@ -2555,7 +2391,7 @@
     <w:p>
       <w:pPr>
         <w:rPr>
-          <w:rFonts w:eastAsia="맑은 고딕" w:cstheme="minorHAnsi" w:hint="eastAsia"/>
+          <w:rFonts w:eastAsia="맑은 고딕" w:cstheme="minorHAnsi"/>
         </w:rPr>
       </w:pPr>
       <w:hyperlink r:id="rId14" w:history="1">
@@ -2661,12 +2497,18 @@
         <w:t>Aim and Objectives</w:t>
       </w:r>
     </w:p>
+    <w:p/>
     <w:p>
       <w:pPr>
-        <w:rPr>
-          <w:rFonts w:hint="eastAsia"/>
-        </w:rPr>
-      </w:pPr>
+        <w:pStyle w:val="1"/>
+      </w:pPr>
+      <w:r>
+        <w:rPr>
+          <w:rFonts w:hint="eastAsia"/>
+        </w:rPr>
+        <w:lastRenderedPageBreak/>
+        <w:t>Scope</w:t>
+      </w:r>
     </w:p>
     <w:p>
       <w:pPr>
@@ -2676,8 +2518,7 @@
         <w:rPr>
           <w:rFonts w:hint="eastAsia"/>
         </w:rPr>
-        <w:lastRenderedPageBreak/>
-        <w:t>Scope</w:t>
+        <w:t>Methodology</w:t>
       </w:r>
     </w:p>
     <w:p>
@@ -2688,82 +2529,61 @@
         <w:rPr>
           <w:rFonts w:hint="eastAsia"/>
         </w:rPr>
-        <w:t>Methodology</w:t>
+        <w:t>Data Sources</w:t>
       </w:r>
     </w:p>
     <w:p>
-      <w:pPr>
-        <w:pStyle w:val="1"/>
-      </w:pPr>
-      <w:r>
-        <w:rPr>
-          <w:rFonts w:hint="eastAsia"/>
-        </w:rPr>
-        <w:t>Data Sources</w:t>
+      <w:r>
+        <w:rPr>
+          <w:b/>
+          <w:bCs/>
+        </w:rPr>
+        <w:t>SEAI National BER Research Tool</w:t>
+      </w:r>
+      <w:r>
+        <w:t>:</w:t>
+      </w:r>
+      <w:r>
+        <w:rPr>
+          <w:rFonts w:hint="eastAsia"/>
+        </w:rPr>
+        <w:t xml:space="preserve"> </w:t>
+      </w:r>
+      <w:r>
+        <w:rPr>
+          <w:rFonts w:hint="eastAsia"/>
+        </w:rPr>
+        <w:t xml:space="preserve">Main dataset which includes important data such as BER rating, County name, Date of assessment, year of construction, etc. </w:t>
+      </w:r>
+      <w:r>
+        <w:t>However,</w:t>
+      </w:r>
+      <w:r>
+        <w:rPr>
+          <w:rFonts w:hint="eastAsia"/>
+        </w:rPr>
+        <w:t xml:space="preserve"> it contains more than 1 million rows and over 100 columns. It would </w:t>
+      </w:r>
+      <w:r>
+        <w:t>make it</w:t>
+      </w:r>
+      <w:r>
+        <w:rPr>
+          <w:rFonts w:hint="eastAsia"/>
+        </w:rPr>
+        <w:t xml:space="preserve"> hard </w:t>
+      </w:r>
+      <w:r>
+        <w:t>to analyze</w:t>
+      </w:r>
+      <w:r>
+        <w:rPr>
+          <w:rFonts w:hint="eastAsia"/>
+        </w:rPr>
+        <w:t>, so I extracted most recent data from 2022- 2024 which is over 270,000 data.</w:t>
       </w:r>
     </w:p>
     <w:p>
-      <w:pPr>
-        <w:rPr>
-          <w:rFonts w:hint="eastAsia"/>
-        </w:rPr>
-      </w:pPr>
-      <w:r>
-        <w:rPr>
-          <w:b/>
-          <w:bCs/>
-        </w:rPr>
-        <w:t>SEAI National BER Research Tool</w:t>
-      </w:r>
-      <w:r>
-        <w:t>:</w:t>
-      </w:r>
-      <w:r>
-        <w:rPr>
-          <w:rFonts w:hint="eastAsia"/>
-        </w:rPr>
-        <w:t xml:space="preserve"> </w:t>
-      </w:r>
-      <w:r>
-        <w:rPr>
-          <w:rFonts w:hint="eastAsia"/>
-        </w:rPr>
-        <w:t xml:space="preserve">Main dataset which includes important data such as BER rating, County name, Date of assessment, year of construction, etc. </w:t>
-      </w:r>
-      <w:r>
-        <w:t>However,</w:t>
-      </w:r>
-      <w:r>
-        <w:rPr>
-          <w:rFonts w:hint="eastAsia"/>
-        </w:rPr>
-        <w:t xml:space="preserve"> it contains more than 1 million rows and over 100 columns. It would </w:t>
-      </w:r>
-      <w:r>
-        <w:t>make it</w:t>
-      </w:r>
-      <w:r>
-        <w:rPr>
-          <w:rFonts w:hint="eastAsia"/>
-        </w:rPr>
-        <w:t xml:space="preserve"> hard </w:t>
-      </w:r>
-      <w:r>
-        <w:t>to analyze</w:t>
-      </w:r>
-      <w:r>
-        <w:rPr>
-          <w:rFonts w:hint="eastAsia"/>
-        </w:rPr>
-        <w:t>, so I extracted most recent data from 2022- 2024 which is over 270,000 data.</w:t>
-      </w:r>
-    </w:p>
-    <w:p>
-      <w:pPr>
-        <w:rPr>
-          <w:rFonts w:hint="eastAsia"/>
-        </w:rPr>
-      </w:pPr>
       <w:r>
         <w:rPr>
           <w:b/>
@@ -2880,11 +2700,6 @@
             <w:tcW w:w="4957" w:type="dxa"/>
           </w:tcPr>
           <w:p>
-            <w:pPr>
-              <w:rPr>
-                <w:rFonts w:hint="eastAsia"/>
-              </w:rPr>
-            </w:pPr>
             <w:r>
               <w:rPr>
                 <w:rFonts w:hint="eastAsia"/>
@@ -2898,11 +2713,6 @@
             <w:tcW w:w="4059" w:type="dxa"/>
           </w:tcPr>
           <w:p>
-            <w:pPr>
-              <w:rPr>
-                <w:rFonts w:hint="eastAsia"/>
-              </w:rPr>
-            </w:pPr>
             <w:r>
               <w:rPr>
                 <w:rFonts w:hint="eastAsia"/>
@@ -2918,11 +2728,6 @@
             <w:tcW w:w="4957" w:type="dxa"/>
           </w:tcPr>
           <w:p>
-            <w:pPr>
-              <w:rPr>
-                <w:rFonts w:hint="eastAsia"/>
-              </w:rPr>
-            </w:pPr>
             <w:r>
               <w:rPr>
                 <w:rFonts w:hint="eastAsia"/>
@@ -2936,11 +2741,6 @@
             <w:tcW w:w="4059" w:type="dxa"/>
           </w:tcPr>
           <w:p>
-            <w:pPr>
-              <w:rPr>
-                <w:rFonts w:hint="eastAsia"/>
-              </w:rPr>
-            </w:pPr>
             <w:r>
               <w:rPr>
                 <w:rFonts w:hint="eastAsia"/>
@@ -2965,11 +2765,6 @@
             <w:tcW w:w="4957" w:type="dxa"/>
           </w:tcPr>
           <w:p>
-            <w:pPr>
-              <w:rPr>
-                <w:rFonts w:hint="eastAsia"/>
-              </w:rPr>
-            </w:pPr>
             <w:r>
               <w:rPr>
                 <w:rFonts w:hint="eastAsia"/>
@@ -2983,11 +2778,6 @@
             <w:tcW w:w="4059" w:type="dxa"/>
           </w:tcPr>
           <w:p>
-            <w:pPr>
-              <w:rPr>
-                <w:rFonts w:hint="eastAsia"/>
-              </w:rPr>
-            </w:pPr>
             <w:r>
               <w:rPr>
                 <w:rFonts w:hint="eastAsia"/>
@@ -3012,11 +2802,6 @@
             <w:tcW w:w="4957" w:type="dxa"/>
           </w:tcPr>
           <w:p>
-            <w:pPr>
-              <w:rPr>
-                <w:rFonts w:hint="eastAsia"/>
-              </w:rPr>
-            </w:pPr>
             <w:r>
               <w:rPr>
                 <w:rFonts w:hint="eastAsia"/>
@@ -3051,11 +2836,6 @@
             <w:tcW w:w="4059" w:type="dxa"/>
           </w:tcPr>
           <w:p>
-            <w:pPr>
-              <w:rPr>
-                <w:rFonts w:hint="eastAsia"/>
-              </w:rPr>
-            </w:pPr>
             <w:r>
               <w:rPr>
                 <w:rFonts w:hint="eastAsia"/>
@@ -3080,11 +2860,6 @@
             <w:tcW w:w="4957" w:type="dxa"/>
           </w:tcPr>
           <w:p>
-            <w:pPr>
-              <w:rPr>
-                <w:rFonts w:hint="eastAsia"/>
-              </w:rPr>
-            </w:pPr>
             <w:r>
               <w:rPr>
                 <w:rFonts w:hint="eastAsia"/>
@@ -3101,11 +2876,6 @@
             <w:tcW w:w="4059" w:type="dxa"/>
           </w:tcPr>
           <w:p>
-            <w:pPr>
-              <w:rPr>
-                <w:rFonts w:hint="eastAsia"/>
-              </w:rPr>
-            </w:pPr>
             <w:r>
               <w:rPr>
                 <w:rFonts w:hint="eastAsia"/>
@@ -3130,11 +2900,6 @@
             <w:tcW w:w="4957" w:type="dxa"/>
           </w:tcPr>
           <w:p>
-            <w:pPr>
-              <w:rPr>
-                <w:rFonts w:hint="eastAsia"/>
-              </w:rPr>
-            </w:pPr>
             <w:r>
               <w:rPr>
                 <w:rFonts w:hint="eastAsia"/>
@@ -3148,11 +2913,6 @@
             <w:tcW w:w="4059" w:type="dxa"/>
           </w:tcPr>
           <w:p>
-            <w:pPr>
-              <w:rPr>
-                <w:rFonts w:hint="eastAsia"/>
-              </w:rPr>
-            </w:pPr>
             <w:r>
               <w:rPr>
                 <w:rFonts w:hint="eastAsia"/>
@@ -3177,11 +2937,6 @@
             <w:tcW w:w="4957" w:type="dxa"/>
           </w:tcPr>
           <w:p>
-            <w:pPr>
-              <w:rPr>
-                <w:rFonts w:hint="eastAsia"/>
-              </w:rPr>
-            </w:pPr>
             <w:r>
               <w:rPr>
                 <w:rFonts w:hint="eastAsia"/>
@@ -3198,11 +2953,6 @@
             <w:tcW w:w="4059" w:type="dxa"/>
           </w:tcPr>
           <w:p>
-            <w:pPr>
-              <w:rPr>
-                <w:rFonts w:hint="eastAsia"/>
-              </w:rPr>
-            </w:pPr>
             <w:r>
               <w:rPr>
                 <w:rFonts w:hint="eastAsia"/>
@@ -3227,11 +2977,6 @@
             <w:tcW w:w="4957" w:type="dxa"/>
           </w:tcPr>
           <w:p>
-            <w:pPr>
-              <w:rPr>
-                <w:rFonts w:hint="eastAsia"/>
-              </w:rPr>
-            </w:pPr>
             <w:r>
               <w:rPr>
                 <w:rFonts w:hint="eastAsia"/>
@@ -3245,11 +2990,6 @@
             <w:tcW w:w="4059" w:type="dxa"/>
           </w:tcPr>
           <w:p>
-            <w:pPr>
-              <w:rPr>
-                <w:rFonts w:hint="eastAsia"/>
-              </w:rPr>
-            </w:pPr>
             <w:r>
               <w:rPr>
                 <w:rFonts w:hint="eastAsia"/>
@@ -3274,11 +3014,6 @@
             <w:tcW w:w="4957" w:type="dxa"/>
           </w:tcPr>
           <w:p>
-            <w:pPr>
-              <w:rPr>
-                <w:rFonts w:hint="eastAsia"/>
-              </w:rPr>
-            </w:pPr>
             <w:r>
               <w:rPr>
                 <w:rFonts w:hint="eastAsia"/>
@@ -3304,11 +3039,6 @@
             <w:tcW w:w="4059" w:type="dxa"/>
           </w:tcPr>
           <w:p>
-            <w:pPr>
-              <w:rPr>
-                <w:rFonts w:hint="eastAsia"/>
-              </w:rPr>
-            </w:pPr>
             <w:r>
               <w:rPr>
                 <w:rFonts w:hint="eastAsia"/>
@@ -3331,9 +3061,6 @@
     <w:p>
       <w:pPr>
         <w:pStyle w:val="2"/>
-        <w:rPr>
-          <w:rFonts w:hint="eastAsia"/>
-        </w:rPr>
       </w:pPr>
       <w:r>
         <w:rPr>
@@ -3401,15 +3128,101 @@
     <w:p>
       <w:pPr>
         <w:pStyle w:val="1"/>
-        <w:rPr>
-          <w:rFonts w:hint="eastAsia"/>
-        </w:rPr>
       </w:pPr>
       <w:r>
         <w:rPr>
           <w:rFonts w:hint="eastAsia"/>
         </w:rPr>
         <w:t>Ethical and Legal Consideration</w:t>
+      </w:r>
+    </w:p>
+    <w:p>
+      <w:r>
+        <w:rPr>
+          <w:rFonts w:hint="eastAsia"/>
+        </w:rPr>
+        <w:t>I</w:t>
+      </w:r>
+      <w:r>
+        <w:t xml:space="preserve"> acknowledge that the BER dataset provided by SEAI </w:t>
+      </w:r>
+      <w:r>
+        <w:t>includes</w:t>
+      </w:r>
+      <w:r>
+        <w:t xml:space="preserve"> location-related information (based on county) or real estate information. Only the necessary data will be </w:t>
+      </w:r>
+      <w:r>
+        <w:rPr>
+          <w:rFonts w:hint="eastAsia"/>
+        </w:rPr>
+        <w:t>used.</w:t>
+      </w:r>
+      <w:r>
+        <w:t xml:space="preserve"> </w:t>
+      </w:r>
+      <w:r>
+        <w:rPr>
+          <w:rFonts w:hint="eastAsia"/>
+        </w:rPr>
+        <w:t>A</w:t>
+      </w:r>
+      <w:r>
+        <w:t>ny data containing potentially sensitive personal details will be excluded from analysis. I have attached the SEAI, P</w:t>
+      </w:r>
+      <w:r>
+        <w:rPr>
+          <w:rFonts w:hint="eastAsia"/>
+        </w:rPr>
+        <w:t>VGIS</w:t>
+      </w:r>
+      <w:r>
+        <w:t xml:space="preserve"> term</w:t>
+      </w:r>
+      <w:r>
+        <w:rPr>
+          <w:rFonts w:hint="eastAsia"/>
+        </w:rPr>
+        <w:t>s</w:t>
+      </w:r>
+      <w:r>
+        <w:t xml:space="preserve">, and all other sources used in the project in the references, and I will add them as needed. </w:t>
+      </w:r>
+      <w:r>
+        <w:rPr>
+          <w:rFonts w:hint="eastAsia"/>
+        </w:rPr>
+        <w:t>I</w:t>
+      </w:r>
+      <w:r>
+        <w:t xml:space="preserve"> do not collect any personal household data that is not necessary, and any user input</w:t>
+      </w:r>
+      <w:r>
+        <w:rPr>
+          <w:rFonts w:hint="eastAsia"/>
+        </w:rPr>
+        <w:t>s will not be retained in the prototype</w:t>
+      </w:r>
+      <w:r>
+        <w:t>. Recommendations will clearly state that estimates depend on assumptions and are not guarantees</w:t>
+      </w:r>
+      <w:r>
+        <w:rPr>
+          <w:rFonts w:hint="eastAsia"/>
+        </w:rPr>
+        <w:t>. Also, I</w:t>
+      </w:r>
+      <w:r>
+        <w:t xml:space="preserve"> will inquire about availability before using the P</w:t>
+      </w:r>
+      <w:r>
+        <w:rPr>
+          <w:rFonts w:hint="eastAsia"/>
+        </w:rPr>
+        <w:t>VGIS</w:t>
+      </w:r>
+      <w:r>
+        <w:t xml:space="preserve"> data.</w:t>
       </w:r>
     </w:p>
     <w:p/>
@@ -3429,19 +3242,7 @@
           <w:rPr>
             <w:rStyle w:val="aa"/>
           </w:rPr>
-          <w:t>https://sh</w:t>
-        </w:r>
-        <w:r>
-          <w:rPr>
-            <w:rStyle w:val="aa"/>
-          </w:rPr>
-          <w:t>o</w:t>
-        </w:r>
-        <w:r>
-          <w:rPr>
-            <w:rStyle w:val="aa"/>
-          </w:rPr>
-          <w:t>p.solar-kit.eu/en/blog/post/solar-pv-meaning-capacity-and-net-present-value-explained-clearly</w:t>
+          <w:t>https://shop.solar-kit.eu/en/blog/post/solar-pv-meaning-capacity-and-net-present-value-explained-clearly</w:t>
         </w:r>
       </w:hyperlink>
     </w:p>
@@ -3451,19 +3252,7 @@
           <w:rPr>
             <w:rStyle w:val="aa"/>
           </w:rPr>
-          <w:t>https://qbits</w:t>
-        </w:r>
-        <w:r>
-          <w:rPr>
-            <w:rStyle w:val="aa"/>
-          </w:rPr>
-          <w:t>e</w:t>
-        </w:r>
-        <w:r>
-          <w:rPr>
-            <w:rStyle w:val="aa"/>
-          </w:rPr>
-          <w:t>nergy.com/glossary/npv/</w:t>
+          <w:t>https://qbitsenergy.com/glossary/npv/</w:t>
         </w:r>
       </w:hyperlink>
     </w:p>
@@ -3478,11 +3267,6 @@
       </w:hyperlink>
     </w:p>
     <w:p>
-      <w:pPr>
-        <w:rPr>
-          <w:rFonts w:hint="eastAsia"/>
-        </w:rPr>
-      </w:pPr>
       <w:hyperlink r:id="rId21" w:history="1">
         <w:r>
           <w:rPr>
@@ -3508,42 +3292,6 @@
     <w:p/>
     <w:p/>
     <w:p/>
-    <w:p/>
-    <w:p/>
-    <w:p/>
-    <w:p/>
-    <w:p/>
-    <w:p/>
-    <w:p/>
-    <w:p/>
-    <w:p/>
-    <w:p/>
-    <w:p/>
-    <w:p>
-      <w:pPr>
-        <w:pBdr>
-          <w:top w:val="nil"/>
-          <w:left w:val="nil"/>
-          <w:bottom w:val="nil"/>
-          <w:right w:val="nil"/>
-          <w:between w:val="nil"/>
-        </w:pBdr>
-        <w:spacing w:after="0" w:line="240" w:lineRule="auto"/>
-        <w:rPr>
-          <w:color w:val="000000"/>
-        </w:rPr>
-      </w:pPr>
-    </w:p>
-    <w:p/>
-    <w:p/>
-    <w:p/>
-    <w:p/>
-    <w:p/>
-    <w:p/>
-    <w:p/>
-    <w:p/>
-    <w:p/>
-    <w:p/>
     <w:p>
       <w:pPr>
         <w:pStyle w:val="1"/>
@@ -3551,16 +3299,12 @@
       <w:bookmarkStart w:id="2" w:name="_heading=h.kfkjs3rwl2c1" w:colFirst="0" w:colLast="0"/>
       <w:bookmarkEnd w:id="2"/>
       <w:r>
-        <w:lastRenderedPageBreak/>
         <w:t>Appendix</w:t>
       </w:r>
     </w:p>
     <w:p>
       <w:pPr>
         <w:pStyle w:val="2"/>
-        <w:rPr>
-          <w:rFonts w:hint="eastAsia"/>
-        </w:rPr>
       </w:pPr>
       <w:r>
         <w:rPr>
@@ -3570,6 +3314,11 @@
       </w:r>
     </w:p>
     <w:p>
+      <w:pPr>
+        <w:rPr>
+          <w:rFonts w:eastAsia="맑은 고딕" w:cstheme="minorHAnsi"/>
+        </w:rPr>
+      </w:pPr>
       <w:hyperlink r:id="rId22" w:history="1">
         <w:r>
           <w:rPr>
@@ -3583,27 +3332,24 @@
         <w:rPr>
           <w:rFonts w:eastAsia="맑은 고딕" w:cstheme="minorHAnsi" w:hint="eastAsia"/>
         </w:rPr>
-        <w:t xml:space="preserve"> </w:t>
+        <w:t xml:space="preserve"> (</w:t>
+      </w:r>
+      <w:r>
+        <w:rPr>
+          <w:rFonts w:eastAsia="맑은 고딕" w:cstheme="minorHAnsi"/>
+        </w:rPr>
+        <w:t>monthly</w:t>
       </w:r>
       <w:r>
         <w:rPr>
           <w:rFonts w:eastAsia="맑은 고딕" w:cstheme="minorHAnsi" w:hint="eastAsia"/>
         </w:rPr>
-        <w:t>(</w:t>
-      </w:r>
-      <w:r>
-        <w:rPr>
-          <w:rFonts w:eastAsia="맑은 고딕" w:cstheme="minorHAnsi"/>
-        </w:rPr>
-        <w:t>monthly</w:t>
-      </w:r>
-      <w:r>
-        <w:rPr>
-          <w:rFonts w:eastAsia="맑은 고딕" w:cstheme="minorHAnsi" w:hint="eastAsia"/>
-        </w:rPr>
         <w:t xml:space="preserve"> installation from 2020 to 2025)</w:t>
       </w:r>
       <w:r>
+        <w:rPr>
+          <w:noProof/>
+        </w:rPr>
         <w:drawing>
           <wp:anchor distT="0" distB="0" distL="114300" distR="114300" simplePos="0" relativeHeight="251662336" behindDoc="0" locked="0" layoutInCell="1" allowOverlap="1" wp14:anchorId="477B0B39" wp14:editId="4FF25466">
             <wp:simplePos x="0" y="0"/>
@@ -3662,11 +3408,14 @@
         </w:rPr>
       </w:pPr>
       <w:r>
+        <w:rPr>
+          <w:noProof/>
+        </w:rPr>
         <w:lastRenderedPageBreak/>
         <w:drawing>
-          <wp:inline distT="0" distB="0" distL="0" distR="0" wp14:anchorId="3B219914" wp14:editId="58987532">
-            <wp:extent cx="5731510" cy="5607685"/>
-            <wp:effectExtent l="0" t="0" r="2540" b="0"/>
+          <wp:inline distT="0" distB="0" distL="0" distR="0" wp14:anchorId="3B219914" wp14:editId="2B883AB3">
+            <wp:extent cx="5250180" cy="5136754"/>
+            <wp:effectExtent l="0" t="0" r="7620" b="6985"/>
             <wp:docPr id="1275431464" name="그림 1"/>
             <wp:cNvGraphicFramePr>
               <a:graphicFrameLocks xmlns:a="http://schemas.openxmlformats.org/drawingml/2006/main" noChangeAspect="1"/>
@@ -3687,7 +3436,7 @@
                   <pic:spPr>
                     <a:xfrm>
                       <a:off x="0" y="0"/>
-                      <a:ext cx="5731510" cy="5607685"/>
+                      <a:ext cx="5253556" cy="5140057"/>
                     </a:xfrm>
                     <a:prstGeom prst="rect">
                       <a:avLst/>
@@ -3705,14 +3454,7 @@
             <w:rStyle w:val="aa"/>
             <w:rFonts w:eastAsia="맑은 고딕" w:cstheme="minorHAnsi"/>
           </w:rPr>
-          <w:t>https://www.cso.ie/en/statistics/climate/sunshinebymeteorologicalweatherstation/?utm_so</w:t>
-        </w:r>
-        <w:r>
-          <w:rPr>
-            <w:rStyle w:val="aa"/>
-            <w:rFonts w:eastAsia="맑은 고딕" w:cstheme="minorHAnsi"/>
-          </w:rPr>
-          <w:t>urce</w:t>
+          <w:t>https://www.cso.ie/en/statistics/climate/sunshinebymeteorologicalweatherstation/?utm_source</w:t>
         </w:r>
       </w:hyperlink>
       <w:r>
@@ -3742,11 +3484,14 @@
         </w:rPr>
       </w:pPr>
       <w:r>
+        <w:rPr>
+          <w:noProof/>
+        </w:rPr>
         <w:lastRenderedPageBreak/>
         <w:drawing>
-          <wp:inline distT="0" distB="0" distL="0" distR="0" wp14:anchorId="7E0405A9" wp14:editId="7B5A13BC">
-            <wp:extent cx="3810330" cy="4397121"/>
-            <wp:effectExtent l="0" t="0" r="0" b="3810"/>
+          <wp:inline distT="0" distB="0" distL="0" distR="0" wp14:anchorId="7E0405A9" wp14:editId="6654CDB7">
+            <wp:extent cx="3810000" cy="3832860"/>
+            <wp:effectExtent l="0" t="0" r="0" b="0"/>
             <wp:docPr id="1095021704" name="그림 1"/>
             <wp:cNvGraphicFramePr>
               <a:graphicFrameLocks xmlns:a="http://schemas.openxmlformats.org/drawingml/2006/main" noChangeAspect="1"/>
@@ -3767,7 +3512,7 @@
                   <pic:spPr>
                     <a:xfrm>
                       <a:off x="0" y="0"/>
-                      <a:ext cx="3810330" cy="4397121"/>
+                      <a:ext cx="3810331" cy="3833193"/>
                     </a:xfrm>
                     <a:prstGeom prst="rect">
                       <a:avLst/>
@@ -3792,13 +3537,7 @@
         <w:rPr>
           <w:rFonts w:eastAsia="맑은 고딕" w:cstheme="minorHAnsi" w:hint="eastAsia"/>
         </w:rPr>
-        <w:t xml:space="preserve"> </w:t>
-      </w:r>
-      <w:r>
-        <w:rPr>
-          <w:rFonts w:eastAsia="맑은 고딕" w:cstheme="minorHAnsi" w:hint="eastAsia"/>
-        </w:rPr>
-        <w:t xml:space="preserve">(sunshine </w:t>
+        <w:t xml:space="preserve"> (sunshine </w:t>
       </w:r>
       <w:r>
         <w:rPr>
@@ -3815,21 +3554,26 @@
     </w:p>
     <w:p>
       <w:pPr>
-        <w:pStyle w:val="2"/>
-        <w:rPr>
-          <w:rFonts w:hint="eastAsia"/>
-        </w:rPr>
-      </w:pPr>
-      <w:r>
-        <w:rPr>
-          <w:rFonts w:hint="eastAsia"/>
-        </w:rPr>
-        <w:t>AI</w:t>
-      </w:r>
+        <w:rPr>
+          <w:rFonts w:eastAsia="맑은 고딕" w:cstheme="minorHAnsi"/>
+        </w:rPr>
+      </w:pPr>
     </w:p>
     <w:p>
-      <w:r>
-        <w:rPr>
+      <w:pPr>
+        <w:pStyle w:val="2"/>
+      </w:pPr>
+      <w:r>
+        <w:rPr>
+          <w:rFonts w:hint="eastAsia"/>
+        </w:rPr>
+        <w:t>AI</w:t>
+      </w:r>
+    </w:p>
+    <w:p>
+      <w:r>
+        <w:rPr>
+          <w:noProof/>
           <w:color w:val="FF0000"/>
         </w:rPr>
         <w:drawing>
@@ -3877,6 +3621,7 @@
       </w:pPr>
       <w:r>
         <w:rPr>
+          <w:noProof/>
           <w:color w:val="FF0000"/>
         </w:rPr>
         <w:drawing>
@@ -3922,7 +3667,6 @@
         <w:t xml:space="preserve"> </w:t>
       </w:r>
     </w:p>
-    <w:p/>
     <w:p/>
     <w:sectPr>
       <w:pgSz w:w="11906" w:h="16838"/>
@@ -5791,6 +5535,7 @@
   <w:style w:type="character" w:default="1" w:styleId="a0">
     <w:name w:val="Default Paragraph Font"/>
     <w:uiPriority w:val="1"/>
+    <w:semiHidden/>
     <w:unhideWhenUsed/>
   </w:style>
   <w:style w:type="table" w:default="1" w:styleId="a1">

</xml_diff>

<commit_message>
attach how i used AI
</commit_message>
<xml_diff>
--- a/sumi heo (2026324). strategic thinking ca1.docx
+++ b/sumi heo (2026324). strategic thinking ca1.docx
@@ -555,19 +555,8 @@
                 <w:sz w:val="32"/>
                 <w:szCs w:val="32"/>
               </w:rPr>
-              <w:t xml:space="preserve">Muhammad </w:t>
-            </w:r>
-            <w:proofErr w:type="spellStart"/>
-            <w:r>
-              <w:rPr>
-                <w:i/>
-                <w:color w:val="156082"/>
-                <w:sz w:val="32"/>
-                <w:szCs w:val="32"/>
-              </w:rPr>
-              <w:t>lqbal</w:t>
-            </w:r>
-            <w:proofErr w:type="spellEnd"/>
+              <w:t>Muhammad lqbal</w:t>
+            </w:r>
           </w:p>
         </w:tc>
         <w:tc>
@@ -2497,7 +2486,14 @@
         <w:t>Aim and Objectives</w:t>
       </w:r>
     </w:p>
-    <w:p/>
+    <w:p>
+      <w:r>
+        <w:t>Analyze</w:t>
+      </w:r>
+      <w:r>
+        <w:t xml:space="preserve"> and estimate economic value and suitability of installing solar panel in Ireland, support potential user's decision making by developing a Web-Based Decision Support System (DSS) which provides necessary information and recommendation.</w:t>
+      </w:r>
+    </w:p>
     <w:p>
       <w:pPr>
         <w:pStyle w:val="1"/>
@@ -3129,14 +3125,19 @@
       <w:pPr>
         <w:pStyle w:val="1"/>
       </w:pPr>
-      <w:r>
-        <w:rPr>
-          <w:rFonts w:hint="eastAsia"/>
-        </w:rPr>
-        <w:t>Ethical and Legal Consideration</w:t>
-      </w:r>
     </w:p>
     <w:p>
+      <w:pPr>
+        <w:pStyle w:val="1"/>
+      </w:pPr>
+      <w:r>
+        <w:rPr>
+          <w:rFonts w:hint="eastAsia"/>
+        </w:rPr>
+        <w:t>Ethical and Legal Consideration</w:t>
+      </w:r>
+    </w:p>
+    <w:p>
       <w:r>
         <w:rPr>
           <w:rFonts w:hint="eastAsia"/>
@@ -3195,7 +3196,7 @@
         <w:t>I</w:t>
       </w:r>
       <w:r>
-        <w:t xml:space="preserve"> do not collect any personal household data that is not necessary, and any user input</w:t>
+        <w:t xml:space="preserve"> do not collect any personal household data that is not necessary, and user input</w:t>
       </w:r>
       <w:r>
         <w:rPr>
@@ -3232,6 +3233,11 @@
       </w:pPr>
       <w:bookmarkStart w:id="1" w:name="_heading=h.2et92p0" w:colFirst="0" w:colLast="0"/>
       <w:bookmarkEnd w:id="1"/>
+    </w:p>
+    <w:p>
+      <w:pPr>
+        <w:pStyle w:val="1"/>
+      </w:pPr>
       <w:r>
         <w:t>References</w:t>
       </w:r>
@@ -3285,11 +3291,6 @@
         <w:t>European Commission Joint Research Centre PVGIS</w:t>
       </w:r>
     </w:p>
-    <w:p/>
-    <w:p/>
-    <w:p/>
-    <w:p/>
-    <w:p/>
     <w:p/>
     <w:p/>
     <w:p>
@@ -3567,20 +3568,24 @@
         <w:rPr>
           <w:rFonts w:hint="eastAsia"/>
         </w:rPr>
+        <w:lastRenderedPageBreak/>
         <w:t>AI</w:t>
       </w:r>
-    </w:p>
-    <w:p>
       <w:r>
         <w:rPr>
           <w:noProof/>
-          <w:color w:val="FF0000"/>
+        </w:rPr>
+        <w:t xml:space="preserve"> </w:t>
+      </w:r>
+      <w:r>
+        <w:rPr>
+          <w:noProof/>
         </w:rPr>
         <w:drawing>
-          <wp:inline distT="0" distB="0" distL="0" distR="0" wp14:anchorId="2E41B07B" wp14:editId="291C36E0">
-            <wp:extent cx="4732430" cy="1272650"/>
-            <wp:effectExtent l="0" t="0" r="0" b="3810"/>
-            <wp:docPr id="962805818" name="그림 1"/>
+          <wp:inline distT="0" distB="0" distL="0" distR="0" wp14:anchorId="37F81C73" wp14:editId="0277A86E">
+            <wp:extent cx="5731510" cy="2853055"/>
+            <wp:effectExtent l="0" t="0" r="2540" b="4445"/>
+            <wp:docPr id="1541633909" name="그림 1"/>
             <wp:cNvGraphicFramePr>
               <a:graphicFrameLocks xmlns:a="http://schemas.openxmlformats.org/drawingml/2006/main" noChangeAspect="1"/>
             </wp:cNvGraphicFramePr>
@@ -3588,7 +3593,7 @@
               <a:graphicData uri="http://schemas.openxmlformats.org/drawingml/2006/picture">
                 <pic:pic xmlns:pic="http://schemas.openxmlformats.org/drawingml/2006/picture">
                   <pic:nvPicPr>
-                    <pic:cNvPr id="962805818" name=""/>
+                    <pic:cNvPr id="1541633909" name=""/>
                     <pic:cNvPicPr/>
                   </pic:nvPicPr>
                   <pic:blipFill>
@@ -3600,7 +3605,7 @@
                   <pic:spPr>
                     <a:xfrm>
                       <a:off x="0" y="0"/>
-                      <a:ext cx="4732430" cy="1272650"/>
+                      <a:ext cx="5731510" cy="2853055"/>
                     </a:xfrm>
                     <a:prstGeom prst="rect">
                       <a:avLst/>
@@ -3612,23 +3617,12 @@
           </wp:inline>
         </w:drawing>
       </w:r>
-    </w:p>
-    <w:p>
-      <w:pPr>
-        <w:rPr>
-          <w:color w:val="FF0000"/>
-        </w:rPr>
-      </w:pPr>
-      <w:r>
-        <w:rPr>
-          <w:noProof/>
-          <w:color w:val="FF0000"/>
-        </w:rPr>
+      <w:r>
         <w:drawing>
-          <wp:inline distT="0" distB="0" distL="0" distR="0" wp14:anchorId="2E4200EF" wp14:editId="352AA2DF">
-            <wp:extent cx="4663844" cy="1333616"/>
-            <wp:effectExtent l="0" t="0" r="3810" b="0"/>
-            <wp:docPr id="1619613435" name="그림 1"/>
+          <wp:inline distT="0" distB="0" distL="0" distR="0" wp14:anchorId="04694084" wp14:editId="7A132A5A">
+            <wp:extent cx="5731510" cy="2844800"/>
+            <wp:effectExtent l="0" t="0" r="2540" b="0"/>
+            <wp:docPr id="384573971" name="그림 1"/>
             <wp:cNvGraphicFramePr>
               <a:graphicFrameLocks xmlns:a="http://schemas.openxmlformats.org/drawingml/2006/main" noChangeAspect="1"/>
             </wp:cNvGraphicFramePr>
@@ -3636,7 +3630,7 @@
               <a:graphicData uri="http://schemas.openxmlformats.org/drawingml/2006/picture">
                 <pic:pic xmlns:pic="http://schemas.openxmlformats.org/drawingml/2006/picture">
                   <pic:nvPicPr>
-                    <pic:cNvPr id="1619613435" name=""/>
+                    <pic:cNvPr id="384573971" name=""/>
                     <pic:cNvPicPr/>
                   </pic:nvPicPr>
                   <pic:blipFill>
@@ -3648,7 +3642,7 @@
                   <pic:spPr>
                     <a:xfrm>
                       <a:off x="0" y="0"/>
-                      <a:ext cx="4663844" cy="1333616"/>
+                      <a:ext cx="5731510" cy="2844800"/>
                     </a:xfrm>
                     <a:prstGeom prst="rect">
                       <a:avLst/>
@@ -3660,14 +3654,100 @@
           </wp:inline>
         </w:drawing>
       </w:r>
+    </w:p>
+    <w:p>
+      <w:pPr>
+        <w:rPr>
+          <w:color w:val="FF0000"/>
+        </w:rPr>
+      </w:pPr>
       <w:r>
         <w:rPr>
           <w:noProof/>
         </w:rPr>
+        <w:drawing>
+          <wp:inline distT="0" distB="0" distL="0" distR="0" wp14:anchorId="0252164E" wp14:editId="241D2E72">
+            <wp:extent cx="5731510" cy="2115820"/>
+            <wp:effectExtent l="0" t="0" r="2540" b="0"/>
+            <wp:docPr id="1417616888" name="그림 1"/>
+            <wp:cNvGraphicFramePr>
+              <a:graphicFrameLocks xmlns:a="http://schemas.openxmlformats.org/drawingml/2006/main" noChangeAspect="1"/>
+            </wp:cNvGraphicFramePr>
+            <a:graphic xmlns:a="http://schemas.openxmlformats.org/drawingml/2006/main">
+              <a:graphicData uri="http://schemas.openxmlformats.org/drawingml/2006/picture">
+                <pic:pic xmlns:pic="http://schemas.openxmlformats.org/drawingml/2006/picture">
+                  <pic:nvPicPr>
+                    <pic:cNvPr id="1417616888" name=""/>
+                    <pic:cNvPicPr/>
+                  </pic:nvPicPr>
+                  <pic:blipFill>
+                    <a:blip r:embed="rId30"/>
+                    <a:stretch>
+                      <a:fillRect/>
+                    </a:stretch>
+                  </pic:blipFill>
+                  <pic:spPr>
+                    <a:xfrm>
+                      <a:off x="0" y="0"/>
+                      <a:ext cx="5731510" cy="2115820"/>
+                    </a:xfrm>
+                    <a:prstGeom prst="rect">
+                      <a:avLst/>
+                    </a:prstGeom>
+                  </pic:spPr>
+                </pic:pic>
+              </a:graphicData>
+            </a:graphic>
+          </wp:inline>
+        </w:drawing>
+      </w:r>
+      <w:r>
+        <w:rPr>
+          <w:noProof/>
+        </w:rPr>
         <w:t xml:space="preserve"> </w:t>
       </w:r>
     </w:p>
-    <w:p/>
+    <w:p>
+      <w:r>
+        <w:lastRenderedPageBreak/>
+        <w:drawing>
+          <wp:inline distT="0" distB="0" distL="0" distR="0" wp14:anchorId="317694C5" wp14:editId="72DA7F48">
+            <wp:extent cx="5731510" cy="4606290"/>
+            <wp:effectExtent l="0" t="0" r="2540" b="3810"/>
+            <wp:docPr id="1416371915" name="그림 1"/>
+            <wp:cNvGraphicFramePr>
+              <a:graphicFrameLocks xmlns:a="http://schemas.openxmlformats.org/drawingml/2006/main" noChangeAspect="1"/>
+            </wp:cNvGraphicFramePr>
+            <a:graphic xmlns:a="http://schemas.openxmlformats.org/drawingml/2006/main">
+              <a:graphicData uri="http://schemas.openxmlformats.org/drawingml/2006/picture">
+                <pic:pic xmlns:pic="http://schemas.openxmlformats.org/drawingml/2006/picture">
+                  <pic:nvPicPr>
+                    <pic:cNvPr id="1416371915" name=""/>
+                    <pic:cNvPicPr/>
+                  </pic:nvPicPr>
+                  <pic:blipFill>
+                    <a:blip r:embed="rId31"/>
+                    <a:stretch>
+                      <a:fillRect/>
+                    </a:stretch>
+                  </pic:blipFill>
+                  <pic:spPr>
+                    <a:xfrm>
+                      <a:off x="0" y="0"/>
+                      <a:ext cx="5731510" cy="4606290"/>
+                    </a:xfrm>
+                    <a:prstGeom prst="rect">
+                      <a:avLst/>
+                    </a:prstGeom>
+                  </pic:spPr>
+                </pic:pic>
+              </a:graphicData>
+            </a:graphic>
+          </wp:inline>
+        </w:drawing>
+      </w:r>
+    </w:p>
     <w:sectPr>
       <w:pgSz w:w="11906" w:h="16838"/>
       <w:pgMar w:top="1701" w:right="1440" w:bottom="1440" w:left="1440" w:header="851" w:footer="992" w:gutter="0"/>
@@ -5535,7 +5615,6 @@
   <w:style w:type="character" w:default="1" w:styleId="a0">
     <w:name w:val="Default Paragraph Font"/>
     <w:uiPriority w:val="1"/>
-    <w:semiHidden/>
     <w:unhideWhenUsed/>
   </w:style>
   <w:style w:type="table" w:default="1" w:styleId="a1">

</xml_diff>

<commit_message>
complete aim and objectives
</commit_message>
<xml_diff>
--- a/sumi heo (2026324). strategic thinking ca1.docx
+++ b/sumi heo (2026324). strategic thinking ca1.docx
@@ -2495,6 +2495,224 @@
       </w:r>
     </w:p>
     <w:p>
+      <w:r>
+        <w:rPr>
+          <w:rFonts w:hint="eastAsia"/>
+        </w:rPr>
+        <w:lastRenderedPageBreak/>
+        <w:t>1.</w:t>
+      </w:r>
+      <w:r>
+        <w:t xml:space="preserve"> </w:t>
+      </w:r>
+      <w:r>
+        <w:rPr>
+          <w:rFonts w:hint="eastAsia"/>
+        </w:rPr>
+        <w:t>Construct p</w:t>
+      </w:r>
+      <w:r>
+        <w:t>roper datase</w:t>
+      </w:r>
+      <w:r>
+        <w:rPr>
+          <w:rFonts w:hint="eastAsia"/>
+        </w:rPr>
+        <w:t>t</w:t>
+      </w:r>
+      <w:r>
+        <w:t xml:space="preserve">. </w:t>
+      </w:r>
+      <w:r>
+        <w:rPr>
+          <w:rFonts w:hint="eastAsia"/>
+        </w:rPr>
+        <w:t>Collect r</w:t>
+      </w:r>
+      <w:r>
+        <w:t xml:space="preserve">elevant data </w:t>
+      </w:r>
+      <w:r>
+        <w:rPr>
+          <w:rFonts w:hint="eastAsia"/>
+        </w:rPr>
+        <w:t xml:space="preserve">and identify, </w:t>
+      </w:r>
+      <w:r>
+        <w:t>preprocess</w:t>
+      </w:r>
+      <w:r>
+        <w:rPr>
+          <w:rFonts w:hint="eastAsia"/>
+        </w:rPr>
+        <w:t xml:space="preserve">, </w:t>
+      </w:r>
+      <w:r>
+        <w:t>analyze</w:t>
+      </w:r>
+      <w:r>
+        <w:rPr>
+          <w:rFonts w:hint="eastAsia"/>
+        </w:rPr>
+        <w:t xml:space="preserve"> it. Ensure there is no ethical issue.</w:t>
+      </w:r>
+      <w:r>
+        <w:t xml:space="preserve"> </w:t>
+      </w:r>
+    </w:p>
+    <w:p>
+      <w:pPr>
+        <w:rPr>
+          <w:rFonts w:hint="eastAsia"/>
+        </w:rPr>
+      </w:pPr>
+      <w:r>
+        <w:rPr>
+          <w:rFonts w:hint="eastAsia"/>
+        </w:rPr>
+        <w:t xml:space="preserve">2. </w:t>
+      </w:r>
+      <w:r>
+        <w:rPr>
+          <w:rFonts w:hint="eastAsia"/>
+        </w:rPr>
+        <w:t>D</w:t>
+      </w:r>
+      <w:r>
+        <w:t>etermine the important features</w:t>
+      </w:r>
+      <w:r>
+        <w:rPr>
+          <w:rFonts w:hint="eastAsia"/>
+        </w:rPr>
+        <w:t xml:space="preserve"> b</w:t>
+      </w:r>
+      <w:r>
+        <w:t>y understanding relationships between variables and identifying key factors affecting profitability</w:t>
+      </w:r>
+      <w:r>
+        <w:rPr>
+          <w:rFonts w:hint="eastAsia"/>
+        </w:rPr>
+        <w:t>.</w:t>
+      </w:r>
+    </w:p>
+    <w:p>
+      <w:pPr>
+        <w:rPr>
+          <w:rFonts w:eastAsia="맑은 고딕"/>
+        </w:rPr>
+      </w:pPr>
+      <w:r>
+        <w:rPr>
+          <w:rFonts w:hint="eastAsia"/>
+        </w:rPr>
+        <w:t xml:space="preserve">3. </w:t>
+      </w:r>
+      <w:r>
+        <w:rPr>
+          <w:rFonts w:eastAsia="맑은 고딕" w:hint="eastAsia"/>
+        </w:rPr>
+        <w:t>Use appropriate</w:t>
+      </w:r>
+      <w:r>
+        <w:rPr>
+          <w:rFonts w:eastAsia="맑은 고딕" w:hint="eastAsia"/>
+        </w:rPr>
+        <w:t xml:space="preserve"> ML </w:t>
+      </w:r>
+      <w:r>
+        <w:rPr>
+          <w:rFonts w:eastAsia="맑은 고딕"/>
+        </w:rPr>
+        <w:t>model</w:t>
+      </w:r>
+      <w:r>
+        <w:rPr>
+          <w:rFonts w:eastAsia="맑은 고딕" w:hint="eastAsia"/>
+        </w:rPr>
+        <w:t xml:space="preserve"> with evaluation metric understanding proper situation. </w:t>
+      </w:r>
+      <w:r>
+        <w:rPr>
+          <w:rFonts w:eastAsia="맑은 고딕" w:hint="eastAsia"/>
+        </w:rPr>
+        <w:t xml:space="preserve">For example, </w:t>
+      </w:r>
+      <w:r>
+        <w:rPr>
+          <w:rFonts w:eastAsia="맑은 고딕"/>
+        </w:rPr>
+        <w:t>Silhouette Score</w:t>
+      </w:r>
+      <w:r>
+        <w:rPr>
+          <w:rFonts w:eastAsia="맑은 고딕" w:hint="eastAsia"/>
+        </w:rPr>
+        <w:t xml:space="preserve"> for clustering or accuracy for random forest.</w:t>
+      </w:r>
+    </w:p>
+    <w:p>
+      <w:r>
+        <w:rPr>
+          <w:rFonts w:hint="eastAsia"/>
+        </w:rPr>
+        <w:t xml:space="preserve">4. </w:t>
+      </w:r>
+      <w:r>
+        <w:rPr>
+          <w:rFonts w:hint="eastAsia"/>
+        </w:rPr>
+        <w:t>B</w:t>
+      </w:r>
+      <w:r>
+        <w:t xml:space="preserve">uild a DSS that provides insights by applying ML analysis models. </w:t>
+      </w:r>
+      <w:r>
+        <w:t xml:space="preserve">After collecting user responses, </w:t>
+      </w:r>
+      <w:r>
+        <w:rPr>
+          <w:rFonts w:hint="eastAsia"/>
+        </w:rPr>
+        <w:t>e</w:t>
+      </w:r>
+      <w:r>
+        <w:t xml:space="preserve">valuate and enhance the DSS functionality. </w:t>
+      </w:r>
+    </w:p>
+    <w:p>
+      <w:pPr>
+        <w:rPr>
+          <w:rFonts w:hint="eastAsia"/>
+        </w:rPr>
+      </w:pPr>
+      <w:r>
+        <w:rPr>
+          <w:rFonts w:hint="eastAsia"/>
+        </w:rPr>
+        <w:t xml:space="preserve">(5. </w:t>
+      </w:r>
+      <w:r>
+        <w:t xml:space="preserve">If possible, </w:t>
+      </w:r>
+      <w:r>
+        <w:rPr>
+          <w:rFonts w:hint="eastAsia"/>
+        </w:rPr>
+        <w:t>I will do specific analysis within</w:t>
+      </w:r>
+      <w:r>
+        <w:t xml:space="preserve"> Dublin</w:t>
+      </w:r>
+      <w:r>
+        <w:rPr>
+          <w:rFonts w:hint="eastAsia"/>
+        </w:rPr>
+        <w:t>)</w:t>
+      </w:r>
+    </w:p>
+    <w:p>
       <w:pPr>
         <w:pStyle w:val="1"/>
       </w:pPr>
@@ -2502,7 +2720,6 @@
         <w:rPr>
           <w:rFonts w:hint="eastAsia"/>
         </w:rPr>
-        <w:lastRenderedPageBreak/>
         <w:t>Scope</w:t>
       </w:r>
     </w:p>
@@ -2666,6 +2883,7 @@
         <w:rPr>
           <w:rFonts w:hint="eastAsia"/>
         </w:rPr>
+        <w:lastRenderedPageBreak/>
         <w:t>Expected Deliverables</w:t>
       </w:r>
     </w:p>
@@ -3062,7 +3280,6 @@
         <w:rPr>
           <w:rFonts w:hint="eastAsia"/>
         </w:rPr>
-        <w:lastRenderedPageBreak/>
         <w:t>Gantt Chart</w:t>
       </w:r>
     </w:p>
@@ -3187,7 +3404,11 @@
         <w:t>s</w:t>
       </w:r>
       <w:r>
-        <w:t xml:space="preserve">, and all other sources used in the project in the references, and I will add them as needed. </w:t>
+        <w:t xml:space="preserve">, and all other sources used in the project </w:t>
+      </w:r>
+      <w:r>
+        <w:lastRenderedPageBreak/>
+        <w:t xml:space="preserve">in the references, and I will add them as needed. </w:t>
       </w:r>
       <w:r>
         <w:rPr>
@@ -3326,7 +3547,15 @@
             <w:rStyle w:val="aa"/>
             <w:rFonts w:eastAsia="맑은 고딕" w:cstheme="minorHAnsi"/>
           </w:rPr>
-          <w:t>https://energyefficiency.ie/wp-content/uploads/2026/04/Residential-Solar-Panel-Report-2026.pdf?utm_source</w:t>
+          <w:t>https://energyefficiency.ie/wp-content/uploads/2026/04/Residential-Solar-Panel-Report-</w:t>
+        </w:r>
+        <w:r>
+          <w:rPr>
+            <w:rStyle w:val="aa"/>
+            <w:rFonts w:eastAsia="맑은 고딕" w:cstheme="minorHAnsi"/>
+          </w:rPr>
+          <w:lastRenderedPageBreak/>
+          <w:t>2026.pdf?utm_source</w:t>
         </w:r>
       </w:hyperlink>
       <w:r>
@@ -3412,7 +3641,6 @@
         <w:rPr>
           <w:noProof/>
         </w:rPr>
-        <w:lastRenderedPageBreak/>
         <w:drawing>
           <wp:inline distT="0" distB="0" distL="0" distR="0" wp14:anchorId="3B219914" wp14:editId="2B883AB3">
             <wp:extent cx="5250180" cy="5136754"/>
@@ -3488,7 +3716,6 @@
         <w:rPr>
           <w:noProof/>
         </w:rPr>
-        <w:lastRenderedPageBreak/>
         <w:drawing>
           <wp:inline distT="0" distB="0" distL="0" distR="0" wp14:anchorId="7E0405A9" wp14:editId="6654CDB7">
             <wp:extent cx="3810000" cy="3832860"/>
@@ -3736,6 +3963,49 @@
                     <a:xfrm>
                       <a:off x="0" y="0"/>
                       <a:ext cx="5731510" cy="4606290"/>
+                    </a:xfrm>
+                    <a:prstGeom prst="rect">
+                      <a:avLst/>
+                    </a:prstGeom>
+                  </pic:spPr>
+                </pic:pic>
+              </a:graphicData>
+            </a:graphic>
+          </wp:inline>
+        </w:drawing>
+      </w:r>
+      <w:r>
+        <w:rPr>
+          <w:noProof/>
+        </w:rPr>
+        <w:t xml:space="preserve"> </w:t>
+      </w:r>
+      <w:r>
+        <w:drawing>
+          <wp:inline distT="0" distB="0" distL="0" distR="0" wp14:anchorId="43176BBF" wp14:editId="0846542F">
+            <wp:extent cx="5731510" cy="3613785"/>
+            <wp:effectExtent l="0" t="0" r="2540" b="5715"/>
+            <wp:docPr id="1169022184" name="그림 1"/>
+            <wp:cNvGraphicFramePr>
+              <a:graphicFrameLocks xmlns:a="http://schemas.openxmlformats.org/drawingml/2006/main" noChangeAspect="1"/>
+            </wp:cNvGraphicFramePr>
+            <a:graphic xmlns:a="http://schemas.openxmlformats.org/drawingml/2006/main">
+              <a:graphicData uri="http://schemas.openxmlformats.org/drawingml/2006/picture">
+                <pic:pic xmlns:pic="http://schemas.openxmlformats.org/drawingml/2006/picture">
+                  <pic:nvPicPr>
+                    <pic:cNvPr id="1169022184" name=""/>
+                    <pic:cNvPicPr/>
+                  </pic:nvPicPr>
+                  <pic:blipFill>
+                    <a:blip r:embed="rId32"/>
+                    <a:stretch>
+                      <a:fillRect/>
+                    </a:stretch>
+                  </pic:blipFill>
+                  <pic:spPr>
+                    <a:xfrm>
+                      <a:off x="0" y="0"/>
+                      <a:ext cx="5731510" cy="3613785"/>
                     </a:xfrm>
                     <a:prstGeom prst="rect">
                       <a:avLst/>

</xml_diff>

<commit_message>
start with expected deliverables
</commit_message>
<xml_diff>
--- a/sumi heo (2026324). strategic thinking ca1.docx
+++ b/sumi heo (2026324). strategic thinking ca1.docx
@@ -555,19 +555,8 @@
                 <w:sz w:val="32"/>
                 <w:szCs w:val="32"/>
               </w:rPr>
-              <w:t xml:space="preserve">Muhammad </w:t>
-            </w:r>
-            <w:proofErr w:type="spellStart"/>
-            <w:r>
-              <w:rPr>
-                <w:i/>
-                <w:color w:val="156082"/>
-                <w:sz w:val="32"/>
-                <w:szCs w:val="32"/>
-              </w:rPr>
-              <w:t>lqbal</w:t>
-            </w:r>
-            <w:proofErr w:type="spellEnd"/>
+              <w:t>Muhammad lqbal</w:t>
+            </w:r>
           </w:p>
         </w:tc>
         <w:tc>
@@ -878,27 +867,7 @@
           <w:sz w:val="28"/>
           <w:szCs w:val="28"/>
         </w:rPr>
-        <w:t xml:space="preserve">getting additional </w:t>
-      </w:r>
-      <w:proofErr w:type="gramStart"/>
-      <w:r>
-        <w:rPr>
-          <w:rFonts w:hint="eastAsia"/>
-          <w:b/>
-          <w:sz w:val="28"/>
-          <w:szCs w:val="28"/>
-        </w:rPr>
-        <w:t>idea</w:t>
-      </w:r>
-      <w:proofErr w:type="gramEnd"/>
-      <w:r>
-        <w:rPr>
-          <w:rFonts w:hint="eastAsia"/>
-          <w:b/>
-          <w:sz w:val="28"/>
-          <w:szCs w:val="28"/>
-        </w:rPr>
-        <w:t xml:space="preserve"> for my project.</w:t>
+        <w:t>getting additional idea for my project.</w:t>
       </w:r>
     </w:p>
     <w:p>
@@ -982,23 +951,7 @@
                                 <w:color w:val="000000"/>
                                 <w:sz w:val="28"/>
                               </w:rPr>
-                              <w:t xml:space="preserve">By submitting this assessment, I confirm that I have read the CCT policy on academic misconduct and understand the implications of submitting work that is not my own or does not appropriately reference material </w:t>
-                            </w:r>
-                            <w:proofErr w:type="gramStart"/>
-                            <w:r>
-                              <w:rPr>
-                                <w:color w:val="000000"/>
-                                <w:sz w:val="28"/>
-                              </w:rPr>
-                              <w:t>taken</w:t>
-                            </w:r>
-                            <w:proofErr w:type="gramEnd"/>
-                            <w:r>
-                              <w:rPr>
-                                <w:color w:val="000000"/>
-                                <w:sz w:val="28"/>
-                              </w:rPr>
-                              <w:t xml:space="preserve"> from a third party or other source. </w:t>
+                              <w:t xml:space="preserve">By submitting this assessment, I confirm that I have read the CCT policy on academic misconduct and understand the implications of submitting work that is not my own or does not appropriately reference material taken from a third party or other source. </w:t>
                             </w:r>
                           </w:p>
                           <w:p>
@@ -1024,23 +977,7 @@
                                 <w:color w:val="000000"/>
                                 <w:sz w:val="28"/>
                               </w:rPr>
-                              <w:t xml:space="preserve"> I further confirm that this work has not previously been submitted for assessment by myself or someone else </w:t>
-                            </w:r>
-                            <w:proofErr w:type="gramStart"/>
-                            <w:r>
-                              <w:rPr>
-                                <w:color w:val="000000"/>
-                                <w:sz w:val="28"/>
-                              </w:rPr>
-                              <w:t>in</w:t>
-                            </w:r>
-                            <w:proofErr w:type="gramEnd"/>
-                            <w:r>
-                              <w:rPr>
-                                <w:color w:val="000000"/>
-                                <w:sz w:val="28"/>
-                              </w:rPr>
-                              <w:t xml:space="preserve"> CCT College Dublin or any other higher education institution.</w:t>
+                              <w:t xml:space="preserve"> I further confirm that this work has not previously been submitted for assessment by myself or someone else in CCT College Dublin or any other higher education institution.</w:t>
                             </w:r>
                           </w:p>
                         </w:txbxContent>
@@ -1084,23 +1021,7 @@
                           <w:color w:val="000000"/>
                           <w:sz w:val="28"/>
                         </w:rPr>
-                        <w:t xml:space="preserve">By submitting this assessment, I confirm that I have read the CCT policy on academic misconduct and understand the implications of submitting work that is not my own or does not appropriately reference material </w:t>
-                      </w:r>
-                      <w:proofErr w:type="gramStart"/>
-                      <w:r>
-                        <w:rPr>
-                          <w:color w:val="000000"/>
-                          <w:sz w:val="28"/>
-                        </w:rPr>
-                        <w:t>taken</w:t>
-                      </w:r>
-                      <w:proofErr w:type="gramEnd"/>
-                      <w:r>
-                        <w:rPr>
-                          <w:color w:val="000000"/>
-                          <w:sz w:val="28"/>
-                        </w:rPr>
-                        <w:t xml:space="preserve"> from a third party or other source. </w:t>
+                        <w:t xml:space="preserve">By submitting this assessment, I confirm that I have read the CCT policy on academic misconduct and understand the implications of submitting work that is not my own or does not appropriately reference material taken from a third party or other source. </w:t>
                       </w:r>
                     </w:p>
                     <w:p>
@@ -1126,23 +1047,7 @@
                           <w:color w:val="000000"/>
                           <w:sz w:val="28"/>
                         </w:rPr>
-                        <w:t xml:space="preserve"> I further confirm that this work has not previously been submitted for assessment by myself or someone else </w:t>
-                      </w:r>
-                      <w:proofErr w:type="gramStart"/>
-                      <w:r>
-                        <w:rPr>
-                          <w:color w:val="000000"/>
-                          <w:sz w:val="28"/>
-                        </w:rPr>
-                        <w:t>in</w:t>
-                      </w:r>
-                      <w:proofErr w:type="gramEnd"/>
-                      <w:r>
-                        <w:rPr>
-                          <w:color w:val="000000"/>
-                          <w:sz w:val="28"/>
-                        </w:rPr>
-                        <w:t xml:space="preserve"> CCT College Dublin or any other higher education institution.</w:t>
+                        <w:t xml:space="preserve"> I further confirm that this work has not previously been submitted for assessment by myself or someone else in CCT College Dublin or any other higher education institution.</w:t>
                       </w:r>
                     </w:p>
                   </w:txbxContent>
@@ -1475,7 +1380,13 @@
                 <w:color w:val="000000"/>
               </w:rPr>
               <w:tab/>
-              <w:t>1</w:t>
+            </w:r>
+            <w:r>
+              <w:rPr>
+                <w:rFonts w:hint="eastAsia"/>
+                <w:color w:val="000000"/>
+              </w:rPr>
+              <w:t>6</w:t>
             </w:r>
           </w:hyperlink>
         </w:p>
@@ -1523,7 +1434,13 @@
                 <w:color w:val="000000"/>
               </w:rPr>
               <w:tab/>
-              <w:t>1</w:t>
+            </w:r>
+            <w:r>
+              <w:rPr>
+                <w:rFonts w:hint="eastAsia"/>
+                <w:color w:val="000000"/>
+              </w:rPr>
+              <w:t>6</w:t>
             </w:r>
           </w:hyperlink>
         </w:p>
@@ -1571,7 +1488,13 @@
                 <w:color w:val="000000"/>
               </w:rPr>
               <w:tab/>
-              <w:t>1</w:t>
+            </w:r>
+            <w:r>
+              <w:rPr>
+                <w:rFonts w:hint="eastAsia"/>
+                <w:color w:val="000000"/>
+              </w:rPr>
+              <w:t>7</w:t>
             </w:r>
           </w:hyperlink>
         </w:p>
@@ -1619,7 +1542,13 @@
                 <w:color w:val="000000"/>
               </w:rPr>
               <w:tab/>
-              <w:t>1</w:t>
+            </w:r>
+            <w:r>
+              <w:rPr>
+                <w:rFonts w:hint="eastAsia"/>
+                <w:color w:val="000000"/>
+              </w:rPr>
+              <w:t>7</w:t>
             </w:r>
           </w:hyperlink>
         </w:p>
@@ -1661,7 +1590,13 @@
                 <w:color w:val="000000"/>
               </w:rPr>
               <w:tab/>
-              <w:t>1</w:t>
+            </w:r>
+            <w:r>
+              <w:rPr>
+                <w:rFonts w:hint="eastAsia"/>
+                <w:color w:val="000000"/>
+              </w:rPr>
+              <w:t>8</w:t>
             </w:r>
           </w:hyperlink>
           <w:r>
@@ -1691,6 +1626,21 @@
             </w:rPr>
             <w:t>Project Timeline</w:t>
           </w:r>
+          <w:hyperlink w:anchor="_heading=h.30j0zll">
+            <w:r>
+              <w:rPr>
+                <w:color w:val="000000"/>
+              </w:rPr>
+              <w:tab/>
+            </w:r>
+            <w:r>
+              <w:rPr>
+                <w:rFonts w:hint="eastAsia"/>
+                <w:color w:val="000000"/>
+              </w:rPr>
+              <w:t>8</w:t>
+            </w:r>
+          </w:hyperlink>
         </w:p>
         <w:p>
           <w:pPr>
@@ -1737,7 +1687,13 @@
                 <w:color w:val="000000"/>
               </w:rPr>
               <w:tab/>
-              <w:t>1</w:t>
+            </w:r>
+            <w:r>
+              <w:rPr>
+                <w:rFonts w:hint="eastAsia"/>
+                <w:color w:val="000000"/>
+              </w:rPr>
+              <w:t>9</w:t>
             </w:r>
           </w:hyperlink>
         </w:p>
@@ -2572,29 +2528,43 @@
     </w:p>
     <w:p>
       <w:pPr>
-        <w:pStyle w:val="1"/>
-      </w:pPr>
-      <w:r>
-        <w:rPr>
-          <w:rFonts w:hint="eastAsia"/>
-        </w:rPr>
-        <w:t>Aim and Objectives</w:t>
-      </w:r>
+        <w:rPr>
+          <w:rFonts w:eastAsia="맑은 고딕" w:cstheme="minorHAnsi"/>
+        </w:rPr>
+      </w:pPr>
     </w:p>
     <w:p>
-      <w:r>
-        <w:t>Analyze</w:t>
-      </w:r>
-      <w:r>
-        <w:t xml:space="preserve"> and estimate economic value and suitability of installing solar panel in Ireland, support potential user's decision making by developing a Web-Based Decision Support System (DSS) which provides necessary information and recommendation.</w:t>
-      </w:r>
+      <w:pPr>
+        <w:rPr>
+          <w:rFonts w:eastAsia="맑은 고딕" w:cstheme="minorHAnsi"/>
+        </w:rPr>
+      </w:pPr>
     </w:p>
     <w:p>
+      <w:pPr>
+        <w:pStyle w:val="1"/>
+      </w:pPr>
       <w:r>
         <w:rPr>
           <w:rFonts w:hint="eastAsia"/>
         </w:rPr>
         <w:lastRenderedPageBreak/>
+        <w:t>Aim and Objectives</w:t>
+      </w:r>
+    </w:p>
+    <w:p>
+      <w:r>
+        <w:t>Analyze</w:t>
+      </w:r>
+      <w:r>
+        <w:t xml:space="preserve"> and estimate economic value and suitability of installing solar panel in Ireland, support potential user's decision making by developing a Web-Based Decision Support System (DSS) which provides necessary information and recommendation.</w:t>
+      </w:r>
+    </w:p>
+    <w:p>
+      <w:r>
+        <w:rPr>
+          <w:rFonts w:hint="eastAsia"/>
+        </w:rPr>
         <w:t>1.</w:t>
       </w:r>
       <w:r>
@@ -3011,7 +2981,9 @@
     <w:p/>
     <w:p>
       <w:pPr>
-        <w:pStyle w:val="1"/>
+        <w:rPr>
+          <w:rFonts w:hint="eastAsia"/>
+        </w:rPr>
       </w:pPr>
     </w:p>
     <w:p>
@@ -3022,7 +2994,18 @@
         <w:rPr>
           <w:rFonts w:hint="eastAsia"/>
         </w:rPr>
+        <w:lastRenderedPageBreak/>
         <w:t>Methodology</w:t>
+      </w:r>
+    </w:p>
+    <w:p>
+      <w:pPr>
+        <w:rPr>
+          <w:rFonts w:eastAsia="맑은 고딕"/>
+        </w:rPr>
+      </w:pPr>
+      <w:r>
+        <w:t>The project will follow an iterative analytics workflow. First, review relevant literature and document assumptions. Next, clean and profile the BER data, assess missing values and inconsistent records, and use SQL/Pandas for aggregation and exploratory analysis. PVGIS will be queried through its API using location and specified system parameters to estimate annual and monthly generation. Where only a county is known, representative coordinates will be used and results labelled approximate. A financial model will calculate net upfront cost, annual bill savings, simple payback and NPV across conservative, base and optimistic scenarios. A logistic-regression baseline and, if data quality permits, a tree-based model will be evaluated using held-out data and suitable classification metrics. Because labels are generated by the financial model rather than observed household outcomes, this limitation will be reported. A dashboard will collect simple inputs and explain outputs and assumptions.</w:t>
       </w:r>
     </w:p>
     <w:p/>
@@ -3035,7 +3018,6 @@
         <w:rPr>
           <w:rFonts w:hint="eastAsia"/>
         </w:rPr>
-        <w:lastRenderedPageBreak/>
         <w:t>Data Sources</w:t>
       </w:r>
     </w:p>
@@ -3178,7 +3160,16 @@
         <w:rPr>
           <w:rFonts w:hint="eastAsia"/>
         </w:rPr>
+        <w:lastRenderedPageBreak/>
         <w:t>Expected Deliverables</w:t>
+      </w:r>
+    </w:p>
+    <w:p>
+      <w:r>
+        <w:t>By the end of Semester 2, deliverables will include: (1) a documented and cleaned analytical dataset or reproducible data pipeline; (2) SQL/Python exploratory analysis and regional/dwelling insights; (3) a working PVGIS API integration; (4) a transparent economic calculator with scenario and battery comparisons; (5) a baseline predictive model with evaluation and feature-importance/explanation outputs where appropriate; (6) a dashboard or interactive prototype providing an indicative recommendation and financial metrics; and (7) a final report documenting results, assumptions, limitations, ethics and recommendations.</w:t>
+      </w:r>
+      <w:r>
+        <w:t xml:space="preserve"> </w:t>
       </w:r>
     </w:p>
     <w:p/>

</xml_diff>

<commit_message>
done with expected deliverables
</commit_message>
<xml_diff>
--- a/sumi heo (2026324). strategic thinking ca1.docx
+++ b/sumi heo (2026324). strategic thinking ca1.docx
@@ -555,8 +555,19 @@
                 <w:sz w:val="32"/>
                 <w:szCs w:val="32"/>
               </w:rPr>
-              <w:t>Muhammad lqbal</w:t>
-            </w:r>
+              <w:t xml:space="preserve">Muhammad </w:t>
+            </w:r>
+            <w:proofErr w:type="spellStart"/>
+            <w:r>
+              <w:rPr>
+                <w:i/>
+                <w:color w:val="156082"/>
+                <w:sz w:val="32"/>
+                <w:szCs w:val="32"/>
+              </w:rPr>
+              <w:t>lqbal</w:t>
+            </w:r>
+            <w:proofErr w:type="spellEnd"/>
           </w:p>
         </w:tc>
         <w:tc>
@@ -1457,12 +1468,6 @@
               <w:tab w:val="right" w:leader="dot" w:pos="9016"/>
             </w:tabs>
             <w:spacing w:after="100"/>
-            <w:rPr>
-              <w:rFonts w:ascii="Aptos" w:hAnsi="Aptos" w:cs="Aptos"/>
-              <w:color w:val="000000"/>
-              <w:sz w:val="24"/>
-              <w:szCs w:val="24"/>
-            </w:rPr>
           </w:pPr>
           <w:r>
             <w:rPr>
@@ -1495,6 +1500,46 @@
                 <w:color w:val="000000"/>
               </w:rPr>
               <w:t>7</w:t>
+            </w:r>
+          </w:hyperlink>
+        </w:p>
+        <w:p>
+          <w:pPr>
+            <w:pBdr>
+              <w:top w:val="nil"/>
+              <w:left w:val="nil"/>
+              <w:bottom w:val="nil"/>
+              <w:right w:val="nil"/>
+              <w:between w:val="nil"/>
+            </w:pBdr>
+            <w:tabs>
+              <w:tab w:val="right" w:leader="dot" w:pos="9016"/>
+            </w:tabs>
+            <w:spacing w:after="100"/>
+            <w:ind w:left="220"/>
+            <w:rPr>
+              <w:rFonts w:hint="eastAsia"/>
+            </w:rPr>
+          </w:pPr>
+          <w:r>
+            <w:rPr>
+              <w:rFonts w:hint="eastAsia"/>
+            </w:rPr>
+            <w:t>6-1. High-Level architecture diagram</w:t>
+          </w:r>
+          <w:hyperlink w:anchor="_heading=h.30j0zll">
+            <w:r>
+              <w:rPr>
+                <w:color w:val="000000"/>
+              </w:rPr>
+              <w:tab/>
+            </w:r>
+            <w:r>
+              <w:rPr>
+                <w:rFonts w:hint="eastAsia"/>
+                <w:color w:val="000000"/>
+              </w:rPr>
+              <w:t>9</w:t>
             </w:r>
           </w:hyperlink>
         </w:p>
@@ -2999,13 +3044,27 @@
       </w:r>
     </w:p>
     <w:p>
-      <w:pPr>
+      <w:r>
+        <w:t>The project will follow an iterative analytics workflow. First, review relevant literature and document assumptions. Next, clean and profile the BER data, assess missing values and inconsistent records, and use SQL/Pandas for aggregation and exploratory analysis. PVGIS will be queried through its API using location and specified system parameters to estimate annual and monthly generation. Where only a county is known, representative coordinates will be used and results labelled approximate. A financial model will calculate net upfront cost, annual bill savings, simple payback and NPV across conservative, base and optimistic scenarios. A logistic-regression baseline and, if data quality permits, a tree-based model will be evaluated using held-out data and suitable classification metrics. Because labels are generated by the financial model rather than observed household outcomes, this limitation will be reported. A dashboard will collect simple inputs and explain outputs and assumptions.</w:t>
+      </w:r>
+    </w:p>
+    <w:p>
+      <w:pPr>
+        <w:pStyle w:val="2"/>
         <w:rPr>
           <w:rFonts w:eastAsia="맑은 고딕"/>
-        </w:rPr>
-      </w:pPr>
-      <w:r>
-        <w:t>The project will follow an iterative analytics workflow. First, review relevant literature and document assumptions. Next, clean and profile the BER data, assess missing values and inconsistent records, and use SQL/Pandas for aggregation and exploratory analysis. PVGIS will be queried through its API using location and specified system parameters to estimate annual and monthly generation. Where only a county is known, representative coordinates will be used and results labelled approximate. A financial model will calculate net upfront cost, annual bill savings, simple payback and NPV across conservative, base and optimistic scenarios. A logistic-regression baseline and, if data quality permits, a tree-based model will be evaluated using held-out data and suitable classification metrics. Because labels are generated by the financial model rather than observed household outcomes, this limitation will be reported. A dashboard will collect simple inputs and explain outputs and assumptions.</w:t>
+          <w:b/>
+          <w:bCs/>
+        </w:rPr>
+      </w:pPr>
+      <w:r>
+        <w:rPr>
+          <w:rStyle w:val="af0"/>
+          <w:rFonts w:asciiTheme="minorHAnsi" w:hAnsiTheme="minorHAnsi" w:cstheme="minorHAnsi"/>
+          <w:b w:val="0"/>
+          <w:bCs w:val="0"/>
+        </w:rPr>
+        <w:t>high-level architectural diagram</w:t>
       </w:r>
     </w:p>
     <w:p/>
@@ -3160,19 +3219,52 @@
         <w:rPr>
           <w:rFonts w:hint="eastAsia"/>
         </w:rPr>
-        <w:lastRenderedPageBreak/>
         <w:t>Expected Deliverables</w:t>
       </w:r>
     </w:p>
     <w:p>
-      <w:r>
-        <w:t>By the end of Semester 2, deliverables will include: (1) a documented and cleaned analytical dataset or reproducible data pipeline; (2) SQL/Python exploratory analysis and regional/dwelling insights; (3) a working PVGIS API integration; (4) a transparent economic calculator with scenario and battery comparisons; (5) a baseline predictive model with evaluation and feature-importance/explanation outputs where appropriate; (6) a dashboard or interactive prototype providing an indicative recommendation and financial metrics; and (7) a final report documenting results, assumptions, limitations, ethics and recommendations.</w:t>
-      </w:r>
-      <w:r>
-        <w:t xml:space="preserve"> </w:t>
-      </w:r>
-    </w:p>
-    <w:p/>
+      <w:pPr>
+        <w:rPr>
+          <w:rFonts w:hint="eastAsia"/>
+        </w:rPr>
+      </w:pPr>
+      <w:r>
+        <w:t xml:space="preserve">(1) Clean up SEAI BER data and handle missing values using Python. (2) Identify patterns, summarize statistics, and visualize </w:t>
+      </w:r>
+      <w:r>
+        <w:rPr>
+          <w:rFonts w:hint="eastAsia"/>
+        </w:rPr>
+        <w:t xml:space="preserve">with </w:t>
+      </w:r>
+      <w:r>
+        <w:t xml:space="preserve">extracted columns such as regional differences, housing </w:t>
+      </w:r>
+      <w:r>
+        <w:rPr>
+          <w:rFonts w:hint="eastAsia"/>
+        </w:rPr>
+        <w:t>features</w:t>
+      </w:r>
+      <w:r>
+        <w:t>, and BER grades that may be related to solar power suitability. (3) Compare the fit of the results with actual observed results using appropriate predictive modeling and metrics. (4) Estimate</w:t>
+      </w:r>
+      <w:r>
+        <w:rPr>
+          <w:rFonts w:hint="eastAsia"/>
+        </w:rPr>
+        <w:t xml:space="preserve"> results</w:t>
+      </w:r>
+      <w:r>
+        <w:t xml:space="preserve"> to determine what the actual economic outcomes are and what impact they have. (5)</w:t>
+      </w:r>
+      <w:r>
+        <w:rPr>
+          <w:rFonts w:hint="eastAsia"/>
+        </w:rPr>
+        <w:t xml:space="preserve"> Set the direction for future supplement </w:t>
+      </w:r>
+    </w:p>
     <w:p/>
     <w:p>
       <w:pPr>
@@ -3567,7 +3659,6 @@
         <w:rPr>
           <w:rFonts w:hint="eastAsia"/>
         </w:rPr>
-        <w:lastRenderedPageBreak/>
         <w:t>Gantt Chart</w:t>
       </w:r>
     </w:p>
@@ -3805,6 +3896,7 @@
       <w:bookmarkStart w:id="2" w:name="_heading=h.kfkjs3rwl2c1" w:colFirst="0" w:colLast="0"/>
       <w:bookmarkEnd w:id="2"/>
       <w:r>
+        <w:lastRenderedPageBreak/>
         <w:t>Appendix</w:t>
       </w:r>
     </w:p>
@@ -3838,19 +3930,7 @@
         <w:rPr>
           <w:rFonts w:eastAsia="맑은 고딕" w:cstheme="minorHAnsi" w:hint="eastAsia"/>
         </w:rPr>
-        <w:t xml:space="preserve"> (</w:t>
-      </w:r>
-      <w:r>
-        <w:rPr>
-          <w:rFonts w:eastAsia="맑은 고딕" w:cstheme="minorHAnsi"/>
-        </w:rPr>
-        <w:t>monthly</w:t>
-      </w:r>
-      <w:r>
-        <w:rPr>
-          <w:rFonts w:eastAsia="맑은 고딕" w:cstheme="minorHAnsi" w:hint="eastAsia"/>
-        </w:rPr>
-        <w:t xml:space="preserve"> installation from 2020 to 2025)</w:t>
+        <w:t xml:space="preserve"> </w:t>
       </w:r>
       <w:r>
         <w:rPr>
@@ -3963,24 +4043,6 @@
           <w:t>https://www.cso.ie/en/statistics/climate/sunshinebymeteorologicalweatherstation/?utm_source</w:t>
         </w:r>
       </w:hyperlink>
-      <w:r>
-        <w:rPr>
-          <w:rFonts w:eastAsia="맑은 고딕" w:cstheme="minorHAnsi" w:hint="eastAsia"/>
-        </w:rPr>
-        <w:t>(</w:t>
-      </w:r>
-      <w:r>
-        <w:rPr>
-          <w:rFonts w:eastAsia="맑은 고딕" w:cstheme="minorHAnsi"/>
-        </w:rPr>
-        <w:t>Total Sunshine per Month (Hours)</w:t>
-      </w:r>
-      <w:r>
-        <w:rPr>
-          <w:rFonts w:eastAsia="맑은 고딕" w:cstheme="minorHAnsi" w:hint="eastAsia"/>
-        </w:rPr>
-        <w:t>)</w:t>
-      </w:r>
     </w:p>
     <w:p/>
     <w:p>
@@ -4043,19 +4105,7 @@
         <w:rPr>
           <w:rFonts w:eastAsia="맑은 고딕" w:cstheme="minorHAnsi" w:hint="eastAsia"/>
         </w:rPr>
-        <w:t xml:space="preserve"> (sunshine </w:t>
-      </w:r>
-      <w:r>
-        <w:rPr>
-          <w:rFonts w:eastAsia="맑은 고딕" w:cstheme="minorHAnsi"/>
-        </w:rPr>
-        <w:t>comparison</w:t>
-      </w:r>
-      <w:r>
-        <w:rPr>
-          <w:rFonts w:eastAsia="맑은 고딕" w:cstheme="minorHAnsi" w:hint="eastAsia"/>
-        </w:rPr>
-        <w:t xml:space="preserve"> from 1990 to 2020)</w:t>
+        <w:t xml:space="preserve"> </w:t>
       </w:r>
     </w:p>
     <w:p>

</xml_diff>

<commit_message>
add high level architecture diagram
</commit_message>
<xml_diff>
--- a/sumi heo (2026324). strategic thinking ca1.docx
+++ b/sumi heo (2026324). strategic thinking ca1.docx
@@ -3044,17 +3044,165 @@
       </w:r>
     </w:p>
     <w:p>
-      <w:r>
-        <w:t>The project will follow an iterative analytics workflow. First, review relevant literature and document assumptions. Next, clean and profile the BER data, assess missing values and inconsistent records, and use SQL/Pandas for aggregation and exploratory analysis. PVGIS will be queried through its API using location and specified system parameters to estimate annual and monthly generation. Where only a county is known, representative coordinates will be used and results labelled approximate. A financial model will calculate net upfront cost, annual bill savings, simple payback and NPV across conservative, base and optimistic scenarios. A logistic-regression baseline and, if data quality permits, a tree-based model will be evaluated using held-out data and suitable classification metrics. Because labels are generated by the financial model rather than observed household outcomes, this limitation will be reported. A dashboard will collect simple inputs and explain outputs and assumptions.</w:t>
+      <w:pPr>
+        <w:rPr>
+          <w:rFonts w:eastAsia="맑은 고딕"/>
+        </w:rPr>
+      </w:pPr>
+      <w:r>
+        <w:rPr>
+          <w:rFonts w:eastAsia="맑은 고딕"/>
+        </w:rPr>
+        <w:t>D</w:t>
+      </w:r>
+      <w:r>
+        <w:rPr>
+          <w:rFonts w:eastAsia="맑은 고딕" w:hint="eastAsia"/>
+        </w:rPr>
+        <w:t xml:space="preserve">ata collection and </w:t>
+      </w:r>
+      <w:r>
+        <w:rPr>
+          <w:rFonts w:eastAsia="맑은 고딕"/>
+        </w:rPr>
+        <w:t>preparation:</w:t>
+      </w:r>
+      <w:r>
+        <w:rPr>
+          <w:rFonts w:eastAsia="맑은 고딕" w:hint="eastAsia"/>
+        </w:rPr>
+        <w:t xml:space="preserve"> collect data from SEAI. Python will be used to clean the data and </w:t>
+      </w:r>
+      <w:r>
+        <w:rPr>
+          <w:rFonts w:eastAsia="맑은 고딕"/>
+        </w:rPr>
+        <w:t>handle</w:t>
+      </w:r>
+      <w:r>
+        <w:rPr>
+          <w:rFonts w:eastAsia="맑은 고딕" w:hint="eastAsia"/>
+        </w:rPr>
+        <w:t xml:space="preserve"> missing values. </w:t>
       </w:r>
     </w:p>
     <w:p>
       <w:pPr>
+        <w:rPr>
+          <w:rFonts w:eastAsia="맑은 고딕" w:hint="eastAsia"/>
+        </w:rPr>
+      </w:pPr>
+      <w:r>
+        <w:rPr>
+          <w:rFonts w:eastAsia="맑은 고딕" w:hint="eastAsia"/>
+        </w:rPr>
+        <w:t xml:space="preserve">Economic analysis by estimating the potential costs and benefit. The model will calculate </w:t>
+      </w:r>
+      <w:r>
+        <w:rPr>
+          <w:rFonts w:eastAsia="맑은 고딕"/>
+        </w:rPr>
+        <w:t>estimated</w:t>
+      </w:r>
+      <w:r>
+        <w:rPr>
+          <w:rFonts w:eastAsia="맑은 고딕" w:hint="eastAsia"/>
+        </w:rPr>
+        <w:t xml:space="preserve"> annual savings, payback period, NPV and estimated annual power generation. A</w:t>
+      </w:r>
+      <w:r>
+        <w:rPr>
+          <w:rFonts w:eastAsia="맑은 고딕"/>
+        </w:rPr>
+        <w:t>n</w:t>
+      </w:r>
+      <w:r>
+        <w:rPr>
+          <w:rFonts w:eastAsia="맑은 고딕" w:hint="eastAsia"/>
+        </w:rPr>
+        <w:t xml:space="preserve">d Using specific Machine </w:t>
+      </w:r>
+      <w:r>
+        <w:rPr>
+          <w:rFonts w:eastAsia="맑은 고딕"/>
+        </w:rPr>
+        <w:t>Learning</w:t>
+      </w:r>
+      <w:r>
+        <w:rPr>
+          <w:rFonts w:eastAsia="맑은 고딕" w:hint="eastAsia"/>
+        </w:rPr>
+        <w:t xml:space="preserve"> model such as </w:t>
+      </w:r>
+      <w:r>
+        <w:rPr>
+          <w:rFonts w:eastAsia="맑은 고딕"/>
+        </w:rPr>
+        <w:t>decision</w:t>
+      </w:r>
+      <w:r>
+        <w:rPr>
+          <w:rFonts w:eastAsia="맑은 고딕" w:hint="eastAsia"/>
+        </w:rPr>
+        <w:t xml:space="preserve"> tree will classify financial suitability using </w:t>
+      </w:r>
+      <w:r>
+        <w:rPr>
+          <w:rFonts w:eastAsia="맑은 고딕"/>
+        </w:rPr>
+        <w:t>categories (option</w:t>
+      </w:r>
+      <w:r>
+        <w:rPr>
+          <w:rFonts w:eastAsia="맑은 고딕" w:hint="eastAsia"/>
+        </w:rPr>
+        <w:t xml:space="preserve"> in DSS that user can select). Finally, make </w:t>
+      </w:r>
+      <w:r>
+        <w:rPr>
+          <w:rFonts w:eastAsia="맑은 고딕"/>
+        </w:rPr>
+        <w:t>Web-Based Decision Support System</w:t>
+      </w:r>
+      <w:r>
+        <w:rPr>
+          <w:rFonts w:eastAsia="맑은 고딕" w:hint="eastAsia"/>
+        </w:rPr>
+        <w:t xml:space="preserve"> that allows users to </w:t>
+      </w:r>
+      <w:r>
+        <w:rPr>
+          <w:rFonts w:eastAsia="맑은 고딕"/>
+        </w:rPr>
+        <w:t>receive</w:t>
+      </w:r>
+      <w:r>
+        <w:rPr>
+          <w:rFonts w:eastAsia="맑은 고딕" w:hint="eastAsia"/>
+        </w:rPr>
+        <w:t xml:space="preserve"> information and make decision of installing solar PV by recommendation. It will make results accessible to non </w:t>
+      </w:r>
+      <w:r>
+        <w:rPr>
+          <w:rFonts w:eastAsia="맑은 고딕"/>
+        </w:rPr>
+        <w:t>–</w:t>
+      </w:r>
+      <w:r>
+        <w:rPr>
+          <w:rFonts w:eastAsia="맑은 고딕" w:hint="eastAsia"/>
+        </w:rPr>
+        <w:t xml:space="preserve"> technical user.</w:t>
+      </w:r>
+    </w:p>
+    <w:p>
+      <w:pPr>
         <w:pStyle w:val="2"/>
         <w:rPr>
-          <w:rFonts w:eastAsia="맑은 고딕"/>
-          <w:b/>
-          <w:bCs/>
+          <w:rStyle w:val="af0"/>
+          <w:rFonts w:asciiTheme="minorHAnsi" w:hAnsiTheme="minorHAnsi" w:cstheme="minorHAnsi" w:hint="eastAsia"/>
+          <w:b w:val="0"/>
+          <w:bCs w:val="0"/>
         </w:rPr>
       </w:pPr>
       <w:r>
@@ -3064,11 +3212,74 @@
           <w:b w:val="0"/>
           <w:bCs w:val="0"/>
         </w:rPr>
+        <w:lastRenderedPageBreak/>
         <w:t>high-level architectural diagram</w:t>
+      </w:r>
+      <w:r>
+        <w:rPr>
+          <w:rStyle w:val="af0"/>
+          <w:rFonts w:asciiTheme="minorHAnsi" w:hAnsiTheme="minorHAnsi" w:cstheme="minorHAnsi" w:hint="eastAsia"/>
+          <w:b w:val="0"/>
+          <w:bCs w:val="0"/>
+        </w:rPr>
+        <w:t xml:space="preserve"> </w:t>
+      </w:r>
+    </w:p>
+    <w:p>
+      <w:r>
+        <w:drawing>
+          <wp:inline distT="0" distB="0" distL="0" distR="0" wp14:anchorId="1C6EF98B" wp14:editId="02ED3694">
+            <wp:extent cx="5731510" cy="5212715"/>
+            <wp:effectExtent l="0" t="0" r="0" b="0"/>
+            <wp:docPr id="1818918426" name="그림 6"/>
+            <wp:cNvGraphicFramePr>
+              <a:graphicFrameLocks xmlns:a="http://schemas.openxmlformats.org/drawingml/2006/main" noChangeAspect="1"/>
+            </wp:cNvGraphicFramePr>
+            <a:graphic xmlns:a="http://schemas.openxmlformats.org/drawingml/2006/main">
+              <a:graphicData uri="http://schemas.openxmlformats.org/drawingml/2006/picture">
+                <pic:pic xmlns:pic="http://schemas.openxmlformats.org/drawingml/2006/picture">
+                  <pic:nvPicPr>
+                    <pic:cNvPr id="0" name="Picture 6"/>
+                    <pic:cNvPicPr>
+                      <a:picLocks noChangeAspect="1" noChangeArrowheads="1"/>
+                    </pic:cNvPicPr>
+                  </pic:nvPicPr>
+                  <pic:blipFill>
+                    <a:blip r:embed="rId17" cstate="print">
+                      <a:extLst>
+                        <a:ext uri="{28A0092B-C50C-407E-A947-70E740481C1C}">
+                          <a14:useLocalDpi xmlns:a14="http://schemas.microsoft.com/office/drawing/2010/main" val="0"/>
+                        </a:ext>
+                      </a:extLst>
+                    </a:blip>
+                    <a:srcRect/>
+                    <a:stretch>
+                      <a:fillRect/>
+                    </a:stretch>
+                  </pic:blipFill>
+                  <pic:spPr bwMode="auto">
+                    <a:xfrm>
+                      <a:off x="0" y="0"/>
+                      <a:ext cx="5731510" cy="5212715"/>
+                    </a:xfrm>
+                    <a:prstGeom prst="rect">
+                      <a:avLst/>
+                    </a:prstGeom>
+                    <a:noFill/>
+                    <a:ln>
+                      <a:noFill/>
+                    </a:ln>
+                  </pic:spPr>
+                </pic:pic>
+              </a:graphicData>
+            </a:graphic>
+          </wp:inline>
+        </w:drawing>
       </w:r>
     </w:p>
     <w:p/>
     <w:p/>
+    <w:p/>
     <w:p>
       <w:pPr>
         <w:pStyle w:val="1"/>
@@ -3122,7 +3333,11 @@
         <w:t xml:space="preserve"> hard </w:t>
       </w:r>
       <w:r>
-        <w:t>to analyze</w:t>
+        <w:t xml:space="preserve">to </w:t>
+      </w:r>
+      <w:r>
+        <w:lastRenderedPageBreak/>
+        <w:t>analyze</w:t>
       </w:r>
       <w:r>
         <w:rPr>
@@ -3659,6 +3874,7 @@
         <w:rPr>
           <w:rFonts w:hint="eastAsia"/>
         </w:rPr>
+        <w:lastRenderedPageBreak/>
         <w:t>Gantt Chart</w:t>
       </w:r>
     </w:p>
@@ -3685,7 +3901,7 @@
                     </pic:cNvPicPr>
                   </pic:nvPicPr>
                   <pic:blipFill>
-                    <a:blip r:embed="rId17">
+                    <a:blip r:embed="rId18">
                       <a:extLst>
                         <a:ext uri="{28A0092B-C50C-407E-A947-70E740481C1C}">
                           <a14:useLocalDpi xmlns:a14="http://schemas.microsoft.com/office/drawing/2010/main" val="0"/>
@@ -3839,7 +4055,7 @@
       </w:r>
     </w:p>
     <w:p>
-      <w:hyperlink r:id="rId18" w:history="1">
+      <w:hyperlink r:id="rId19" w:history="1">
         <w:r>
           <w:rPr>
             <w:rStyle w:val="aa"/>
@@ -3849,7 +4065,7 @@
       </w:hyperlink>
     </w:p>
     <w:p>
-      <w:hyperlink r:id="rId19" w:history="1">
+      <w:hyperlink r:id="rId20" w:history="1">
         <w:r>
           <w:rPr>
             <w:rStyle w:val="aa"/>
@@ -3859,7 +4075,7 @@
       </w:hyperlink>
     </w:p>
     <w:p>
-      <w:hyperlink r:id="rId20" w:history="1">
+      <w:hyperlink r:id="rId21" w:history="1">
         <w:r>
           <w:rPr>
             <w:rStyle w:val="aa"/>
@@ -3869,7 +4085,7 @@
       </w:hyperlink>
     </w:p>
     <w:p>
-      <w:hyperlink r:id="rId21" w:history="1">
+      <w:hyperlink r:id="rId22" w:history="1">
         <w:r>
           <w:rPr>
             <w:rStyle w:val="aa"/>
@@ -3896,7 +4112,6 @@
       <w:bookmarkStart w:id="2" w:name="_heading=h.kfkjs3rwl2c1" w:colFirst="0" w:colLast="0"/>
       <w:bookmarkEnd w:id="2"/>
       <w:r>
-        <w:lastRenderedPageBreak/>
         <w:t>Appendix</w:t>
       </w:r>
     </w:p>
@@ -3917,7 +4132,7 @@
           <w:rFonts w:eastAsia="맑은 고딕" w:cstheme="minorHAnsi"/>
         </w:rPr>
       </w:pPr>
-      <w:hyperlink r:id="rId22" w:history="1">
+      <w:hyperlink r:id="rId23" w:history="1">
         <w:r>
           <w:rPr>
             <w:rStyle w:val="aa"/>
@@ -3960,7 +4175,7 @@
                     <pic:cNvPicPr/>
                   </pic:nvPicPr>
                   <pic:blipFill>
-                    <a:blip r:embed="rId23">
+                    <a:blip r:embed="rId24">
                       <a:extLst>
                         <a:ext uri="{28A0092B-C50C-407E-A947-70E740481C1C}">
                           <a14:useLocalDpi xmlns:a14="http://schemas.microsoft.com/office/drawing/2010/main" val="0"/>
@@ -4014,7 +4229,7 @@
                     <pic:cNvPicPr/>
                   </pic:nvPicPr>
                   <pic:blipFill>
-                    <a:blip r:embed="rId24"/>
+                    <a:blip r:embed="rId25"/>
                     <a:stretch>
                       <a:fillRect/>
                     </a:stretch>
@@ -4034,7 +4249,7 @@
           </wp:inline>
         </w:drawing>
       </w:r>
-      <w:hyperlink r:id="rId25" w:history="1">
+      <w:hyperlink r:id="rId26" w:history="1">
         <w:r>
           <w:rPr>
             <w:rStyle w:val="aa"/>
@@ -4072,7 +4287,7 @@
                     <pic:cNvPicPr/>
                   </pic:nvPicPr>
                   <pic:blipFill>
-                    <a:blip r:embed="rId26"/>
+                    <a:blip r:embed="rId27"/>
                     <a:stretch>
                       <a:fillRect/>
                     </a:stretch>
@@ -4092,7 +4307,7 @@
           </wp:inline>
         </w:drawing>
       </w:r>
-      <w:hyperlink r:id="rId27" w:history="1">
+      <w:hyperlink r:id="rId28" w:history="1">
         <w:r>
           <w:rPr>
             <w:rStyle w:val="aa"/>
@@ -4152,7 +4367,7 @@
                     <pic:cNvPicPr/>
                   </pic:nvPicPr>
                   <pic:blipFill>
-                    <a:blip r:embed="rId28"/>
+                    <a:blip r:embed="rId29"/>
                     <a:stretch>
                       <a:fillRect/>
                     </a:stretch>
@@ -4189,7 +4404,7 @@
                     <pic:cNvPicPr/>
                   </pic:nvPicPr>
                   <pic:blipFill>
-                    <a:blip r:embed="rId29"/>
+                    <a:blip r:embed="rId30"/>
                     <a:stretch>
                       <a:fillRect/>
                     </a:stretch>
@@ -4236,7 +4451,7 @@
                     <pic:cNvPicPr/>
                   </pic:nvPicPr>
                   <pic:blipFill>
-                    <a:blip r:embed="rId30"/>
+                    <a:blip r:embed="rId31"/>
                     <a:stretch>
                       <a:fillRect/>
                     </a:stretch>
@@ -4282,7 +4497,7 @@
                     <pic:cNvPicPr/>
                   </pic:nvPicPr>
                   <pic:blipFill>
-                    <a:blip r:embed="rId31"/>
+                    <a:blip r:embed="rId32"/>
                     <a:stretch>
                       <a:fillRect/>
                     </a:stretch>
@@ -4325,7 +4540,7 @@
                     <pic:cNvPicPr/>
                   </pic:nvPicPr>
                   <pic:blipFill>
-                    <a:blip r:embed="rId32"/>
+                    <a:blip r:embed="rId33"/>
                     <a:stretch>
                       <a:fillRect/>
                     </a:stretch>
@@ -4334,6 +4549,53 @@
                     <a:xfrm>
                       <a:off x="0" y="0"/>
                       <a:ext cx="5731510" cy="3613785"/>
+                    </a:xfrm>
+                    <a:prstGeom prst="rect">
+                      <a:avLst/>
+                    </a:prstGeom>
+                  </pic:spPr>
+                </pic:pic>
+              </a:graphicData>
+            </a:graphic>
+          </wp:inline>
+        </w:drawing>
+      </w:r>
+      <w:r>
+        <w:rPr>
+          <w:noProof/>
+        </w:rPr>
+        <w:t xml:space="preserve"> </w:t>
+      </w:r>
+      <w:r>
+        <w:rPr>
+          <w:noProof/>
+        </w:rPr>
+        <w:lastRenderedPageBreak/>
+        <w:drawing>
+          <wp:inline distT="0" distB="0" distL="0" distR="0" wp14:anchorId="40261329" wp14:editId="68F465AB">
+            <wp:extent cx="5731510" cy="3426460"/>
+            <wp:effectExtent l="0" t="0" r="2540" b="2540"/>
+            <wp:docPr id="149726949" name="그림 1"/>
+            <wp:cNvGraphicFramePr>
+              <a:graphicFrameLocks xmlns:a="http://schemas.openxmlformats.org/drawingml/2006/main" noChangeAspect="1"/>
+            </wp:cNvGraphicFramePr>
+            <a:graphic xmlns:a="http://schemas.openxmlformats.org/drawingml/2006/main">
+              <a:graphicData uri="http://schemas.openxmlformats.org/drawingml/2006/picture">
+                <pic:pic xmlns:pic="http://schemas.openxmlformats.org/drawingml/2006/picture">
+                  <pic:nvPicPr>
+                    <pic:cNvPr id="149726949" name=""/>
+                    <pic:cNvPicPr/>
+                  </pic:nvPicPr>
+                  <pic:blipFill>
+                    <a:blip r:embed="rId34"/>
+                    <a:stretch>
+                      <a:fillRect/>
+                    </a:stretch>
+                  </pic:blipFill>
+                  <pic:spPr>
+                    <a:xfrm>
+                      <a:off x="0" y="0"/>
+                      <a:ext cx="5731510" cy="3426460"/>
                     </a:xfrm>
                     <a:prstGeom prst="rect">
                       <a:avLst/>

</xml_diff>

<commit_message>
final checking + add github link
</commit_message>
<xml_diff>
--- a/sumi heo (2026324). strategic thinking ca1.docx
+++ b/sumi heo (2026324). strategic thinking ca1.docx
@@ -643,7 +643,17 @@
                 <w:szCs w:val="32"/>
               </w:rPr>
               <w:lastRenderedPageBreak/>
-              <w:t>26</w:t>
+              <w:t>2</w:t>
+            </w:r>
+            <w:r>
+              <w:rPr>
+                <w:rFonts w:hint="eastAsia"/>
+                <w:i/>
+                <w:color w:val="156082"/>
+                <w:sz w:val="32"/>
+                <w:szCs w:val="32"/>
+              </w:rPr>
+              <w:t>5</w:t>
             </w:r>
             <w:r>
               <w:rPr>
@@ -757,7 +767,7 @@
                 <w:sz w:val="32"/>
                 <w:szCs w:val="32"/>
               </w:rPr>
-              <w:t>5</w:t>
+              <w:t>3</w:t>
             </w:r>
             <w:r>
               <w:rPr>
@@ -869,31 +879,17 @@
           <w:sz w:val="28"/>
           <w:szCs w:val="28"/>
         </w:rPr>
-        <w:t xml:space="preserve">getting additional </w:t>
-      </w:r>
-      <w:proofErr w:type="gramStart"/>
-      <w:r>
+        <w:t>getting additional idea for my project.</w:t>
+      </w:r>
+    </w:p>
+    <w:p>
+      <w:pPr>
         <w:rPr>
           <w:rFonts w:hint="eastAsia"/>
           <w:b/>
           <w:sz w:val="28"/>
           <w:szCs w:val="28"/>
         </w:rPr>
-        <w:t>idea</w:t>
-      </w:r>
-      <w:proofErr w:type="gramEnd"/>
-      <w:r>
-        <w:rPr>
-          <w:rFonts w:hint="eastAsia"/>
-          <w:b/>
-          <w:sz w:val="28"/>
-          <w:szCs w:val="28"/>
-        </w:rPr>
-        <w:t xml:space="preserve"> for my project.</w:t>
-      </w:r>
-    </w:p>
-    <w:p>
-      <w:pPr>
         <w:sectPr>
           <w:headerReference w:type="default" r:id="rId9"/>
           <w:pgSz w:w="11906" w:h="16838"/>
@@ -902,6 +898,17 @@
           <w:cols w:space="720"/>
         </w:sectPr>
       </w:pPr>
+      <w:hyperlink r:id="rId10" w:history="1">
+        <w:r>
+          <w:rPr>
+            <w:rStyle w:val="aa"/>
+            <w:b/>
+            <w:sz w:val="28"/>
+            <w:szCs w:val="28"/>
+          </w:rPr>
+          <w:t>https://github.com/2026324-cmd/strategic-thinking</w:t>
+        </w:r>
+      </w:hyperlink>
       <w:r>
         <w:rPr>
           <w:noProof/>
@@ -973,23 +980,7 @@
                                 <w:color w:val="000000"/>
                                 <w:sz w:val="28"/>
                               </w:rPr>
-                              <w:t xml:space="preserve">By submitting this assessment, I confirm that I have read the CCT policy on academic misconduct and understand the implications of submitting work that is not my own or does not appropriately reference material </w:t>
-                            </w:r>
-                            <w:proofErr w:type="gramStart"/>
-                            <w:r>
-                              <w:rPr>
-                                <w:color w:val="000000"/>
-                                <w:sz w:val="28"/>
-                              </w:rPr>
-                              <w:t>taken</w:t>
-                            </w:r>
-                            <w:proofErr w:type="gramEnd"/>
-                            <w:r>
-                              <w:rPr>
-                                <w:color w:val="000000"/>
-                                <w:sz w:val="28"/>
-                              </w:rPr>
-                              <w:t xml:space="preserve"> from a third party or other source. </w:t>
+                              <w:t xml:space="preserve">By submitting this assessment, I confirm that I have read the CCT policy on academic misconduct and understand the implications of submitting work that is not my own or does not appropriately reference material taken from a third party or other source. </w:t>
                             </w:r>
                           </w:p>
                           <w:p>
@@ -1015,23 +1006,7 @@
                                 <w:color w:val="000000"/>
                                 <w:sz w:val="28"/>
                               </w:rPr>
-                              <w:t xml:space="preserve"> I further confirm that this work has not previously been submitted for assessment by myself or someone else </w:t>
-                            </w:r>
-                            <w:proofErr w:type="gramStart"/>
-                            <w:r>
-                              <w:rPr>
-                                <w:color w:val="000000"/>
-                                <w:sz w:val="28"/>
-                              </w:rPr>
-                              <w:t>in</w:t>
-                            </w:r>
-                            <w:proofErr w:type="gramEnd"/>
-                            <w:r>
-                              <w:rPr>
-                                <w:color w:val="000000"/>
-                                <w:sz w:val="28"/>
-                              </w:rPr>
-                              <w:t xml:space="preserve"> CCT College Dublin or any other higher education institution.</w:t>
+                              <w:t xml:space="preserve"> I further confirm that this work has not previously been submitted for assessment by myself or someone else in CCT College Dublin or any other higher education institution.</w:t>
                             </w:r>
                           </w:p>
                         </w:txbxContent>
@@ -1112,8 +1087,16 @@
           </mc:Fallback>
         </mc:AlternateContent>
       </w:r>
+      <w:r>
+        <w:rPr>
+          <w:rFonts w:hint="eastAsia"/>
+          <w:b/>
+          <w:sz w:val="28"/>
+          <w:szCs w:val="28"/>
+        </w:rPr>
+        <w:t xml:space="preserve"> </w:t>
+      </w:r>
     </w:p>
-    <w:p/>
     <w:p>
       <w:pPr>
         <w:keepNext/>
@@ -1140,6 +1123,7 @@
           <w:sz w:val="32"/>
           <w:szCs w:val="32"/>
         </w:rPr>
+        <w:lastRenderedPageBreak/>
         <w:t>Contents</w:t>
       </w:r>
     </w:p>
@@ -1487,7 +1471,7 @@
                 <w:rFonts w:hint="eastAsia"/>
                 <w:color w:val="000000"/>
               </w:rPr>
-              <w:t>6</w:t>
+              <w:t>7</w:t>
             </w:r>
           </w:hyperlink>
         </w:p>
@@ -1572,7 +1556,7 @@
                 <w:rFonts w:hint="eastAsia"/>
                 <w:color w:val="000000"/>
               </w:rPr>
-              <w:t>7</w:t>
+              <w:t>8</w:t>
             </w:r>
           </w:hyperlink>
         </w:p>
@@ -1674,7 +1658,7 @@
                 <w:rFonts w:hint="eastAsia"/>
                 <w:color w:val="000000"/>
               </w:rPr>
-              <w:t>8</w:t>
+              <w:t>9</w:t>
             </w:r>
           </w:hyperlink>
           <w:r>
@@ -1771,7 +1755,7 @@
                 <w:rFonts w:hint="eastAsia"/>
                 <w:color w:val="000000"/>
               </w:rPr>
-              <w:t>9</w:t>
+              <w:t>10</w:t>
             </w:r>
           </w:hyperlink>
         </w:p>
@@ -1819,7 +1803,7 @@
                 <w:rFonts w:hint="eastAsia"/>
                 <w:color w:val="000000"/>
               </w:rPr>
-              <w:t>9</w:t>
+              <w:t>10</w:t>
             </w:r>
           </w:hyperlink>
         </w:p>
@@ -1957,7 +1941,14 @@
                 <w:rFonts w:hint="eastAsia"/>
                 <w:color w:val="000000"/>
               </w:rPr>
-              <w:t>15</w:t>
+              <w:t>1</w:t>
+            </w:r>
+            <w:r>
+              <w:rPr>
+                <w:rFonts w:hint="eastAsia"/>
+                <w:color w:val="000000"/>
+              </w:rPr>
+              <w:t>6</w:t>
             </w:r>
           </w:hyperlink>
         </w:p>
@@ -1969,11 +1960,10 @@
       </w:sdtContent>
     </w:sdt>
     <w:p/>
-    <w:p/>
     <w:p>
       <w:pPr>
         <w:sectPr>
-          <w:footerReference w:type="default" r:id="rId10"/>
+          <w:footerReference w:type="default" r:id="rId11"/>
           <w:pgSz w:w="11906" w:h="16838"/>
           <w:pgMar w:top="1440" w:right="1440" w:bottom="1440" w:left="1440" w:header="708" w:footer="708" w:gutter="0"/>
           <w:cols w:space="720"/>
@@ -2343,34 +2333,6 @@
           <w:rFonts w:hint="eastAsia"/>
         </w:rPr>
         <w:t>Excerpt</w:t>
-      </w:r>
-    </w:p>
-    <w:p>
-      <w:pPr>
-        <w:rPr>
-          <w:rFonts w:eastAsia="맑은 고딕" w:cstheme="minorHAnsi"/>
-        </w:rPr>
-      </w:pPr>
-      <w:hyperlink r:id="rId11" w:history="1">
-        <w:r>
-          <w:rPr>
-            <w:rStyle w:val="aa"/>
-            <w:rFonts w:eastAsia="맑은 고딕" w:cstheme="minorHAnsi"/>
-          </w:rPr>
-          <w:t>https://energyefficiency.ie/wp-content/uploads/2026/04/Residential-Solar-Panel-Report-2026.pdf?utm_source</w:t>
-        </w:r>
-      </w:hyperlink>
-      <w:r>
-        <w:rPr>
-          <w:rFonts w:eastAsia="맑은 고딕" w:cstheme="minorHAnsi" w:hint="eastAsia"/>
-        </w:rPr>
-        <w:t xml:space="preserve"> </w:t>
-      </w:r>
-      <w:r>
-        <w:rPr>
-          <w:rFonts w:eastAsia="맑은 고딕" w:cstheme="minorHAnsi" w:hint="eastAsia"/>
-        </w:rPr>
-        <w:t xml:space="preserve"> - Appendix</w:t>
       </w:r>
     </w:p>
     <w:p>
@@ -2385,38 +2347,20 @@
             <w:rStyle w:val="aa"/>
             <w:rFonts w:eastAsia="맑은 고딕" w:cstheme="minorHAnsi"/>
           </w:rPr>
-          <w:t>https://www.seai.ie/data-and-insights/seai-statistics/key-publications/energy-in-ireland?trk=article-ssr-frontend-pulse_little-text-block&amp;utm_source</w:t>
+          <w:t>https://energyefficiency.ie/wp-content/uploads/2026/04/Residential-Solar-Panel-Report-2026.pdf</w:t>
         </w:r>
       </w:hyperlink>
       <w:r>
         <w:rPr>
           <w:rFonts w:eastAsia="맑은 고딕" w:cstheme="minorHAnsi" w:hint="eastAsia"/>
         </w:rPr>
-        <w:t xml:space="preserve"> (</w:t>
-      </w:r>
-      <w:r>
-        <w:rPr>
-          <w:rFonts w:eastAsia="맑은 고딕" w:cstheme="minorHAnsi"/>
-        </w:rPr>
-        <w:t>‘</w:t>
-      </w:r>
-      <w:r>
-        <w:rPr>
-          <w:rFonts w:eastAsia="맑은 고딕" w:cstheme="minorHAnsi"/>
-        </w:rPr>
-        <w:t>Solar PV generation was up 69% and ambient heat capture from heat-pumps was up 19% in 2024.</w:t>
-      </w:r>
-      <w:r>
-        <w:rPr>
-          <w:rFonts w:eastAsia="맑은 고딕" w:cstheme="minorHAnsi"/>
-        </w:rPr>
-        <w:t>’</w:t>
+        <w:t xml:space="preserve"> </w:t>
       </w:r>
       <w:r>
         <w:rPr>
           <w:rFonts w:eastAsia="맑은 고딕" w:cstheme="minorHAnsi" w:hint="eastAsia"/>
         </w:rPr>
-        <w:t>)</w:t>
+        <w:t xml:space="preserve"> - Appendix</w:t>
       </w:r>
     </w:p>
     <w:p>
@@ -2431,26 +2375,38 @@
             <w:rStyle w:val="aa"/>
             <w:rFonts w:eastAsia="맑은 고딕" w:cstheme="minorHAnsi"/>
           </w:rPr>
-          <w:t>https://www.met.ie/cms/assets/uploads/2023/07/Irelands-Climate-Averages-1991_2020.pdf?utm_source</w:t>
+          <w:t>https://www.seai.ie/data-and-insights/seai-statistics/key-publications/energy-in-ireland?trk=article-ssr-frontend-pulse_little-text-block</w:t>
         </w:r>
       </w:hyperlink>
       <w:r>
         <w:rPr>
           <w:rFonts w:eastAsia="맑은 고딕" w:cstheme="minorHAnsi" w:hint="eastAsia"/>
         </w:rPr>
-        <w:t xml:space="preserve"> (sunshine </w:t>
+        <w:t xml:space="preserve"> (</w:t>
       </w:r>
       <w:r>
         <w:rPr>
           <w:rFonts w:eastAsia="맑은 고딕" w:cstheme="minorHAnsi"/>
         </w:rPr>
-        <w:t>comparison</w:t>
+        <w:t>‘</w:t>
+      </w:r>
+      <w:r>
+        <w:rPr>
+          <w:rFonts w:eastAsia="맑은 고딕" w:cstheme="minorHAnsi"/>
+        </w:rPr>
+        <w:t>Solar PV generation was up 69% and ambient heat capture from heat-pumps was up 19% in 2024.</w:t>
+      </w:r>
+      <w:r>
+        <w:rPr>
+          <w:rFonts w:eastAsia="맑은 고딕" w:cstheme="minorHAnsi"/>
+        </w:rPr>
+        <w:t>’</w:t>
       </w:r>
       <w:r>
         <w:rPr>
           <w:rFonts w:eastAsia="맑은 고딕" w:cstheme="minorHAnsi" w:hint="eastAsia"/>
         </w:rPr>
-        <w:t xml:space="preserve"> from 1990 to 2020)</w:t>
+        <w:t>)</w:t>
       </w:r>
     </w:p>
     <w:p>
@@ -2465,20 +2421,26 @@
             <w:rStyle w:val="aa"/>
             <w:rFonts w:eastAsia="맑은 고딕" w:cstheme="minorHAnsi"/>
           </w:rPr>
-          <w:t>https://www.cso.ie/en/statistics/climate/sunshinebymeteorologicalweatherstation/?utm_source</w:t>
+          <w:t>https://www.met.ie/cms/assets/uploads/2023/07/Irelands-Climate-Averages-1991_2020.pdf</w:t>
         </w:r>
       </w:hyperlink>
       <w:r>
         <w:rPr>
           <w:rFonts w:eastAsia="맑은 고딕" w:cstheme="minorHAnsi" w:hint="eastAsia"/>
         </w:rPr>
-        <w:t xml:space="preserve"> </w:t>
+        <w:t xml:space="preserve"> (sunshine </w:t>
+      </w:r>
+      <w:r>
+        <w:rPr>
+          <w:rFonts w:eastAsia="맑은 고딕" w:cstheme="minorHAnsi"/>
+        </w:rPr>
+        <w:t>comparison</w:t>
       </w:r>
       <w:r>
         <w:rPr>
           <w:rFonts w:eastAsia="맑은 고딕" w:cstheme="minorHAnsi" w:hint="eastAsia"/>
         </w:rPr>
-        <w:t>- Appendix</w:t>
+        <w:t xml:space="preserve"> from 1990 to 2020)</w:t>
       </w:r>
     </w:p>
     <w:p>
@@ -2493,7 +2455,7 @@
             <w:rStyle w:val="aa"/>
             <w:rFonts w:eastAsia="맑은 고딕" w:cstheme="minorHAnsi"/>
           </w:rPr>
-          <w:t>https://www.met.ie/annual-climate-statement-for-2025?utm_source</w:t>
+          <w:t>https://www.cso.ie/en/statistics/climate/sunshinebymeteorologicalweatherstation/</w:t>
         </w:r>
       </w:hyperlink>
       <w:r>
@@ -2501,6 +2463,18 @@
           <w:rFonts w:eastAsia="맑은 고딕" w:cstheme="minorHAnsi" w:hint="eastAsia"/>
         </w:rPr>
         <w:t xml:space="preserve"> </w:t>
+      </w:r>
+      <w:r>
+        <w:rPr>
+          <w:rFonts w:eastAsia="맑은 고딕" w:cstheme="minorHAnsi" w:hint="eastAsia"/>
+        </w:rPr>
+        <w:t xml:space="preserve"> </w:t>
+      </w:r>
+      <w:r>
+        <w:rPr>
+          <w:rFonts w:eastAsia="맑은 고딕" w:cstheme="minorHAnsi" w:hint="eastAsia"/>
+        </w:rPr>
+        <w:t>- Appendix</w:t>
       </w:r>
     </w:p>
     <w:p>
@@ -2515,26 +2489,14 @@
             <w:rStyle w:val="aa"/>
             <w:rFonts w:eastAsia="맑은 고딕" w:cstheme="minorHAnsi"/>
           </w:rPr>
-          <w:t>https://www.met.ie/annual-climate-statement-for-2024?utm_source</w:t>
+          <w:t>https://www.met.ie/annual-climate-statement-for-2025</w:t>
         </w:r>
       </w:hyperlink>
       <w:r>
         <w:rPr>
           <w:rFonts w:eastAsia="맑은 고딕" w:cstheme="minorHAnsi" w:hint="eastAsia"/>
         </w:rPr>
-        <w:t xml:space="preserve"> (</w:t>
-      </w:r>
-      <w:r>
-        <w:rPr>
-          <w:rFonts w:eastAsia="맑은 고딕" w:cstheme="minorHAnsi" w:hint="eastAsia"/>
-        </w:rPr>
-        <w:t xml:space="preserve">2025, </w:t>
-      </w:r>
-      <w:r>
-        <w:rPr>
-          <w:rFonts w:eastAsia="맑은 고딕" w:cstheme="minorHAnsi" w:hint="eastAsia"/>
-        </w:rPr>
-        <w:t>2024 annual climate report)</w:t>
+        <w:t xml:space="preserve"> </w:t>
       </w:r>
     </w:p>
     <w:p>
@@ -2543,6 +2505,33 @@
           <w:rFonts w:eastAsia="맑은 고딕" w:cstheme="minorHAnsi"/>
         </w:rPr>
       </w:pPr>
+      <w:hyperlink r:id="rId17" w:history="1">
+        <w:r>
+          <w:rPr>
+            <w:rStyle w:val="aa"/>
+            <w:rFonts w:eastAsia="맑은 고딕" w:cstheme="minorHAnsi"/>
+          </w:rPr>
+          <w:t>https://www.met.ie/annual-climate-statement-for-2024</w:t>
+        </w:r>
+      </w:hyperlink>
+      <w:r>
+        <w:rPr>
+          <w:rFonts w:eastAsia="맑은 고딕" w:cstheme="minorHAnsi" w:hint="eastAsia"/>
+        </w:rPr>
+        <w:t xml:space="preserve"> (</w:t>
+      </w:r>
+      <w:r>
+        <w:rPr>
+          <w:rFonts w:eastAsia="맑은 고딕" w:cstheme="minorHAnsi" w:hint="eastAsia"/>
+        </w:rPr>
+        <w:t xml:space="preserve">2025, </w:t>
+      </w:r>
+      <w:r>
+        <w:rPr>
+          <w:rFonts w:eastAsia="맑은 고딕" w:cstheme="minorHAnsi" w:hint="eastAsia"/>
+        </w:rPr>
+        <w:t>2024 annual climate report)</w:t>
+      </w:r>
     </w:p>
     <w:p>
       <w:pPr>
@@ -2567,246 +2556,277 @@
     </w:p>
     <w:p>
       <w:pPr>
-        <w:pStyle w:val="1"/>
-      </w:pPr>
-      <w:r>
-        <w:rPr>
-          <w:rFonts w:hint="eastAsia"/>
-        </w:rPr>
-        <w:t>Aim and Objectives</w:t>
-      </w:r>
+        <w:rPr>
+          <w:rFonts w:eastAsia="맑은 고딕" w:cstheme="minorHAnsi"/>
+        </w:rPr>
+      </w:pPr>
     </w:p>
     <w:p>
-      <w:r>
-        <w:rPr>
-          <w:rFonts w:hint="eastAsia"/>
-        </w:rPr>
-        <w:t>To a</w:t>
-      </w:r>
-      <w:r>
-        <w:t xml:space="preserve">nalyze and </w:t>
-      </w:r>
-      <w:r>
-        <w:rPr>
-          <w:rFonts w:hint="eastAsia"/>
-        </w:rPr>
-        <w:t xml:space="preserve">to </w:t>
-      </w:r>
-      <w:r>
-        <w:t xml:space="preserve">estimate economic value and suitability of installing solar </w:t>
-      </w:r>
-      <w:r>
-        <w:rPr>
-          <w:rFonts w:hint="eastAsia"/>
-        </w:rPr>
-        <w:t>PV systems</w:t>
-      </w:r>
-      <w:r>
-        <w:t xml:space="preserve"> in Ireland, support potential user's decision making by developing a Web-Based Decision </w:t>
-      </w:r>
-      <w:r>
-        <w:lastRenderedPageBreak/>
-        <w:t>Support System (DSS) which provides necessary information and recommendation.</w:t>
-      </w:r>
+      <w:pPr>
+        <w:rPr>
+          <w:rFonts w:eastAsia="맑은 고딕" w:cstheme="minorHAnsi"/>
+        </w:rPr>
+      </w:pPr>
     </w:p>
     <w:p>
-      <w:r>
-        <w:rPr>
-          <w:rFonts w:hint="eastAsia"/>
-        </w:rPr>
-        <w:t>1.</w:t>
-      </w:r>
-      <w:r>
-        <w:t xml:space="preserve"> </w:t>
-      </w:r>
-      <w:r>
-        <w:rPr>
-          <w:rFonts w:hint="eastAsia"/>
-        </w:rPr>
-        <w:t>Construct p</w:t>
-      </w:r>
-      <w:r>
-        <w:t>roper datase</w:t>
-      </w:r>
-      <w:r>
-        <w:rPr>
-          <w:rFonts w:hint="eastAsia"/>
-        </w:rPr>
-        <w:t>t</w:t>
-      </w:r>
-      <w:r>
-        <w:t xml:space="preserve">. </w:t>
-      </w:r>
-      <w:r>
-        <w:rPr>
-          <w:rFonts w:hint="eastAsia"/>
-        </w:rPr>
-        <w:t>Collect r</w:t>
-      </w:r>
-      <w:r>
-        <w:t xml:space="preserve">elevant data </w:t>
-      </w:r>
-      <w:r>
-        <w:rPr>
-          <w:rFonts w:hint="eastAsia"/>
-        </w:rPr>
-        <w:t xml:space="preserve">and identify, </w:t>
-      </w:r>
-      <w:r>
-        <w:t>preprocess</w:t>
-      </w:r>
-      <w:r>
-        <w:rPr>
-          <w:rFonts w:hint="eastAsia"/>
-        </w:rPr>
-        <w:t xml:space="preserve">, </w:t>
-      </w:r>
-      <w:r>
-        <w:t>analyze</w:t>
-      </w:r>
-      <w:r>
-        <w:rPr>
-          <w:rFonts w:hint="eastAsia"/>
-        </w:rPr>
-        <w:t xml:space="preserve"> it. Ensure there is no ethical issue.</w:t>
-      </w:r>
-      <w:r>
-        <w:t xml:space="preserve"> </w:t>
-      </w:r>
+      <w:pPr>
+        <w:rPr>
+          <w:rFonts w:eastAsia="맑은 고딕" w:cstheme="minorHAnsi"/>
+        </w:rPr>
+      </w:pPr>
     </w:p>
     <w:p>
-      <w:r>
-        <w:rPr>
-          <w:rFonts w:hint="eastAsia"/>
-        </w:rPr>
-        <w:t xml:space="preserve">2. </w:t>
-      </w:r>
-      <w:r>
-        <w:rPr>
-          <w:rFonts w:hint="eastAsia"/>
-        </w:rPr>
-        <w:t>D</w:t>
-      </w:r>
-      <w:r>
-        <w:t>etermine the important features</w:t>
-      </w:r>
-      <w:r>
-        <w:rPr>
-          <w:rFonts w:hint="eastAsia"/>
-        </w:rPr>
-        <w:t xml:space="preserve"> b</w:t>
-      </w:r>
-      <w:r>
-        <w:t>y understanding relationships between variables and identifying key factors affecting profitability</w:t>
-      </w:r>
-      <w:r>
-        <w:rPr>
-          <w:rFonts w:hint="eastAsia"/>
-        </w:rPr>
-        <w:t>.</w:t>
-      </w:r>
+      <w:pPr>
+        <w:rPr>
+          <w:rFonts w:eastAsia="맑은 고딕" w:cstheme="minorHAnsi"/>
+        </w:rPr>
+      </w:pPr>
     </w:p>
     <w:p>
       <w:pPr>
+        <w:pStyle w:val="1"/>
+      </w:pPr>
+      <w:r>
+        <w:rPr>
+          <w:rFonts w:hint="eastAsia"/>
+        </w:rPr>
+        <w:lastRenderedPageBreak/>
+        <w:t>Aim and Objectives</w:t>
+      </w:r>
+    </w:p>
+    <w:p>
+      <w:r>
+        <w:rPr>
+          <w:rFonts w:hint="eastAsia"/>
+        </w:rPr>
+        <w:t>To a</w:t>
+      </w:r>
+      <w:r>
+        <w:t xml:space="preserve">nalyze and </w:t>
+      </w:r>
+      <w:r>
+        <w:rPr>
+          <w:rFonts w:hint="eastAsia"/>
+        </w:rPr>
+        <w:t xml:space="preserve">to </w:t>
+      </w:r>
+      <w:r>
+        <w:t xml:space="preserve">estimate economic value and suitability of installing solar </w:t>
+      </w:r>
+      <w:r>
+        <w:rPr>
+          <w:rFonts w:hint="eastAsia"/>
+        </w:rPr>
+        <w:t>PV systems</w:t>
+      </w:r>
+      <w:r>
+        <w:t xml:space="preserve"> in Ireland, support potential user's decision making by developing a Web-Based Decision Support System (DSS) which provides necessary information and recommendation.</w:t>
+      </w:r>
+    </w:p>
+    <w:p>
+      <w:r>
+        <w:rPr>
+          <w:rFonts w:hint="eastAsia"/>
+        </w:rPr>
+        <w:t>1.</w:t>
+      </w:r>
+      <w:r>
+        <w:t xml:space="preserve"> </w:t>
+      </w:r>
+      <w:r>
+        <w:rPr>
+          <w:rFonts w:hint="eastAsia"/>
+        </w:rPr>
+        <w:t>Construct p</w:t>
+      </w:r>
+      <w:r>
+        <w:t>roper datase</w:t>
+      </w:r>
+      <w:r>
+        <w:rPr>
+          <w:rFonts w:hint="eastAsia"/>
+        </w:rPr>
+        <w:t>t</w:t>
+      </w:r>
+      <w:r>
+        <w:t xml:space="preserve">. </w:t>
+      </w:r>
+      <w:r>
+        <w:rPr>
+          <w:rFonts w:hint="eastAsia"/>
+        </w:rPr>
+        <w:t>Collect r</w:t>
+      </w:r>
+      <w:r>
+        <w:t xml:space="preserve">elevant data </w:t>
+      </w:r>
+      <w:r>
+        <w:rPr>
+          <w:rFonts w:hint="eastAsia"/>
+        </w:rPr>
+        <w:t xml:space="preserve">and identify, </w:t>
+      </w:r>
+      <w:r>
+        <w:t>preprocess</w:t>
+      </w:r>
+      <w:r>
+        <w:rPr>
+          <w:rFonts w:hint="eastAsia"/>
+        </w:rPr>
+        <w:t xml:space="preserve">, </w:t>
+      </w:r>
+      <w:r>
+        <w:t>analyze</w:t>
+      </w:r>
+      <w:r>
+        <w:rPr>
+          <w:rFonts w:hint="eastAsia"/>
+        </w:rPr>
+        <w:t xml:space="preserve"> it. Ensure there is no ethical issue.</w:t>
+      </w:r>
+      <w:r>
+        <w:t xml:space="preserve"> </w:t>
+      </w:r>
+    </w:p>
+    <w:p>
+      <w:r>
+        <w:rPr>
+          <w:rFonts w:hint="eastAsia"/>
+        </w:rPr>
+        <w:t xml:space="preserve">2. </w:t>
+      </w:r>
+      <w:r>
+        <w:rPr>
+          <w:rFonts w:hint="eastAsia"/>
+        </w:rPr>
+        <w:t>D</w:t>
+      </w:r>
+      <w:r>
+        <w:t>etermine the important features</w:t>
+      </w:r>
+      <w:r>
+        <w:rPr>
+          <w:rFonts w:hint="eastAsia"/>
+        </w:rPr>
+        <w:t xml:space="preserve"> b</w:t>
+      </w:r>
+      <w:r>
+        <w:t>y understanding relationships between variables and identifying key factors affecting profitability</w:t>
+      </w:r>
+      <w:r>
+        <w:rPr>
+          <w:rFonts w:hint="eastAsia"/>
+        </w:rPr>
+        <w:t>.</w:t>
+      </w:r>
+    </w:p>
+    <w:p>
+      <w:pPr>
+        <w:rPr>
+          <w:rFonts w:eastAsia="맑은 고딕"/>
+        </w:rPr>
+      </w:pPr>
+      <w:r>
+        <w:rPr>
+          <w:rFonts w:hint="eastAsia"/>
+        </w:rPr>
+        <w:t xml:space="preserve">3. </w:t>
+      </w:r>
+      <w:r>
+        <w:rPr>
+          <w:rFonts w:eastAsia="맑은 고딕"/>
+        </w:rPr>
+        <w:t>Select and evaluate appropriate machine learning models using relevant metrics</w:t>
+      </w:r>
+      <w:r>
         <w:rPr>
           <w:rFonts w:eastAsia="맑은 고딕" w:hint="eastAsia"/>
         </w:rPr>
-      </w:pPr>
-      <w:r>
-        <w:rPr>
-          <w:rFonts w:hint="eastAsia"/>
-        </w:rPr>
-        <w:t xml:space="preserve">3. </w:t>
+        <w:t xml:space="preserve">. </w:t>
       </w:r>
       <w:r>
         <w:rPr>
           <w:rFonts w:eastAsia="맑은 고딕"/>
         </w:rPr>
-        <w:t>Select and evaluate appropriate machine learning models using relevant metrics</w:t>
+        <w:t xml:space="preserve">Use </w:t>
       </w:r>
       <w:r>
         <w:rPr>
           <w:rFonts w:eastAsia="맑은 고딕" w:hint="eastAsia"/>
         </w:rPr>
-        <w:t xml:space="preserve">. </w:t>
+        <w:t>Non-Linear</w:t>
       </w:r>
       <w:r>
         <w:rPr>
           <w:rFonts w:eastAsia="맑은 고딕"/>
         </w:rPr>
-        <w:t xml:space="preserve">Use </w:t>
+        <w:t xml:space="preserve"> Regression </w:t>
       </w:r>
       <w:r>
         <w:rPr>
           <w:rFonts w:eastAsia="맑은 고딕" w:hint="eastAsia"/>
         </w:rPr>
-        <w:t>Non-Linear</w:t>
+        <w:t>or Logistic Regression</w:t>
+      </w:r>
+      <w:r>
+        <w:rPr>
+          <w:rFonts w:eastAsia="맑은 고딕" w:hint="eastAsia"/>
+        </w:rPr>
+        <w:t xml:space="preserve"> </w:t>
       </w:r>
       <w:r>
         <w:rPr>
           <w:rFonts w:eastAsia="맑은 고딕"/>
         </w:rPr>
-        <w:t xml:space="preserve"> Regression </w:t>
+        <w:t>as the base model and compare it with Decision Tree or Random Forest.</w:t>
       </w:r>
       <w:r>
         <w:rPr>
           <w:rFonts w:eastAsia="맑은 고딕" w:hint="eastAsia"/>
         </w:rPr>
-        <w:t xml:space="preserve">or Clustering </w:t>
+        <w:t xml:space="preserve"> Evaluate it </w:t>
       </w:r>
       <w:r>
         <w:rPr>
           <w:rFonts w:eastAsia="맑은 고딕"/>
         </w:rPr>
-        <w:t>as the base model and compare it with Decision Tree or Random Forest.</w:t>
+        <w:t>with</w:t>
       </w:r>
       <w:r>
         <w:rPr>
           <w:rFonts w:eastAsia="맑은 고딕" w:hint="eastAsia"/>
         </w:rPr>
-        <w:t xml:space="preserve"> Evaluate it </w:t>
+        <w:t xml:space="preserve"> Accuracy,</w:t>
       </w:r>
       <w:r>
         <w:rPr>
           <w:rFonts w:eastAsia="맑은 고딕"/>
         </w:rPr>
-        <w:t>with</w:t>
+        <w:t xml:space="preserve"> F1-score</w:t>
       </w:r>
       <w:r>
         <w:rPr>
           <w:rFonts w:eastAsia="맑은 고딕" w:hint="eastAsia"/>
         </w:rPr>
-        <w:t xml:space="preserve"> </w:t>
+        <w:t>,</w:t>
+      </w:r>
+      <w:r>
+        <w:rPr>
+          <w:rFonts w:eastAsia="맑은 고딕"/>
+        </w:rPr>
+        <w:t xml:space="preserve"> Confusion Matrix</w:t>
       </w:r>
       <w:r>
         <w:rPr>
           <w:rFonts w:eastAsia="맑은 고딕" w:hint="eastAsia"/>
         </w:rPr>
-        <w:t>Accuracy,</w:t>
-      </w:r>
-      <w:r>
-        <w:rPr>
-          <w:rFonts w:eastAsia="맑은 고딕"/>
-        </w:rPr>
-        <w:t xml:space="preserve"> F1-score</w:t>
+        <w:t xml:space="preserve">, </w:t>
       </w:r>
       <w:r>
         <w:rPr>
           <w:rFonts w:eastAsia="맑은 고딕" w:hint="eastAsia"/>
         </w:rPr>
-        <w:t>,</w:t>
-      </w:r>
-      <w:r>
-        <w:rPr>
-          <w:rFonts w:eastAsia="맑은 고딕"/>
-        </w:rPr>
-        <w:t xml:space="preserve"> Confusion Matrix</w:t>
-      </w:r>
-      <w:r>
-        <w:rPr>
-          <w:rFonts w:eastAsia="맑은 고딕" w:hint="eastAsia"/>
-        </w:rPr>
-        <w:t>, MSE and MAE</w:t>
+        <w:t>etc.</w:t>
       </w:r>
     </w:p>
     <w:p>
@@ -2891,6 +2911,9 @@
     <w:p/>
     <w:p/>
     <w:p/>
+    <w:p/>
+    <w:p/>
+    <w:p/>
     <w:p>
       <w:pPr>
         <w:pStyle w:val="1"/>
@@ -2899,6 +2922,7 @@
         <w:rPr>
           <w:rFonts w:hint="eastAsia"/>
         </w:rPr>
+        <w:lastRenderedPageBreak/>
         <w:t>Scope</w:t>
       </w:r>
     </w:p>
@@ -3181,13 +3205,7 @@
         <w:rPr>
           <w:rFonts w:eastAsia="맑은 고딕"/>
         </w:rPr>
-        <w:t>Based on the calculation results, categories such as Economically promising, Conditional, and Low economic viability are created.</w:t>
-      </w:r>
-      <w:r>
-        <w:rPr>
-          <w:rFonts w:eastAsia="맑은 고딕"/>
-        </w:rPr>
-        <w:t xml:space="preserve"> </w:t>
+        <w:t xml:space="preserve">Based on the calculation results, categories such as Economically promising, Conditional, and Low economic viability are created. </w:t>
       </w:r>
       <w:r>
         <w:rPr>
@@ -3339,7 +3357,7 @@
                     </pic:cNvPicPr>
                   </pic:nvPicPr>
                   <pic:blipFill>
-                    <a:blip r:embed="rId17" cstate="print">
+                    <a:blip r:embed="rId18" cstate="print">
                       <a:extLst>
                         <a:ext uri="{28A0092B-C50C-407E-A947-70E740481C1C}">
                           <a14:useLocalDpi xmlns:a14="http://schemas.microsoft.com/office/drawing/2010/main" val="0"/>
@@ -3378,14 +3396,179 @@
         </w:rPr>
         <w:t>(</w:t>
       </w:r>
-      <w:r>
-        <w:t>https://www.mermaid.tools/?utm_source</w:t>
+      <w:hyperlink r:id="rId19" w:history="1">
+        <w:r>
+          <w:rPr>
+            <w:rStyle w:val="aa"/>
+          </w:rPr>
+          <w:t>https://www.mermaid.tools</w:t>
+        </w:r>
+      </w:hyperlink>
+      <w:r>
+        <w:rPr>
+          <w:rFonts w:hint="eastAsia"/>
+        </w:rPr>
+        <w:t xml:space="preserve"> </w:t>
       </w:r>
       <w:r>
         <w:rPr>
           <w:rFonts w:hint="eastAsia"/>
         </w:rPr>
         <w:t>)</w:t>
+      </w:r>
+    </w:p>
+    <w:p/>
+    <w:p>
+      <w:pPr>
+        <w:pStyle w:val="1"/>
+      </w:pPr>
+      <w:r>
+        <w:rPr>
+          <w:rFonts w:hint="eastAsia"/>
+        </w:rPr>
+        <w:t>Data Sources</w:t>
+      </w:r>
+    </w:p>
+    <w:p>
+      <w:r>
+        <w:rPr>
+          <w:b/>
+          <w:bCs/>
+        </w:rPr>
+        <w:t>SEAI National BER Research Tool</w:t>
+      </w:r>
+      <w:r>
+        <w:t>:</w:t>
+      </w:r>
+      <w:r>
+        <w:rPr>
+          <w:rFonts w:hint="eastAsia"/>
+        </w:rPr>
+        <w:t xml:space="preserve"> </w:t>
+      </w:r>
+      <w:r>
+        <w:rPr>
+          <w:rFonts w:hint="eastAsia"/>
+        </w:rPr>
+        <w:t xml:space="preserve">Main dataset which includes important data such as BER rating, County name, Date of assessment, year of construction, etc. </w:t>
+      </w:r>
+      <w:r>
+        <w:t>However,</w:t>
+      </w:r>
+      <w:r>
+        <w:rPr>
+          <w:rFonts w:hint="eastAsia"/>
+        </w:rPr>
+        <w:t xml:space="preserve"> it contains more than 1 million rows and over 100 columns. It would </w:t>
+      </w:r>
+      <w:r>
+        <w:t>make it</w:t>
+      </w:r>
+      <w:r>
+        <w:rPr>
+          <w:rFonts w:hint="eastAsia"/>
+        </w:rPr>
+        <w:t xml:space="preserve"> hard </w:t>
+      </w:r>
+      <w:r>
+        <w:t>to analyze</w:t>
+      </w:r>
+      <w:r>
+        <w:rPr>
+          <w:rFonts w:hint="eastAsia"/>
+        </w:rPr>
+        <w:t xml:space="preserve">, so I extracted most recent data from 2022- 2024 which </w:t>
+      </w:r>
+      <w:r>
+        <w:rPr>
+          <w:rFonts w:hint="eastAsia"/>
+        </w:rPr>
+        <w:t>contains</w:t>
+      </w:r>
+      <w:r>
+        <w:rPr>
+          <w:rFonts w:hint="eastAsia"/>
+        </w:rPr>
+        <w:t xml:space="preserve"> over 270,000 data.</w:t>
+      </w:r>
+    </w:p>
+    <w:p>
+      <w:r>
+        <w:rPr>
+          <w:b/>
+          <w:bCs/>
+        </w:rPr>
+        <w:lastRenderedPageBreak/>
+        <w:t>European Commission Joint Research Centre PVGIS</w:t>
+      </w:r>
+      <w:r>
+        <w:rPr>
+          <w:rFonts w:hint="eastAsia"/>
+          <w:b/>
+          <w:bCs/>
+        </w:rPr>
+        <w:t xml:space="preserve"> (In case)</w:t>
+      </w:r>
+      <w:r>
+        <w:rPr>
+          <w:b/>
+          <w:bCs/>
+        </w:rPr>
+        <w:t>:</w:t>
+      </w:r>
+      <w:r>
+        <w:rPr>
+          <w:rFonts w:hint="eastAsia"/>
+        </w:rPr>
+        <w:t xml:space="preserve"> </w:t>
+      </w:r>
+      <w:r>
+        <w:t>API-based solar PV generation estimates using location and system parameters</w:t>
+      </w:r>
+      <w:r>
+        <w:rPr>
+          <w:rFonts w:hint="eastAsia"/>
+        </w:rPr>
+        <w:t xml:space="preserve">. </w:t>
+      </w:r>
+      <w:r>
+        <w:t xml:space="preserve">The "Annual Solar Radiation" </w:t>
+      </w:r>
+      <w:r>
+        <w:rPr>
+          <w:rFonts w:hint="eastAsia"/>
+        </w:rPr>
+        <w:t>column data</w:t>
+      </w:r>
+      <w:r>
+        <w:t xml:space="preserve">, which I considered using in the main dataset, </w:t>
+      </w:r>
+      <w:r>
+        <w:rPr>
+          <w:rFonts w:hint="eastAsia"/>
+        </w:rPr>
+        <w:t>has too many missing values,</w:t>
+      </w:r>
+      <w:r>
+        <w:t xml:space="preserve"> so I plan to use </w:t>
+      </w:r>
+      <w:r>
+        <w:rPr>
+          <w:rFonts w:hint="eastAsia"/>
+        </w:rPr>
+        <w:t>this data</w:t>
+      </w:r>
+      <w:r>
+        <w:t xml:space="preserve"> if I feel that the data is needed during analysis. </w:t>
+      </w:r>
+      <w:r>
+        <w:rPr>
+          <w:rFonts w:hint="eastAsia"/>
+        </w:rPr>
+        <w:t>I w</w:t>
+      </w:r>
+      <w:r>
+        <w:t>ill verify the availability of the data before use</w:t>
       </w:r>
     </w:p>
     <w:p/>
@@ -3398,19 +3581,68 @@
         <w:rPr>
           <w:rFonts w:hint="eastAsia"/>
         </w:rPr>
-        <w:t>Data Sources</w:t>
+        <w:t>Expected Deliverables</w:t>
       </w:r>
     </w:p>
     <w:p>
       <w:r>
-        <w:rPr>
-          <w:b/>
-          <w:bCs/>
-        </w:rPr>
-        <w:t>SEAI National BER Research Tool</w:t>
-      </w:r>
-      <w:r>
-        <w:t>:</w:t>
+        <w:t xml:space="preserve">(1) </w:t>
+      </w:r>
+      <w:r>
+        <w:t xml:space="preserve">Preprocess and clean the </w:t>
+      </w:r>
+      <w:r>
+        <w:t xml:space="preserve">SEAI BER data and handle missing values using Python. (2) Identify patterns, summarize statistics, and visualize </w:t>
+      </w:r>
+      <w:r>
+        <w:rPr>
+          <w:rFonts w:hint="eastAsia"/>
+        </w:rPr>
+        <w:t xml:space="preserve">with </w:t>
+      </w:r>
+      <w:r>
+        <w:t xml:space="preserve">extracted columns such as regional differences, housing </w:t>
+      </w:r>
+      <w:r>
+        <w:rPr>
+          <w:rFonts w:hint="eastAsia"/>
+        </w:rPr>
+        <w:t>features</w:t>
+      </w:r>
+      <w:r>
+        <w:t>, and BER grades that may be related to solar power suitability. (3) Compare the fit of the results with actual observed results using appropriate predictive modeling and metrics</w:t>
+      </w:r>
+      <w:r>
+        <w:rPr>
+          <w:rFonts w:hint="eastAsia"/>
+        </w:rPr>
+        <w:t xml:space="preserve"> with confusion </w:t>
+      </w:r>
+      <w:proofErr w:type="spellStart"/>
+      <w:r>
+        <w:rPr>
+          <w:rFonts w:hint="eastAsia"/>
+        </w:rPr>
+        <w:t>metrix</w:t>
+      </w:r>
+      <w:proofErr w:type="spellEnd"/>
+      <w:r>
+        <w:t xml:space="preserve">. (4) </w:t>
+      </w:r>
+      <w:r>
+        <w:rPr>
+          <w:rFonts w:hint="eastAsia"/>
+        </w:rPr>
+        <w:t>Evaluate</w:t>
+      </w:r>
+      <w:r>
+        <w:rPr>
+          <w:rFonts w:hint="eastAsia"/>
+        </w:rPr>
+        <w:t xml:space="preserve"> results</w:t>
+      </w:r>
+      <w:r>
+        <w:t xml:space="preserve"> to determine what the actual economic outcomes are and what impact they have</w:t>
       </w:r>
       <w:r>
         <w:rPr>
@@ -3422,197 +3654,7 @@
         <w:rPr>
           <w:rFonts w:hint="eastAsia"/>
         </w:rPr>
-        <w:t xml:space="preserve">Main dataset which includes important data such as BER rating, County name, Date of assessment, year of construction, etc. </w:t>
-      </w:r>
-      <w:r>
-        <w:t>However,</w:t>
-      </w:r>
-      <w:r>
-        <w:rPr>
-          <w:rFonts w:hint="eastAsia"/>
-        </w:rPr>
-        <w:t xml:space="preserve"> it contains more than 1 million rows and over 100 columns. It would </w:t>
-      </w:r>
-      <w:r>
-        <w:t>make it</w:t>
-      </w:r>
-      <w:r>
-        <w:rPr>
-          <w:rFonts w:hint="eastAsia"/>
-        </w:rPr>
-        <w:t xml:space="preserve"> hard </w:t>
-      </w:r>
-      <w:r>
-        <w:t xml:space="preserve">to </w:t>
-      </w:r>
-      <w:r>
-        <w:lastRenderedPageBreak/>
-        <w:t>analyze</w:t>
-      </w:r>
-      <w:r>
-        <w:rPr>
-          <w:rFonts w:hint="eastAsia"/>
-        </w:rPr>
-        <w:t xml:space="preserve">, so I extracted most recent data from 2022- 2024 which </w:t>
-      </w:r>
-      <w:r>
-        <w:rPr>
-          <w:rFonts w:hint="eastAsia"/>
-        </w:rPr>
-        <w:t>contains</w:t>
-      </w:r>
-      <w:r>
-        <w:rPr>
-          <w:rFonts w:hint="eastAsia"/>
-        </w:rPr>
-        <w:t xml:space="preserve"> over 270,000 data.</w:t>
-      </w:r>
-    </w:p>
-    <w:p>
-      <w:r>
-        <w:rPr>
-          <w:b/>
-          <w:bCs/>
-        </w:rPr>
-        <w:t>European Commission Joint Research Centre PVGIS</w:t>
-      </w:r>
-      <w:r>
-        <w:rPr>
-          <w:rFonts w:hint="eastAsia"/>
-          <w:b/>
-          <w:bCs/>
-        </w:rPr>
-        <w:t xml:space="preserve"> (In case)</w:t>
-      </w:r>
-      <w:r>
-        <w:rPr>
-          <w:b/>
-          <w:bCs/>
-        </w:rPr>
-        <w:t>:</w:t>
-      </w:r>
-      <w:r>
-        <w:rPr>
-          <w:rFonts w:hint="eastAsia"/>
-        </w:rPr>
-        <w:t xml:space="preserve"> </w:t>
-      </w:r>
-      <w:r>
-        <w:t>API-based solar PV generation estimates using location and system parameters</w:t>
-      </w:r>
-      <w:r>
-        <w:rPr>
-          <w:rFonts w:hint="eastAsia"/>
-        </w:rPr>
-        <w:t xml:space="preserve">. </w:t>
-      </w:r>
-      <w:r>
-        <w:t xml:space="preserve">The "Annual Solar Radiation" </w:t>
-      </w:r>
-      <w:r>
-        <w:rPr>
-          <w:rFonts w:hint="eastAsia"/>
-        </w:rPr>
-        <w:t>column data</w:t>
-      </w:r>
-      <w:r>
-        <w:t xml:space="preserve">, which I considered using in the main dataset, </w:t>
-      </w:r>
-      <w:r>
-        <w:rPr>
-          <w:rFonts w:hint="eastAsia"/>
-        </w:rPr>
-        <w:t>has too many missing values,</w:t>
-      </w:r>
-      <w:r>
-        <w:t xml:space="preserve"> so I plan to use </w:t>
-      </w:r>
-      <w:r>
-        <w:rPr>
-          <w:rFonts w:hint="eastAsia"/>
-        </w:rPr>
-        <w:t>this data</w:t>
-      </w:r>
-      <w:r>
-        <w:t xml:space="preserve"> if I feel that the data is needed during analysis. </w:t>
-      </w:r>
-      <w:r>
-        <w:rPr>
-          <w:rFonts w:hint="eastAsia"/>
-        </w:rPr>
-        <w:t>I w</w:t>
-      </w:r>
-      <w:r>
-        <w:t>ill verify the availability of the data before use</w:t>
-      </w:r>
-    </w:p>
-    <w:p/>
-    <w:p/>
-    <w:p>
-      <w:pPr>
-        <w:pStyle w:val="1"/>
-      </w:pPr>
-      <w:r>
-        <w:rPr>
-          <w:rFonts w:hint="eastAsia"/>
-        </w:rPr>
-        <w:t>Expected Deliverables</w:t>
-      </w:r>
-    </w:p>
-    <w:p>
-      <w:r>
-        <w:t xml:space="preserve">(1) </w:t>
-      </w:r>
-      <w:r>
-        <w:t xml:space="preserve">Preprocess and clean the </w:t>
-      </w:r>
-      <w:r>
-        <w:t xml:space="preserve">SEAI BER data and handle missing values using Python. (2) Identify patterns, summarize statistics, and visualize </w:t>
-      </w:r>
-      <w:r>
-        <w:rPr>
-          <w:rFonts w:hint="eastAsia"/>
-        </w:rPr>
         <w:t xml:space="preserve">with </w:t>
-      </w:r>
-      <w:r>
-        <w:t xml:space="preserve">extracted columns such as regional differences, housing </w:t>
-      </w:r>
-      <w:r>
-        <w:rPr>
-          <w:rFonts w:hint="eastAsia"/>
-        </w:rPr>
-        <w:t>features</w:t>
-      </w:r>
-      <w:r>
-        <w:t xml:space="preserve">, and BER grades that may be related to solar power suitability. (3) Compare the fit of the results with actual observed results using appropriate predictive modeling and metrics. (4) </w:t>
-      </w:r>
-      <w:r>
-        <w:rPr>
-          <w:rFonts w:hint="eastAsia"/>
-        </w:rPr>
-        <w:t>Evaluate</w:t>
-      </w:r>
-      <w:r>
-        <w:rPr>
-          <w:rFonts w:hint="eastAsia"/>
-        </w:rPr>
-        <w:t xml:space="preserve"> results</w:t>
-      </w:r>
-      <w:r>
-        <w:t xml:space="preserve"> to determine what the actual economic outcomes are and what impact they have</w:t>
-      </w:r>
-      <w:r>
-        <w:rPr>
-          <w:rFonts w:hint="eastAsia"/>
-        </w:rPr>
-        <w:t xml:space="preserve"> </w:t>
-      </w:r>
-      <w:r>
-        <w:rPr>
-          <w:rFonts w:hint="eastAsia"/>
-        </w:rPr>
-        <w:t xml:space="preserve">with Confusion metrics </w:t>
       </w:r>
       <w:r>
         <w:t>(5)</w:t>
@@ -3671,11 +3713,6 @@
             <w:vAlign w:val="bottom"/>
           </w:tcPr>
           <w:p>
-            <w:pPr>
-              <w:rPr>
-                <w:rFonts w:hint="eastAsia"/>
-              </w:rPr>
-            </w:pPr>
             <w:r>
               <w:rPr>
                 <w:rFonts w:ascii="Aptos Narrow" w:hAnsi="Aptos Narrow"/>
@@ -4172,7 +4209,7 @@
                     </pic:cNvPicPr>
                   </pic:nvPicPr>
                   <pic:blipFill>
-                    <a:blip r:embed="rId18">
+                    <a:blip r:embed="rId20">
                       <a:extLst>
                         <a:ext uri="{28A0092B-C50C-407E-A947-70E740481C1C}">
                           <a14:useLocalDpi xmlns:a14="http://schemas.microsoft.com/office/drawing/2010/main" val="0"/>
@@ -4211,8 +4248,19 @@
         </w:rPr>
         <w:t>(</w:t>
       </w:r>
-      <w:r>
-        <w:t>https://www.onlinegantt.com/#/gantt</w:t>
+      <w:hyperlink r:id="rId21" w:anchor="/gantt" w:history="1">
+        <w:r>
+          <w:rPr>
+            <w:rStyle w:val="aa"/>
+          </w:rPr>
+          <w:t>https://www.onlinegantt.com/#/gantt</w:t>
+        </w:r>
+      </w:hyperlink>
+      <w:r>
+        <w:rPr>
+          <w:rFonts w:hint="eastAsia"/>
+        </w:rPr>
+        <w:t xml:space="preserve"> </w:t>
       </w:r>
       <w:r>
         <w:rPr>
@@ -4264,10 +4312,7 @@
         <w:t>A</w:t>
       </w:r>
       <w:r>
-        <w:t>ssess the effects of missing values, regional sampling differences, and outdated or incomplete records.</w:t>
-      </w:r>
-      <w:r>
-        <w:t xml:space="preserve"> </w:t>
+        <w:t xml:space="preserve">ssess the effects of missing values, regional sampling differences, and outdated or incomplete records. </w:t>
       </w:r>
       <w:r>
         <w:rPr>
@@ -4300,13 +4345,7 @@
         <w:rPr>
           <w:rFonts w:hint="eastAsia"/>
         </w:rPr>
-        <w:t xml:space="preserve"> </w:t>
-      </w:r>
-      <w:r>
-        <w:rPr>
-          <w:rFonts w:hint="eastAsia"/>
-        </w:rPr>
-        <w:t>Also, I</w:t>
+        <w:t xml:space="preserve"> Also, I</w:t>
       </w:r>
       <w:r>
         <w:t xml:space="preserve"> will inquire about availability before using the P</w:t>
@@ -4389,7 +4428,7 @@
           <w:rFonts w:eastAsia="맑은 고딕" w:cstheme="minorHAnsi"/>
         </w:rPr>
       </w:pPr>
-      <w:hyperlink r:id="rId19" w:history="1">
+      <w:hyperlink r:id="rId22" w:history="1">
         <w:r>
           <w:rPr>
             <w:rStyle w:val="aa"/>
@@ -4403,7 +4442,7 @@
             <w:rFonts w:eastAsia="맑은 고딕" w:cstheme="minorHAnsi"/>
           </w:rPr>
           <w:lastRenderedPageBreak/>
-          <w:t>2026.pdf?utm_source</w:t>
+          <w:t>2026.pdf</w:t>
         </w:r>
       </w:hyperlink>
       <w:r>
@@ -4440,7 +4479,7 @@
                     <pic:cNvPicPr/>
                   </pic:nvPicPr>
                   <pic:blipFill>
-                    <a:blip r:embed="rId20">
+                    <a:blip r:embed="rId23">
                       <a:extLst>
                         <a:ext uri="{28A0092B-C50C-407E-A947-70E740481C1C}">
                           <a14:useLocalDpi xmlns:a14="http://schemas.microsoft.com/office/drawing/2010/main" val="0"/>
@@ -4493,7 +4532,7 @@
                     <pic:cNvPicPr/>
                   </pic:nvPicPr>
                   <pic:blipFill>
-                    <a:blip r:embed="rId21"/>
+                    <a:blip r:embed="rId24"/>
                     <a:stretch>
                       <a:fillRect/>
                     </a:stretch>
@@ -4513,13 +4552,13 @@
           </wp:inline>
         </w:drawing>
       </w:r>
-      <w:hyperlink r:id="rId22" w:history="1">
+      <w:hyperlink r:id="rId25" w:history="1">
         <w:r>
           <w:rPr>
             <w:rStyle w:val="aa"/>
             <w:rFonts w:eastAsia="맑은 고딕" w:cstheme="minorHAnsi"/>
           </w:rPr>
-          <w:t>https://www.cso.ie/en/statistics/climate/sunshinebymeteorologicalweatherstation/?utm_source</w:t>
+          <w:t>https://www.cso.ie/en/statistics/climate/sunshinebymeteorologicalweatherstation</w:t>
         </w:r>
       </w:hyperlink>
     </w:p>
@@ -4550,7 +4589,7 @@
                     <pic:cNvPicPr/>
                   </pic:nvPicPr>
                   <pic:blipFill>
-                    <a:blip r:embed="rId23"/>
+                    <a:blip r:embed="rId26"/>
                     <a:stretch>
                       <a:fillRect/>
                     </a:stretch>
@@ -4570,13 +4609,13 @@
           </wp:inline>
         </w:drawing>
       </w:r>
-      <w:hyperlink r:id="rId24" w:history="1">
+      <w:hyperlink r:id="rId27" w:history="1">
         <w:r>
           <w:rPr>
             <w:rStyle w:val="aa"/>
             <w:rFonts w:eastAsia="맑은 고딕" w:cstheme="minorHAnsi"/>
           </w:rPr>
-          <w:t>https://www.met.ie/cms/assets/uploads/2023/07/Irelands-Climate-Averages-1991_2020.pdf?utm_source</w:t>
+          <w:t>https://www.met.ie/cms/assets/uploads/2023/07/Irelands-Climate-Averages-1991_2020.pdf</w:t>
         </w:r>
       </w:hyperlink>
       <w:r>
@@ -4630,7 +4669,7 @@
                     <pic:cNvPicPr/>
                   </pic:nvPicPr>
                   <pic:blipFill>
-                    <a:blip r:embed="rId25"/>
+                    <a:blip r:embed="rId28"/>
                     <a:stretch>
                       <a:fillRect/>
                     </a:stretch>
@@ -4670,7 +4709,7 @@
                     <pic:cNvPicPr/>
                   </pic:nvPicPr>
                   <pic:blipFill>
-                    <a:blip r:embed="rId26"/>
+                    <a:blip r:embed="rId29"/>
                     <a:stretch>
                       <a:fillRect/>
                     </a:stretch>
@@ -4694,7 +4733,6 @@
     <w:p>
       <w:pPr>
         <w:rPr>
-          <w:rFonts w:hint="eastAsia"/>
           <w:color w:val="FF0000"/>
         </w:rPr>
       </w:pPr>
@@ -4718,7 +4756,7 @@
                     <pic:cNvPicPr/>
                   </pic:nvPicPr>
                   <pic:blipFill>
-                    <a:blip r:embed="rId27"/>
+                    <a:blip r:embed="rId30"/>
                     <a:stretch>
                       <a:fillRect/>
                     </a:stretch>
@@ -4765,7 +4803,7 @@
                     <pic:cNvPicPr/>
                   </pic:nvPicPr>
                   <pic:blipFill>
-                    <a:blip r:embed="rId28"/>
+                    <a:blip r:embed="rId31"/>
                     <a:stretch>
                       <a:fillRect/>
                     </a:stretch>
@@ -4812,7 +4850,7 @@
                     <pic:cNvPicPr/>
                   </pic:nvPicPr>
                   <pic:blipFill>
-                    <a:blip r:embed="rId29"/>
+                    <a:blip r:embed="rId32"/>
                     <a:stretch>
                       <a:fillRect/>
                     </a:stretch>
@@ -4859,7 +4897,7 @@
                     <pic:cNvPicPr/>
                   </pic:nvPicPr>
                   <pic:blipFill>
-                    <a:blip r:embed="rId30"/>
+                    <a:blip r:embed="rId33"/>
                     <a:stretch>
                       <a:fillRect/>
                     </a:stretch>
@@ -4905,7 +4943,7 @@
                     <pic:cNvPicPr/>
                   </pic:nvPicPr>
                   <pic:blipFill>
-                    <a:blip r:embed="rId31"/>
+                    <a:blip r:embed="rId34"/>
                     <a:stretch>
                       <a:fillRect/>
                     </a:stretch>
@@ -4952,7 +4990,7 @@
                     <pic:cNvPicPr/>
                   </pic:nvPicPr>
                   <pic:blipFill>
-                    <a:blip r:embed="rId32"/>
+                    <a:blip r:embed="rId35"/>
                     <a:stretch>
                       <a:fillRect/>
                     </a:stretch>
@@ -4998,7 +5036,7 @@
                     <pic:cNvPicPr/>
                   </pic:nvPicPr>
                   <pic:blipFill>
-                    <a:blip r:embed="rId33"/>
+                    <a:blip r:embed="rId36"/>
                     <a:stretch>
                       <a:fillRect/>
                     </a:stretch>
@@ -5028,7 +5066,7 @@
       </w:r>
     </w:p>
     <w:p>
-      <w:hyperlink r:id="rId34" w:history="1">
+      <w:hyperlink r:id="rId37" w:history="1">
         <w:r>
           <w:rPr>
             <w:rStyle w:val="aa"/>
@@ -5038,7 +5076,7 @@
       </w:hyperlink>
     </w:p>
     <w:p>
-      <w:hyperlink r:id="rId35" w:history="1">
+      <w:hyperlink r:id="rId38" w:history="1">
         <w:r>
           <w:rPr>
             <w:rStyle w:val="aa"/>
@@ -5048,17 +5086,17 @@
       </w:hyperlink>
     </w:p>
     <w:p>
-      <w:hyperlink r:id="rId36" w:history="1">
+      <w:hyperlink r:id="rId39" w:history="1">
         <w:r>
           <w:rPr>
             <w:rStyle w:val="aa"/>
           </w:rPr>
-          <w:t>https://ndber.seai.ie/BERResearchTool/ber/search.aspx?utm_source</w:t>
+          <w:t>https://ndber.seai.ie/BERResearchTool/ber/search.aspx</w:t>
         </w:r>
       </w:hyperlink>
     </w:p>
     <w:p>
-      <w:hyperlink r:id="rId37" w:history="1">
+      <w:hyperlink r:id="rId40" w:history="1">
         <w:r>
           <w:rPr>
             <w:rStyle w:val="aa"/>
@@ -5080,13 +5118,7 @@
         <w:t>Commission Joint Research Centre PVGIS</w:t>
       </w:r>
     </w:p>
-    <w:p>
-      <w:pPr>
-        <w:rPr>
-          <w:rFonts w:hint="eastAsia"/>
-        </w:rPr>
-      </w:pPr>
-    </w:p>
+    <w:p/>
     <w:sectPr>
       <w:pgSz w:w="11906" w:h="16838"/>
       <w:pgMar w:top="1701" w:right="1440" w:bottom="1440" w:left="1440" w:header="851" w:footer="992" w:gutter="0"/>
@@ -6954,6 +6986,7 @@
   <w:style w:type="character" w:default="1" w:styleId="a0">
     <w:name w:val="Default Paragraph Font"/>
     <w:uiPriority w:val="1"/>
+    <w:semiHidden/>
     <w:unhideWhenUsed/>
   </w:style>
   <w:style w:type="table" w:default="1" w:styleId="a1">

</xml_diff>